<commit_message>
Modified and Deleted File
</commit_message>
<xml_diff>
--- a/Git commands.docx
+++ b/Git commands.docx
@@ -376,10 +376,12 @@
         <w:t xml:space="preserve">git config --global </w:t>
       </w:r>
       <w:proofErr w:type="spellStart"/>
+      <w:proofErr w:type="gramStart"/>
       <w:r>
         <w:t>user.email</w:t>
       </w:r>
       <w:proofErr w:type="spellEnd"/>
+      <w:proofErr w:type="gramEnd"/>
       <w:r>
         <w:t xml:space="preserve"> </w:t>
       </w:r>
@@ -594,8 +596,13 @@
               <w:spacing w:line="278" w:lineRule="auto"/>
             </w:pPr>
             <w:r>
-              <w:t>git add .</w:t>
-            </w:r>
+              <w:t xml:space="preserve">git </w:t>
+            </w:r>
+            <w:proofErr w:type="gramStart"/>
+            <w:r>
+              <w:t>add .</w:t>
+            </w:r>
+            <w:proofErr w:type="gramEnd"/>
           </w:p>
         </w:tc>
         <w:tc>
@@ -2056,7 +2063,15 @@
               <w:spacing w:line="278" w:lineRule="auto"/>
             </w:pPr>
             <w:r>
-              <w:t>git stash apply</w:t>
+              <w:t xml:space="preserve">git </w:t>
+            </w:r>
+            <w:proofErr w:type="gramStart"/>
+            <w:r>
+              <w:t>stash</w:t>
+            </w:r>
+            <w:proofErr w:type="gramEnd"/>
+            <w:r>
+              <w:t xml:space="preserve"> apply</w:t>
             </w:r>
           </w:p>
         </w:tc>
@@ -2091,7 +2106,23 @@
               <w:spacing w:line="278" w:lineRule="auto"/>
             </w:pPr>
             <w:r>
-              <w:t>git stash drop stash@{0}</w:t>
+              <w:t xml:space="preserve">git </w:t>
+            </w:r>
+            <w:proofErr w:type="gramStart"/>
+            <w:r>
+              <w:t>stash</w:t>
+            </w:r>
+            <w:proofErr w:type="gramEnd"/>
+            <w:r>
+              <w:t xml:space="preserve"> drop stash</w:t>
+            </w:r>
+            <w:proofErr w:type="gramStart"/>
+            <w:r>
+              <w:t>@{</w:t>
+            </w:r>
+            <w:proofErr w:type="gramEnd"/>
+            <w:r>
+              <w:t>0}</w:t>
             </w:r>
           </w:p>
         </w:tc>
@@ -2424,8 +2455,13 @@
               <w:spacing w:line="278" w:lineRule="auto"/>
               <w:jc w:val="center"/>
             </w:pPr>
-            <w:r>
-              <w:t>git revert &lt;commit-id&gt;</w:t>
+            <w:proofErr w:type="gramStart"/>
+            <w:r>
+              <w:t>git</w:t>
+            </w:r>
+            <w:proofErr w:type="gramEnd"/>
+            <w:r>
+              <w:t xml:space="preserve"> revert &lt;commit-id&gt;</w:t>
             </w:r>
           </w:p>
         </w:tc>
@@ -2582,7 +2618,15 @@
               <w:jc w:val="center"/>
             </w:pPr>
             <w:r>
-              <w:t>Removes commit from history</w:t>
+              <w:t xml:space="preserve">Removes </w:t>
+            </w:r>
+            <w:proofErr w:type="gramStart"/>
+            <w:r>
+              <w:t>commit</w:t>
+            </w:r>
+            <w:proofErr w:type="gramEnd"/>
+            <w:r>
+              <w:t xml:space="preserve"> from history</w:t>
             </w:r>
           </w:p>
         </w:tc>
@@ -2646,8 +2690,13 @@
               <w:spacing w:line="278" w:lineRule="auto"/>
               <w:jc w:val="center"/>
             </w:pPr>
-            <w:r>
-              <w:t>Creates new commit</w:t>
+            <w:proofErr w:type="gramStart"/>
+            <w:r>
+              <w:t>Creates</w:t>
+            </w:r>
+            <w:proofErr w:type="gramEnd"/>
+            <w:r>
+              <w:t xml:space="preserve"> new commit</w:t>
             </w:r>
           </w:p>
         </w:tc>
@@ -2984,8 +3033,13 @@
               <w:spacing w:line="278" w:lineRule="auto"/>
               <w:jc w:val="center"/>
             </w:pPr>
-            <w:r>
-              <w:t>git rebase -</w:t>
+            <w:proofErr w:type="gramStart"/>
+            <w:r>
+              <w:t>git</w:t>
+            </w:r>
+            <w:proofErr w:type="gramEnd"/>
+            <w:r>
+              <w:t xml:space="preserve"> rebase -</w:t>
             </w:r>
             <w:proofErr w:type="spellStart"/>
             <w:r>
@@ -3226,7 +3280,15 @@
         <w:spacing w:after="0"/>
       </w:pPr>
       <w:r>
-        <w:t>Creates merge commit</w:t>
+        <w:t xml:space="preserve">Creates </w:t>
+      </w:r>
+      <w:proofErr w:type="gramStart"/>
+      <w:r>
+        <w:t>merge</w:t>
+      </w:r>
+      <w:proofErr w:type="gramEnd"/>
+      <w:r>
+        <w:t xml:space="preserve"> commit</w:t>
       </w:r>
     </w:p>
     <w:p>
@@ -3447,8 +3509,13 @@
               <w:spacing w:line="278" w:lineRule="auto"/>
               <w:jc w:val="center"/>
             </w:pPr>
-            <w:r>
-              <w:t>git cherry-pick &lt;commit-id&gt;</w:t>
+            <w:proofErr w:type="gramStart"/>
+            <w:r>
+              <w:t>git</w:t>
+            </w:r>
+            <w:proofErr w:type="gramEnd"/>
+            <w:r>
+              <w:t xml:space="preserve"> cherry-pick &lt;commit-id&gt;</w:t>
             </w:r>
           </w:p>
         </w:tc>
@@ -3484,8 +3551,21 @@
               <w:spacing w:line="278" w:lineRule="auto"/>
               <w:jc w:val="center"/>
             </w:pPr>
-            <w:r>
-              <w:t>git cherry-pick A^..B</w:t>
+            <w:proofErr w:type="gramStart"/>
+            <w:r>
+              <w:t>git</w:t>
+            </w:r>
+            <w:proofErr w:type="gramEnd"/>
+            <w:r>
+              <w:t xml:space="preserve"> cherry-pick A</w:t>
+            </w:r>
+            <w:proofErr w:type="gramStart"/>
+            <w:r>
+              <w:t>^..</w:t>
+            </w:r>
+            <w:proofErr w:type="gramEnd"/>
+            <w:r>
+              <w:t>B</w:t>
             </w:r>
           </w:p>
         </w:tc>
@@ -4400,6 +4480,7 @@
               <w:t xml:space="preserve">git config --global </w:t>
             </w:r>
             <w:proofErr w:type="spellStart"/>
+            <w:proofErr w:type="gramStart"/>
             <w:r>
               <w:rPr>
                 <w:b/>
@@ -4408,6 +4489,7 @@
               <w:t>alias.lg</w:t>
             </w:r>
             <w:proofErr w:type="spellEnd"/>
+            <w:proofErr w:type="gramEnd"/>
             <w:r>
               <w:rPr>
                 <w:b/>
@@ -4582,6 +4664,7 @@
           <w:szCs w:val="36"/>
         </w:rPr>
       </w:pPr>
+      <w:proofErr w:type="gramStart"/>
       <w:r>
         <w:rPr>
           <w:b/>
@@ -4602,6 +4685,7 @@
         <w:t>gitignore</w:t>
       </w:r>
       <w:proofErr w:type="spellEnd"/>
+      <w:proofErr w:type="gramEnd"/>
       <w:r>
         <w:rPr>
           <w:b/>
@@ -4612,9 +4696,472 @@
         <w:t xml:space="preserve"> (Control What Git Should NOT Track)</w:t>
       </w:r>
     </w:p>
+    <w:tbl>
+      <w:tblPr>
+        <w:tblStyle w:val="TableGridLight"/>
+        <w:tblW w:w="0" w:type="auto"/>
+        <w:jc w:val="center"/>
+        <w:tblLook w:val="04A0" w:firstRow="1" w:lastRow="0" w:firstColumn="1" w:lastColumn="0" w:noHBand="0" w:noVBand="1"/>
+      </w:tblPr>
+      <w:tblGrid>
+        <w:gridCol w:w="2262"/>
+        <w:gridCol w:w="2568"/>
+      </w:tblGrid>
+      <w:tr>
+        <w:trPr>
+          <w:jc w:val="center"/>
+        </w:trPr>
+        <w:tc>
+          <w:tcPr>
+            <w:tcW w:w="0" w:type="auto"/>
+            <w:hideMark/>
+          </w:tcPr>
+          <w:p>
+            <w:pPr>
+              <w:spacing w:line="278" w:lineRule="auto"/>
+              <w:rPr>
+                <w:b/>
+                <w:bCs/>
+              </w:rPr>
+            </w:pPr>
+            <w:r>
+              <w:rPr>
+                <w:b/>
+                <w:bCs/>
+              </w:rPr>
+              <w:t>Command</w:t>
+            </w:r>
+          </w:p>
+        </w:tc>
+        <w:tc>
+          <w:tcPr>
+            <w:tcW w:w="0" w:type="auto"/>
+            <w:hideMark/>
+          </w:tcPr>
+          <w:p>
+            <w:pPr>
+              <w:spacing w:line="278" w:lineRule="auto"/>
+              <w:rPr>
+                <w:b/>
+                <w:bCs/>
+              </w:rPr>
+            </w:pPr>
+            <w:r>
+              <w:rPr>
+                <w:b/>
+                <w:bCs/>
+              </w:rPr>
+              <w:t>Purpose</w:t>
+            </w:r>
+          </w:p>
+        </w:tc>
+      </w:tr>
+      <w:tr>
+        <w:trPr>
+          <w:jc w:val="center"/>
+        </w:trPr>
+        <w:tc>
+          <w:tcPr>
+            <w:tcW w:w="0" w:type="auto"/>
+            <w:hideMark/>
+          </w:tcPr>
+          <w:p>
+            <w:pPr>
+              <w:spacing w:line="278" w:lineRule="auto"/>
+              <w:rPr>
+                <w:b/>
+                <w:bCs/>
+              </w:rPr>
+            </w:pPr>
+            <w:proofErr w:type="gramStart"/>
+            <w:r>
+              <w:rPr>
+                <w:b/>
+                <w:bCs/>
+              </w:rPr>
+              <w:t>.</w:t>
+            </w:r>
+            <w:proofErr w:type="spellStart"/>
+            <w:r>
+              <w:rPr>
+                <w:b/>
+                <w:bCs/>
+              </w:rPr>
+              <w:t>gitignore</w:t>
+            </w:r>
+            <w:proofErr w:type="spellEnd"/>
+            <w:proofErr w:type="gramEnd"/>
+          </w:p>
+        </w:tc>
+        <w:tc>
+          <w:tcPr>
+            <w:tcW w:w="0" w:type="auto"/>
+            <w:hideMark/>
+          </w:tcPr>
+          <w:p>
+            <w:pPr>
+              <w:spacing w:line="278" w:lineRule="auto"/>
+            </w:pPr>
+            <w:r>
+              <w:t>Define ignored files</w:t>
+            </w:r>
+          </w:p>
+        </w:tc>
+      </w:tr>
+      <w:tr>
+        <w:trPr>
+          <w:jc w:val="center"/>
+        </w:trPr>
+        <w:tc>
+          <w:tcPr>
+            <w:tcW w:w="0" w:type="auto"/>
+            <w:hideMark/>
+          </w:tcPr>
+          <w:p>
+            <w:pPr>
+              <w:spacing w:line="278" w:lineRule="auto"/>
+              <w:rPr>
+                <w:b/>
+                <w:bCs/>
+              </w:rPr>
+            </w:pPr>
+            <w:r>
+              <w:rPr>
+                <w:b/>
+                <w:bCs/>
+              </w:rPr>
+              <w:t>git rm --cached file</w:t>
+            </w:r>
+          </w:p>
+        </w:tc>
+        <w:tc>
+          <w:tcPr>
+            <w:tcW w:w="0" w:type="auto"/>
+            <w:hideMark/>
+          </w:tcPr>
+          <w:p>
+            <w:pPr>
+              <w:spacing w:line="278" w:lineRule="auto"/>
+            </w:pPr>
+            <w:r>
+              <w:t>Stop tracking file</w:t>
+            </w:r>
+          </w:p>
+        </w:tc>
+      </w:tr>
+      <w:tr>
+        <w:trPr>
+          <w:jc w:val="center"/>
+        </w:trPr>
+        <w:tc>
+          <w:tcPr>
+            <w:tcW w:w="0" w:type="auto"/>
+            <w:hideMark/>
+          </w:tcPr>
+          <w:p>
+            <w:pPr>
+              <w:spacing w:line="278" w:lineRule="auto"/>
+              <w:rPr>
+                <w:b/>
+                <w:bCs/>
+              </w:rPr>
+            </w:pPr>
+            <w:r>
+              <w:rPr>
+                <w:b/>
+                <w:bCs/>
+              </w:rPr>
+              <w:t>git status</w:t>
+            </w:r>
+          </w:p>
+        </w:tc>
+        <w:tc>
+          <w:tcPr>
+            <w:tcW w:w="0" w:type="auto"/>
+            <w:hideMark/>
+          </w:tcPr>
+          <w:p>
+            <w:pPr>
+              <w:spacing w:line="278" w:lineRule="auto"/>
+            </w:pPr>
+            <w:r>
+              <w:t>Verify ignored behavior</w:t>
+            </w:r>
+          </w:p>
+        </w:tc>
+      </w:tr>
+    </w:tbl>
     <w:p>
       <w:pPr>
         <w:spacing w:after="0"/>
+        <w:rPr>
+          <w:b/>
+          <w:bCs/>
+        </w:rPr>
+      </w:pPr>
+    </w:p>
+    <w:tbl>
+      <w:tblPr>
+        <w:tblStyle w:val="TableGridLight"/>
+        <w:tblW w:w="0" w:type="auto"/>
+        <w:jc w:val="center"/>
+        <w:tblLook w:val="04A0" w:firstRow="1" w:lastRow="0" w:firstColumn="1" w:lastColumn="0" w:noHBand="0" w:noVBand="1"/>
+      </w:tblPr>
+      <w:tblGrid>
+        <w:gridCol w:w="1929"/>
+        <w:gridCol w:w="2586"/>
+      </w:tblGrid>
+      <w:tr>
+        <w:trPr>
+          <w:jc w:val="center"/>
+        </w:trPr>
+        <w:tc>
+          <w:tcPr>
+            <w:tcW w:w="0" w:type="auto"/>
+            <w:hideMark/>
+          </w:tcPr>
+          <w:p>
+            <w:pPr>
+              <w:spacing w:line="278" w:lineRule="auto"/>
+              <w:jc w:val="center"/>
+              <w:rPr>
+                <w:b/>
+                <w:bCs/>
+              </w:rPr>
+            </w:pPr>
+            <w:r>
+              <w:rPr>
+                <w:b/>
+                <w:bCs/>
+              </w:rPr>
+              <w:t>Pattern</w:t>
+            </w:r>
+          </w:p>
+        </w:tc>
+        <w:tc>
+          <w:tcPr>
+            <w:tcW w:w="0" w:type="auto"/>
+            <w:hideMark/>
+          </w:tcPr>
+          <w:p>
+            <w:pPr>
+              <w:spacing w:line="278" w:lineRule="auto"/>
+              <w:jc w:val="center"/>
+              <w:rPr>
+                <w:b/>
+                <w:bCs/>
+              </w:rPr>
+            </w:pPr>
+            <w:r>
+              <w:rPr>
+                <w:b/>
+                <w:bCs/>
+              </w:rPr>
+              <w:t>Meaning</w:t>
+            </w:r>
+          </w:p>
+        </w:tc>
+      </w:tr>
+      <w:tr>
+        <w:trPr>
+          <w:jc w:val="center"/>
+        </w:trPr>
+        <w:tc>
+          <w:tcPr>
+            <w:tcW w:w="0" w:type="auto"/>
+            <w:hideMark/>
+          </w:tcPr>
+          <w:p>
+            <w:pPr>
+              <w:spacing w:line="278" w:lineRule="auto"/>
+              <w:jc w:val="center"/>
+              <w:rPr>
+                <w:b/>
+                <w:bCs/>
+              </w:rPr>
+            </w:pPr>
+            <w:r>
+              <w:rPr>
+                <w:b/>
+                <w:bCs/>
+              </w:rPr>
+              <w:t>*.log</w:t>
+            </w:r>
+          </w:p>
+        </w:tc>
+        <w:tc>
+          <w:tcPr>
+            <w:tcW w:w="0" w:type="auto"/>
+            <w:hideMark/>
+          </w:tcPr>
+          <w:p>
+            <w:pPr>
+              <w:spacing w:line="278" w:lineRule="auto"/>
+              <w:jc w:val="center"/>
+            </w:pPr>
+            <w:r>
+              <w:t>Ignore all log files</w:t>
+            </w:r>
+          </w:p>
+        </w:tc>
+      </w:tr>
+      <w:tr>
+        <w:trPr>
+          <w:jc w:val="center"/>
+        </w:trPr>
+        <w:tc>
+          <w:tcPr>
+            <w:tcW w:w="0" w:type="auto"/>
+            <w:hideMark/>
+          </w:tcPr>
+          <w:p>
+            <w:pPr>
+              <w:spacing w:line="278" w:lineRule="auto"/>
+              <w:jc w:val="center"/>
+              <w:rPr>
+                <w:b/>
+                <w:bCs/>
+              </w:rPr>
+            </w:pPr>
+            <w:proofErr w:type="spellStart"/>
+            <w:r>
+              <w:rPr>
+                <w:b/>
+                <w:bCs/>
+              </w:rPr>
+              <w:t>node_modules</w:t>
+            </w:r>
+            <w:proofErr w:type="spellEnd"/>
+            <w:r>
+              <w:rPr>
+                <w:b/>
+                <w:bCs/>
+              </w:rPr>
+              <w:t>/</w:t>
+            </w:r>
+          </w:p>
+        </w:tc>
+        <w:tc>
+          <w:tcPr>
+            <w:tcW w:w="0" w:type="auto"/>
+            <w:hideMark/>
+          </w:tcPr>
+          <w:p>
+            <w:pPr>
+              <w:spacing w:line="278" w:lineRule="auto"/>
+              <w:jc w:val="center"/>
+            </w:pPr>
+            <w:r>
+              <w:t>Ignore folder</w:t>
+            </w:r>
+          </w:p>
+        </w:tc>
+      </w:tr>
+      <w:tr>
+        <w:trPr>
+          <w:jc w:val="center"/>
+        </w:trPr>
+        <w:tc>
+          <w:tcPr>
+            <w:tcW w:w="0" w:type="auto"/>
+            <w:hideMark/>
+          </w:tcPr>
+          <w:p>
+            <w:pPr>
+              <w:spacing w:line="278" w:lineRule="auto"/>
+              <w:jc w:val="center"/>
+              <w:rPr>
+                <w:b/>
+                <w:bCs/>
+              </w:rPr>
+            </w:pPr>
+            <w:proofErr w:type="gramStart"/>
+            <w:r>
+              <w:rPr>
+                <w:b/>
+                <w:bCs/>
+              </w:rPr>
+              <w:t>.env</w:t>
+            </w:r>
+            <w:proofErr w:type="gramEnd"/>
+          </w:p>
+        </w:tc>
+        <w:tc>
+          <w:tcPr>
+            <w:tcW w:w="0" w:type="auto"/>
+            <w:hideMark/>
+          </w:tcPr>
+          <w:p>
+            <w:pPr>
+              <w:spacing w:line="278" w:lineRule="auto"/>
+              <w:jc w:val="center"/>
+            </w:pPr>
+            <w:r>
+              <w:t>Ignore environment file</w:t>
+            </w:r>
+          </w:p>
+        </w:tc>
+      </w:tr>
+      <w:tr>
+        <w:trPr>
+          <w:jc w:val="center"/>
+        </w:trPr>
+        <w:tc>
+          <w:tcPr>
+            <w:tcW w:w="0" w:type="auto"/>
+            <w:hideMark/>
+          </w:tcPr>
+          <w:p>
+            <w:pPr>
+              <w:spacing w:line="278" w:lineRule="auto"/>
+              <w:jc w:val="center"/>
+              <w:rPr>
+                <w:b/>
+                <w:bCs/>
+              </w:rPr>
+            </w:pPr>
+            <w:r>
+              <w:rPr>
+                <w:b/>
+                <w:bCs/>
+              </w:rPr>
+              <w:t>*.</w:t>
+            </w:r>
+            <w:proofErr w:type="spellStart"/>
+            <w:r>
+              <w:rPr>
+                <w:b/>
+                <w:bCs/>
+              </w:rPr>
+              <w:t>tmp</w:t>
+            </w:r>
+            <w:proofErr w:type="spellEnd"/>
+          </w:p>
+        </w:tc>
+        <w:tc>
+          <w:tcPr>
+            <w:tcW w:w="0" w:type="auto"/>
+            <w:hideMark/>
+          </w:tcPr>
+          <w:p>
+            <w:pPr>
+              <w:spacing w:line="278" w:lineRule="auto"/>
+              <w:jc w:val="center"/>
+            </w:pPr>
+            <w:r>
+              <w:t>Ignore temp files</w:t>
+            </w:r>
+          </w:p>
+        </w:tc>
+      </w:tr>
+    </w:tbl>
+    <w:p>
+      <w:pPr>
+        <w:pBdr>
+          <w:bottom w:val="single" w:sz="6" w:space="1" w:color="auto"/>
+        </w:pBdr>
+        <w:spacing w:after="0"/>
+        <w:jc w:val="center"/>
         <w:rPr>
           <w:b/>
           <w:bCs/>
@@ -4634,12 +5181,22 @@
     <w:p>
       <w:pPr>
         <w:spacing w:after="0"/>
-        <w:jc w:val="center"/>
-        <w:rPr>
-          <w:b/>
-          <w:bCs/>
-        </w:rPr>
-      </w:pPr>
+        <w:rPr>
+          <w:b/>
+          <w:bCs/>
+          <w:sz w:val="36"/>
+          <w:szCs w:val="36"/>
+        </w:rPr>
+      </w:pPr>
+      <w:r>
+        <w:rPr>
+          <w:b/>
+          <w:bCs/>
+          <w:sz w:val="36"/>
+          <w:szCs w:val="36"/>
+        </w:rPr>
+        <w:t>Day: 15</w:t>
+      </w:r>
     </w:p>
     <w:p>
       <w:pPr>

</xml_diff>

<commit_message>
Add notes.md for issues practice
</commit_message>
<xml_diff>
--- a/Git commands.docx
+++ b/Git commands.docx
@@ -375,12 +375,10 @@
       <w:r>
         <w:t xml:space="preserve">git config --global </w:t>
       </w:r>
-      <w:proofErr w:type="spellStart"/>
       <w:proofErr w:type="gramStart"/>
       <w:r>
         <w:t>user.email</w:t>
       </w:r>
-      <w:proofErr w:type="spellEnd"/>
       <w:proofErr w:type="gramEnd"/>
       <w:r>
         <w:t xml:space="preserve"> </w:t>
@@ -874,13 +872,8 @@
               <w:spacing w:line="278" w:lineRule="auto"/>
             </w:pPr>
             <w:r>
-              <w:t>git log --</w:t>
-            </w:r>
-            <w:proofErr w:type="spellStart"/>
-            <w:r>
-              <w:t>oneline</w:t>
-            </w:r>
-            <w:proofErr w:type="spellEnd"/>
+              <w:t>git log --oneline</w:t>
+            </w:r>
           </w:p>
         </w:tc>
         <w:tc>
@@ -2392,13 +2385,8 @@
               <w:cnfStyle w:val="000000000000" w:firstRow="0" w:lastRow="0" w:firstColumn="0" w:lastColumn="0" w:oddVBand="0" w:evenVBand="0" w:oddHBand="0" w:evenHBand="0" w:firstRowFirstColumn="0" w:firstRowLastColumn="0" w:lastRowFirstColumn="0" w:lastRowLastColumn="0"/>
             </w:pPr>
             <w:r>
-              <w:t xml:space="preserve">Undo last commit, keep changes but </w:t>
-            </w:r>
-            <w:proofErr w:type="spellStart"/>
-            <w:r>
-              <w:t>unstaged</w:t>
-            </w:r>
-            <w:proofErr w:type="spellEnd"/>
+              <w:t>Undo last commit, keep changes but unstaged</w:t>
+            </w:r>
           </w:p>
         </w:tc>
       </w:tr>
@@ -2499,13 +2487,8 @@
               <w:jc w:val="center"/>
             </w:pPr>
             <w:r>
-              <w:t>git log --</w:t>
-            </w:r>
-            <w:proofErr w:type="spellStart"/>
-            <w:r>
-              <w:t>oneline</w:t>
-            </w:r>
-            <w:proofErr w:type="spellEnd"/>
+              <w:t>git log --oneline</w:t>
+            </w:r>
           </w:p>
         </w:tc>
         <w:tc>
@@ -3039,21 +3022,8 @@
             </w:r>
             <w:proofErr w:type="gramEnd"/>
             <w:r>
-              <w:t xml:space="preserve"> rebase -</w:t>
-            </w:r>
-            <w:proofErr w:type="spellStart"/>
-            <w:r>
-              <w:t>i</w:t>
-            </w:r>
-            <w:proofErr w:type="spellEnd"/>
-            <w:r>
-              <w:t xml:space="preserve"> </w:t>
-            </w:r>
-            <w:proofErr w:type="spellStart"/>
-            <w:r>
-              <w:t>HEAD~n</w:t>
-            </w:r>
-            <w:proofErr w:type="spellEnd"/>
+              <w:t xml:space="preserve"> rebase -i HEAD~n</w:t>
+            </w:r>
           </w:p>
         </w:tc>
         <w:tc>
@@ -3164,13 +3134,8 @@
               <w:jc w:val="center"/>
             </w:pPr>
             <w:r>
-              <w:t>git log --</w:t>
-            </w:r>
-            <w:proofErr w:type="spellStart"/>
-            <w:r>
-              <w:t>oneline</w:t>
-            </w:r>
-            <w:proofErr w:type="spellEnd"/>
+              <w:t>git log --oneline</w:t>
+            </w:r>
           </w:p>
         </w:tc>
         <w:tc>
@@ -3603,13 +3568,8 @@
               <w:jc w:val="center"/>
             </w:pPr>
             <w:r>
-              <w:t>git log --</w:t>
-            </w:r>
-            <w:proofErr w:type="spellStart"/>
-            <w:r>
-              <w:t>oneline</w:t>
-            </w:r>
-            <w:proofErr w:type="spellEnd"/>
+              <w:t>git log --oneline</w:t>
+            </w:r>
           </w:p>
         </w:tc>
         <w:tc>
@@ -3871,13 +3831,8 @@
               <w:jc w:val="center"/>
             </w:pPr>
             <w:r>
-              <w:t xml:space="preserve">git show </w:t>
-            </w:r>
-            <w:proofErr w:type="spellStart"/>
-            <w:r>
-              <w:t>tagname</w:t>
-            </w:r>
-            <w:proofErr w:type="spellEnd"/>
+              <w:t>git show tagname</w:t>
+            </w:r>
           </w:p>
         </w:tc>
         <w:tc>
@@ -3914,13 +3869,8 @@
               <w:jc w:val="center"/>
             </w:pPr>
             <w:r>
-              <w:t xml:space="preserve">git push origin </w:t>
-            </w:r>
-            <w:proofErr w:type="spellStart"/>
-            <w:r>
-              <w:t>tagname</w:t>
-            </w:r>
-            <w:proofErr w:type="spellEnd"/>
+              <w:t>git push origin tagname</w:t>
+            </w:r>
           </w:p>
         </w:tc>
         <w:tc>
@@ -3994,13 +3944,8 @@
               <w:jc w:val="center"/>
             </w:pPr>
             <w:r>
-              <w:t xml:space="preserve">git tag -d </w:t>
-            </w:r>
-            <w:proofErr w:type="spellStart"/>
-            <w:r>
-              <w:t>tagname</w:t>
-            </w:r>
-            <w:proofErr w:type="spellEnd"/>
+              <w:t>git tag -d tagname</w:t>
+            </w:r>
           </w:p>
         </w:tc>
         <w:tc>
@@ -4081,27 +4026,7 @@
           <w:sz w:val="36"/>
           <w:szCs w:val="36"/>
         </w:rPr>
-        <w:t xml:space="preserve">git </w:t>
-      </w:r>
-      <w:proofErr w:type="spellStart"/>
-      <w:r>
-        <w:rPr>
-          <w:b/>
-          <w:bCs/>
-          <w:sz w:val="36"/>
-          <w:szCs w:val="36"/>
-        </w:rPr>
-        <w:t>reflog</w:t>
-      </w:r>
-      <w:proofErr w:type="spellEnd"/>
-      <w:r>
-        <w:rPr>
-          <w:b/>
-          <w:bCs/>
-          <w:sz w:val="36"/>
-          <w:szCs w:val="36"/>
-        </w:rPr>
-        <w:t xml:space="preserve"> (Recover Lost Commits)</w:t>
+        <w:t>git reflog (Recover Lost Commits)</w:t>
       </w:r>
     </w:p>
     <w:tbl>
@@ -4170,13 +4095,8 @@
               <w:jc w:val="center"/>
             </w:pPr>
             <w:r>
-              <w:t xml:space="preserve">git </w:t>
-            </w:r>
-            <w:proofErr w:type="spellStart"/>
-            <w:r>
-              <w:t>reflog</w:t>
-            </w:r>
-            <w:proofErr w:type="spellEnd"/>
+              <w:t>git reflog</w:t>
+            </w:r>
           </w:p>
         </w:tc>
         <w:tc>
@@ -4479,7 +4399,6 @@
               </w:rPr>
               <w:t xml:space="preserve">git config --global </w:t>
             </w:r>
-            <w:proofErr w:type="spellStart"/>
             <w:proofErr w:type="gramStart"/>
             <w:r>
               <w:rPr>
@@ -4488,30 +4407,13 @@
               </w:rPr>
               <w:t>alias.lg</w:t>
             </w:r>
-            <w:proofErr w:type="spellEnd"/>
             <w:proofErr w:type="gramEnd"/>
             <w:r>
               <w:rPr>
                 <w:b/>
                 <w:bCs/>
               </w:rPr>
-              <w:t xml:space="preserve"> "log --</w:t>
-            </w:r>
-            <w:proofErr w:type="spellStart"/>
-            <w:r>
-              <w:rPr>
-                <w:b/>
-                <w:bCs/>
-              </w:rPr>
-              <w:t>oneline</w:t>
-            </w:r>
-            <w:proofErr w:type="spellEnd"/>
-            <w:r>
-              <w:rPr>
-                <w:b/>
-                <w:bCs/>
-              </w:rPr>
-              <w:t>"</w:t>
+              <w:t xml:space="preserve"> "log --oneline"</w:t>
             </w:r>
           </w:p>
         </w:tc>
@@ -4672,19 +4574,8 @@
           <w:sz w:val="36"/>
           <w:szCs w:val="36"/>
         </w:rPr>
-        <w:t>.</w:t>
-      </w:r>
-      <w:proofErr w:type="spellStart"/>
-      <w:r>
-        <w:rPr>
-          <w:b/>
-          <w:bCs/>
-          <w:sz w:val="36"/>
-          <w:szCs w:val="36"/>
-        </w:rPr>
-        <w:t>gitignore</w:t>
-      </w:r>
-      <w:proofErr w:type="spellEnd"/>
+        <w:t>.gitignore</w:t>
+      </w:r>
       <w:proofErr w:type="gramEnd"/>
       <w:r>
         <w:rPr>
@@ -4779,17 +4670,8 @@
                 <w:b/>
                 <w:bCs/>
               </w:rPr>
-              <w:t>.</w:t>
-            </w:r>
-            <w:proofErr w:type="spellStart"/>
-            <w:r>
-              <w:rPr>
-                <w:b/>
-                <w:bCs/>
-              </w:rPr>
-              <w:t>gitignore</w:t>
-            </w:r>
-            <w:proofErr w:type="spellEnd"/>
+              <w:t>.gitignore</w:t>
+            </w:r>
             <w:proofErr w:type="gramEnd"/>
           </w:p>
         </w:tc>
@@ -5023,21 +4905,12 @@
                 <w:bCs/>
               </w:rPr>
             </w:pPr>
-            <w:proofErr w:type="spellStart"/>
             <w:r>
               <w:rPr>
                 <w:b/>
                 <w:bCs/>
               </w:rPr>
-              <w:t>node_modules</w:t>
-            </w:r>
-            <w:proofErr w:type="spellEnd"/>
-            <w:r>
-              <w:rPr>
-                <w:b/>
-                <w:bCs/>
-              </w:rPr>
-              <w:t>/</w:t>
+              <w:t>node_modules/</w:t>
             </w:r>
           </w:p>
         </w:tc>
@@ -5125,17 +4998,8 @@
                 <w:b/>
                 <w:bCs/>
               </w:rPr>
-              <w:t>*.</w:t>
-            </w:r>
-            <w:proofErr w:type="spellStart"/>
-            <w:r>
-              <w:rPr>
-                <w:b/>
-                <w:bCs/>
-              </w:rPr>
-              <w:t>tmp</w:t>
-            </w:r>
-            <w:proofErr w:type="spellEnd"/>
+              <w:t>*.tmp</w:t>
+            </w:r>
           </w:p>
         </w:tc>
         <w:tc>
@@ -5497,6 +5361,429 @@
           <w:szCs w:val="36"/>
         </w:rPr>
       </w:pPr>
+      <w:r>
+        <w:rPr>
+          <w:b/>
+          <w:bCs/>
+          <w:sz w:val="36"/>
+          <w:szCs w:val="36"/>
+        </w:rPr>
+        <w:t>Forking (Working with External Repositories)</w:t>
+      </w:r>
+    </w:p>
+    <w:p>
+      <w:pPr>
+        <w:spacing w:after="0"/>
+        <w:rPr>
+          <w:b/>
+          <w:bCs/>
+        </w:rPr>
+      </w:pPr>
+    </w:p>
+    <w:p>
+      <w:pPr>
+        <w:spacing w:after="0"/>
+        <w:rPr>
+          <w:b/>
+          <w:bCs/>
+        </w:rPr>
+      </w:pPr>
+      <w:r>
+        <w:rPr>
+          <w:b/>
+          <w:bCs/>
+        </w:rPr>
+        <w:t>A fork is:</w:t>
+      </w:r>
+    </w:p>
+    <w:p>
+      <w:pPr>
+        <w:spacing w:after="0"/>
+      </w:pPr>
+      <w:r>
+        <w:t>Your personal copy of someone else’s repository on GitHub.</w:t>
+      </w:r>
+    </w:p>
+    <w:p>
+      <w:pPr>
+        <w:spacing w:after="0"/>
+        <w:rPr>
+          <w:b/>
+          <w:bCs/>
+        </w:rPr>
+      </w:pPr>
+    </w:p>
+    <w:p>
+      <w:pPr>
+        <w:spacing w:after="0"/>
+        <w:rPr>
+          <w:b/>
+          <w:bCs/>
+        </w:rPr>
+      </w:pPr>
+      <w:r>
+        <w:rPr>
+          <w:b/>
+          <w:bCs/>
+        </w:rPr>
+        <w:t>Key idea:</w:t>
+      </w:r>
+    </w:p>
+    <w:p>
+      <w:pPr>
+        <w:spacing w:after="0"/>
+        <w:rPr>
+          <w:b/>
+          <w:bCs/>
+        </w:rPr>
+      </w:pPr>
+      <w:r>
+        <w:t>Original repo</w:t>
+      </w:r>
+      <w:r>
+        <w:rPr>
+          <w:b/>
+          <w:bCs/>
+        </w:rPr>
+        <w:t xml:space="preserve"> = upstream</w:t>
+      </w:r>
+    </w:p>
+    <w:p>
+      <w:pPr>
+        <w:spacing w:after="0"/>
+        <w:rPr>
+          <w:b/>
+          <w:bCs/>
+        </w:rPr>
+      </w:pPr>
+      <w:r>
+        <w:t>Your copy</w:t>
+      </w:r>
+      <w:r>
+        <w:rPr>
+          <w:b/>
+          <w:bCs/>
+        </w:rPr>
+        <w:t xml:space="preserve"> = fork</w:t>
+      </w:r>
+    </w:p>
+    <w:p>
+      <w:pPr>
+        <w:spacing w:after="0"/>
+        <w:rPr>
+          <w:b/>
+          <w:bCs/>
+        </w:rPr>
+      </w:pPr>
+    </w:p>
+    <w:p>
+      <w:pPr>
+        <w:spacing w:after="0"/>
+        <w:rPr>
+          <w:b/>
+          <w:bCs/>
+        </w:rPr>
+      </w:pPr>
+      <w:r>
+        <w:rPr>
+          <w:b/>
+          <w:bCs/>
+        </w:rPr>
+        <w:t>Fork Workflow</w:t>
+      </w:r>
+      <w:r>
+        <w:rPr>
+          <w:b/>
+          <w:bCs/>
+        </w:rPr>
+        <w:t>:</w:t>
+      </w:r>
+    </w:p>
+    <w:p>
+      <w:pPr>
+        <w:spacing w:after="0"/>
+      </w:pPr>
+      <w:r>
+        <w:t>Original Repo → Fork → Clone → Create Branch → Make Changes → Push → PR to Original Repo</w:t>
+      </w:r>
+    </w:p>
+    <w:p>
+      <w:pPr>
+        <w:spacing w:after="0"/>
+      </w:pPr>
+    </w:p>
+    <w:tbl>
+      <w:tblPr>
+        <w:tblStyle w:val="PlainTable1"/>
+        <w:tblW w:w="0" w:type="auto"/>
+        <w:jc w:val="center"/>
+        <w:tblLook w:val="04A0" w:firstRow="1" w:lastRow="0" w:firstColumn="1" w:lastColumn="0" w:noHBand="0" w:noVBand="1"/>
+      </w:tblPr>
+      <w:tblGrid>
+        <w:gridCol w:w="2963"/>
+        <w:gridCol w:w="2146"/>
+      </w:tblGrid>
+      <w:tr>
+        <w:trPr>
+          <w:cnfStyle w:val="100000000000" w:firstRow="1" w:lastRow="0" w:firstColumn="0" w:lastColumn="0" w:oddVBand="0" w:evenVBand="0" w:oddHBand="0" w:evenHBand="0" w:firstRowFirstColumn="0" w:firstRowLastColumn="0" w:lastRowFirstColumn="0" w:lastRowLastColumn="0"/>
+          <w:jc w:val="center"/>
+        </w:trPr>
+        <w:tc>
+          <w:tcPr>
+            <w:cnfStyle w:val="001000000000" w:firstRow="0" w:lastRow="0" w:firstColumn="1" w:lastColumn="0" w:oddVBand="0" w:evenVBand="0" w:oddHBand="0" w:evenHBand="0" w:firstRowFirstColumn="0" w:firstRowLastColumn="0" w:lastRowFirstColumn="0" w:lastRowLastColumn="0"/>
+            <w:tcW w:w="0" w:type="auto"/>
+            <w:hideMark/>
+          </w:tcPr>
+          <w:p>
+            <w:pPr>
+              <w:spacing w:line="278" w:lineRule="auto"/>
+            </w:pPr>
+            <w:r>
+              <w:t>Command</w:t>
+            </w:r>
+          </w:p>
+        </w:tc>
+        <w:tc>
+          <w:tcPr>
+            <w:tcW w:w="0" w:type="auto"/>
+            <w:hideMark/>
+          </w:tcPr>
+          <w:p>
+            <w:pPr>
+              <w:spacing w:line="278" w:lineRule="auto"/>
+              <w:cnfStyle w:val="100000000000" w:firstRow="1" w:lastRow="0" w:firstColumn="0" w:lastColumn="0" w:oddVBand="0" w:evenVBand="0" w:oddHBand="0" w:evenHBand="0" w:firstRowFirstColumn="0" w:firstRowLastColumn="0" w:lastRowFirstColumn="0" w:lastRowLastColumn="0"/>
+            </w:pPr>
+            <w:r>
+              <w:t>Purpose</w:t>
+            </w:r>
+          </w:p>
+        </w:tc>
+      </w:tr>
+      <w:tr>
+        <w:trPr>
+          <w:cnfStyle w:val="000000100000" w:firstRow="0" w:lastRow="0" w:firstColumn="0" w:lastColumn="0" w:oddVBand="0" w:evenVBand="0" w:oddHBand="1" w:evenHBand="0" w:firstRowFirstColumn="0" w:firstRowLastColumn="0" w:lastRowFirstColumn="0" w:lastRowLastColumn="0"/>
+          <w:jc w:val="center"/>
+        </w:trPr>
+        <w:tc>
+          <w:tcPr>
+            <w:cnfStyle w:val="001000000000" w:firstRow="0" w:lastRow="0" w:firstColumn="1" w:lastColumn="0" w:oddVBand="0" w:evenVBand="0" w:oddHBand="0" w:evenHBand="0" w:firstRowFirstColumn="0" w:firstRowLastColumn="0" w:lastRowFirstColumn="0" w:lastRowLastColumn="0"/>
+            <w:tcW w:w="0" w:type="auto"/>
+            <w:hideMark/>
+          </w:tcPr>
+          <w:p>
+            <w:pPr>
+              <w:spacing w:line="278" w:lineRule="auto"/>
+            </w:pPr>
+            <w:r>
+              <w:t>git clone</w:t>
+            </w:r>
+          </w:p>
+        </w:tc>
+        <w:tc>
+          <w:tcPr>
+            <w:tcW w:w="0" w:type="auto"/>
+            <w:hideMark/>
+          </w:tcPr>
+          <w:p>
+            <w:pPr>
+              <w:spacing w:line="278" w:lineRule="auto"/>
+              <w:cnfStyle w:val="000000100000" w:firstRow="0" w:lastRow="0" w:firstColumn="0" w:lastColumn="0" w:oddVBand="0" w:evenVBand="0" w:oddHBand="1" w:evenHBand="0" w:firstRowFirstColumn="0" w:firstRowLastColumn="0" w:lastRowFirstColumn="0" w:lastRowLastColumn="0"/>
+            </w:pPr>
+            <w:r>
+              <w:t>Copy repo locally</w:t>
+            </w:r>
+          </w:p>
+        </w:tc>
+      </w:tr>
+      <w:tr>
+        <w:trPr>
+          <w:jc w:val="center"/>
+        </w:trPr>
+        <w:tc>
+          <w:tcPr>
+            <w:cnfStyle w:val="001000000000" w:firstRow="0" w:lastRow="0" w:firstColumn="1" w:lastColumn="0" w:oddVBand="0" w:evenVBand="0" w:oddHBand="0" w:evenHBand="0" w:firstRowFirstColumn="0" w:firstRowLastColumn="0" w:lastRowFirstColumn="0" w:lastRowLastColumn="0"/>
+            <w:tcW w:w="0" w:type="auto"/>
+            <w:hideMark/>
+          </w:tcPr>
+          <w:p>
+            <w:pPr>
+              <w:spacing w:line="278" w:lineRule="auto"/>
+            </w:pPr>
+            <w:r>
+              <w:t>git remote add upstream</w:t>
+            </w:r>
+          </w:p>
+        </w:tc>
+        <w:tc>
+          <w:tcPr>
+            <w:tcW w:w="0" w:type="auto"/>
+            <w:hideMark/>
+          </w:tcPr>
+          <w:p>
+            <w:pPr>
+              <w:spacing w:line="278" w:lineRule="auto"/>
+              <w:cnfStyle w:val="000000000000" w:firstRow="0" w:lastRow="0" w:firstColumn="0" w:lastColumn="0" w:oddVBand="0" w:evenVBand="0" w:oddHBand="0" w:evenHBand="0" w:firstRowFirstColumn="0" w:firstRowLastColumn="0" w:lastRowFirstColumn="0" w:lastRowLastColumn="0"/>
+            </w:pPr>
+            <w:r>
+              <w:t>Link original repo</w:t>
+            </w:r>
+          </w:p>
+        </w:tc>
+      </w:tr>
+      <w:tr>
+        <w:trPr>
+          <w:cnfStyle w:val="000000100000" w:firstRow="0" w:lastRow="0" w:firstColumn="0" w:lastColumn="0" w:oddVBand="0" w:evenVBand="0" w:oddHBand="1" w:evenHBand="0" w:firstRowFirstColumn="0" w:firstRowLastColumn="0" w:lastRowFirstColumn="0" w:lastRowLastColumn="0"/>
+          <w:jc w:val="center"/>
+        </w:trPr>
+        <w:tc>
+          <w:tcPr>
+            <w:cnfStyle w:val="001000000000" w:firstRow="0" w:lastRow="0" w:firstColumn="1" w:lastColumn="0" w:oddVBand="0" w:evenVBand="0" w:oddHBand="0" w:evenHBand="0" w:firstRowFirstColumn="0" w:firstRowLastColumn="0" w:lastRowFirstColumn="0" w:lastRowLastColumn="0"/>
+            <w:tcW w:w="0" w:type="auto"/>
+            <w:hideMark/>
+          </w:tcPr>
+          <w:p>
+            <w:pPr>
+              <w:spacing w:line="278" w:lineRule="auto"/>
+            </w:pPr>
+            <w:r>
+              <w:t xml:space="preserve">git </w:t>
+            </w:r>
+            <w:proofErr w:type="gramStart"/>
+            <w:r>
+              <w:t>remote -v</w:t>
+            </w:r>
+            <w:proofErr w:type="gramEnd"/>
+          </w:p>
+        </w:tc>
+        <w:tc>
+          <w:tcPr>
+            <w:tcW w:w="0" w:type="auto"/>
+            <w:hideMark/>
+          </w:tcPr>
+          <w:p>
+            <w:pPr>
+              <w:spacing w:line="278" w:lineRule="auto"/>
+              <w:cnfStyle w:val="000000100000" w:firstRow="0" w:lastRow="0" w:firstColumn="0" w:lastColumn="0" w:oddVBand="0" w:evenVBand="0" w:oddHBand="1" w:evenHBand="0" w:firstRowFirstColumn="0" w:firstRowLastColumn="0" w:lastRowFirstColumn="0" w:lastRowLastColumn="0"/>
+            </w:pPr>
+            <w:r>
+              <w:t>View remotes</w:t>
+            </w:r>
+          </w:p>
+        </w:tc>
+      </w:tr>
+      <w:tr>
+        <w:trPr>
+          <w:jc w:val="center"/>
+        </w:trPr>
+        <w:tc>
+          <w:tcPr>
+            <w:cnfStyle w:val="001000000000" w:firstRow="0" w:lastRow="0" w:firstColumn="1" w:lastColumn="0" w:oddVBand="0" w:evenVBand="0" w:oddHBand="0" w:evenHBand="0" w:firstRowFirstColumn="0" w:firstRowLastColumn="0" w:lastRowFirstColumn="0" w:lastRowLastColumn="0"/>
+            <w:tcW w:w="0" w:type="auto"/>
+            <w:hideMark/>
+          </w:tcPr>
+          <w:p>
+            <w:pPr>
+              <w:spacing w:line="278" w:lineRule="auto"/>
+            </w:pPr>
+            <w:r>
+              <w:t>git fetch upstream</w:t>
+            </w:r>
+          </w:p>
+        </w:tc>
+        <w:tc>
+          <w:tcPr>
+            <w:tcW w:w="0" w:type="auto"/>
+            <w:hideMark/>
+          </w:tcPr>
+          <w:p>
+            <w:pPr>
+              <w:spacing w:line="278" w:lineRule="auto"/>
+              <w:cnfStyle w:val="000000000000" w:firstRow="0" w:lastRow="0" w:firstColumn="0" w:lastColumn="0" w:oddVBand="0" w:evenVBand="0" w:oddHBand="0" w:evenHBand="0" w:firstRowFirstColumn="0" w:firstRowLastColumn="0" w:lastRowFirstColumn="0" w:lastRowLastColumn="0"/>
+            </w:pPr>
+            <w:r>
+              <w:t>Get latest changes</w:t>
+            </w:r>
+          </w:p>
+        </w:tc>
+      </w:tr>
+      <w:tr>
+        <w:trPr>
+          <w:cnfStyle w:val="000000100000" w:firstRow="0" w:lastRow="0" w:firstColumn="0" w:lastColumn="0" w:oddVBand="0" w:evenVBand="0" w:oddHBand="1" w:evenHBand="0" w:firstRowFirstColumn="0" w:firstRowLastColumn="0" w:lastRowFirstColumn="0" w:lastRowLastColumn="0"/>
+          <w:jc w:val="center"/>
+        </w:trPr>
+        <w:tc>
+          <w:tcPr>
+            <w:cnfStyle w:val="001000000000" w:firstRow="0" w:lastRow="0" w:firstColumn="1" w:lastColumn="0" w:oddVBand="0" w:evenVBand="0" w:oddHBand="0" w:evenHBand="0" w:firstRowFirstColumn="0" w:firstRowLastColumn="0" w:lastRowFirstColumn="0" w:lastRowLastColumn="0"/>
+            <w:tcW w:w="0" w:type="auto"/>
+            <w:hideMark/>
+          </w:tcPr>
+          <w:p>
+            <w:pPr>
+              <w:spacing w:line="278" w:lineRule="auto"/>
+            </w:pPr>
+            <w:r>
+              <w:t>git merge upstream/main</w:t>
+            </w:r>
+          </w:p>
+        </w:tc>
+        <w:tc>
+          <w:tcPr>
+            <w:tcW w:w="0" w:type="auto"/>
+            <w:hideMark/>
+          </w:tcPr>
+          <w:p>
+            <w:pPr>
+              <w:spacing w:line="278" w:lineRule="auto"/>
+              <w:cnfStyle w:val="000000100000" w:firstRow="0" w:lastRow="0" w:firstColumn="0" w:lastColumn="0" w:oddVBand="0" w:evenVBand="0" w:oddHBand="1" w:evenHBand="0" w:firstRowFirstColumn="0" w:firstRowLastColumn="0" w:lastRowFirstColumn="0" w:lastRowLastColumn="0"/>
+            </w:pPr>
+            <w:r>
+              <w:t>Sync with original</w:t>
+            </w:r>
+          </w:p>
+        </w:tc>
+      </w:tr>
+    </w:tbl>
+    <w:p>
+      <w:pPr>
+        <w:pBdr>
+          <w:bottom w:val="single" w:sz="6" w:space="1" w:color="auto"/>
+        </w:pBdr>
+        <w:spacing w:after="0"/>
+      </w:pPr>
+    </w:p>
+    <w:p>
+      <w:pPr>
+        <w:spacing w:after="0"/>
+      </w:pPr>
+    </w:p>
+    <w:p>
+      <w:pPr>
+        <w:spacing w:after="0"/>
+        <w:rPr>
+          <w:b/>
+          <w:bCs/>
+          <w:sz w:val="36"/>
+          <w:szCs w:val="36"/>
+        </w:rPr>
+      </w:pPr>
+      <w:r>
+        <w:rPr>
+          <w:b/>
+          <w:bCs/>
+          <w:sz w:val="36"/>
+          <w:szCs w:val="36"/>
+        </w:rPr>
+        <w:t>Day: 1</w:t>
+      </w:r>
+      <w:r>
+        <w:rPr>
+          <w:b/>
+          <w:bCs/>
+          <w:sz w:val="36"/>
+          <w:szCs w:val="36"/>
+        </w:rPr>
+        <w:t>7</w:t>
+      </w:r>
     </w:p>
     <w:p>
       <w:pPr>

</xml_diff>

<commit_message>
Modified Day: 29 in docx
</commit_message>
<xml_diff>
--- a/Git commands.docx
+++ b/Git commands.docx
@@ -376,10 +376,12 @@
         <w:t xml:space="preserve">git config --global </w:t>
       </w:r>
       <w:proofErr w:type="spellStart"/>
+      <w:proofErr w:type="gramStart"/>
       <w:r>
         <w:t>user.email</w:t>
       </w:r>
       <w:proofErr w:type="spellEnd"/>
+      <w:proofErr w:type="gramEnd"/>
       <w:r>
         <w:t xml:space="preserve"> </w:t>
       </w:r>
@@ -594,8 +596,13 @@
               <w:spacing w:line="278" w:lineRule="auto"/>
             </w:pPr>
             <w:r>
-              <w:t>git add .</w:t>
-            </w:r>
+              <w:t xml:space="preserve">git </w:t>
+            </w:r>
+            <w:proofErr w:type="gramStart"/>
+            <w:r>
+              <w:t>add .</w:t>
+            </w:r>
+            <w:proofErr w:type="gramEnd"/>
           </w:p>
         </w:tc>
         <w:tc>
@@ -2056,7 +2063,15 @@
               <w:spacing w:line="278" w:lineRule="auto"/>
             </w:pPr>
             <w:r>
-              <w:t>git stash apply</w:t>
+              <w:t xml:space="preserve">git </w:t>
+            </w:r>
+            <w:proofErr w:type="gramStart"/>
+            <w:r>
+              <w:t>stash</w:t>
+            </w:r>
+            <w:proofErr w:type="gramEnd"/>
+            <w:r>
+              <w:t xml:space="preserve"> apply</w:t>
             </w:r>
           </w:p>
         </w:tc>
@@ -2091,7 +2106,23 @@
               <w:spacing w:line="278" w:lineRule="auto"/>
             </w:pPr>
             <w:r>
-              <w:t>git stash drop stash@{0}</w:t>
+              <w:t xml:space="preserve">git </w:t>
+            </w:r>
+            <w:proofErr w:type="gramStart"/>
+            <w:r>
+              <w:t>stash</w:t>
+            </w:r>
+            <w:proofErr w:type="gramEnd"/>
+            <w:r>
+              <w:t xml:space="preserve"> drop stash</w:t>
+            </w:r>
+            <w:proofErr w:type="gramStart"/>
+            <w:r>
+              <w:t>@{</w:t>
+            </w:r>
+            <w:proofErr w:type="gramEnd"/>
+            <w:r>
+              <w:t>0}</w:t>
             </w:r>
           </w:p>
         </w:tc>
@@ -2424,8 +2455,13 @@
               <w:spacing w:line="278" w:lineRule="auto"/>
               <w:jc w:val="center"/>
             </w:pPr>
-            <w:r>
-              <w:t>git revert &lt;commit-id&gt;</w:t>
+            <w:proofErr w:type="gramStart"/>
+            <w:r>
+              <w:t>git</w:t>
+            </w:r>
+            <w:proofErr w:type="gramEnd"/>
+            <w:r>
+              <w:t xml:space="preserve"> revert &lt;commit-id&gt;</w:t>
             </w:r>
           </w:p>
         </w:tc>
@@ -2582,7 +2618,15 @@
               <w:jc w:val="center"/>
             </w:pPr>
             <w:r>
-              <w:t>Removes commit from history</w:t>
+              <w:t xml:space="preserve">Removes </w:t>
+            </w:r>
+            <w:proofErr w:type="gramStart"/>
+            <w:r>
+              <w:t>commit</w:t>
+            </w:r>
+            <w:proofErr w:type="gramEnd"/>
+            <w:r>
+              <w:t xml:space="preserve"> from history</w:t>
             </w:r>
           </w:p>
         </w:tc>
@@ -2646,8 +2690,13 @@
               <w:spacing w:line="278" w:lineRule="auto"/>
               <w:jc w:val="center"/>
             </w:pPr>
-            <w:r>
-              <w:t>Creates new commit</w:t>
+            <w:proofErr w:type="gramStart"/>
+            <w:r>
+              <w:t>Creates</w:t>
+            </w:r>
+            <w:proofErr w:type="gramEnd"/>
+            <w:r>
+              <w:t xml:space="preserve"> new commit</w:t>
             </w:r>
           </w:p>
         </w:tc>
@@ -2984,8 +3033,13 @@
               <w:spacing w:line="278" w:lineRule="auto"/>
               <w:jc w:val="center"/>
             </w:pPr>
-            <w:r>
-              <w:t>git rebase -</w:t>
+            <w:proofErr w:type="gramStart"/>
+            <w:r>
+              <w:t>git</w:t>
+            </w:r>
+            <w:proofErr w:type="gramEnd"/>
+            <w:r>
+              <w:t xml:space="preserve"> rebase -</w:t>
             </w:r>
             <w:proofErr w:type="spellStart"/>
             <w:r>
@@ -3226,7 +3280,15 @@
         <w:spacing w:after="0"/>
       </w:pPr>
       <w:r>
-        <w:t>Creates merge commit</w:t>
+        <w:t xml:space="preserve">Creates </w:t>
+      </w:r>
+      <w:proofErr w:type="gramStart"/>
+      <w:r>
+        <w:t>merge</w:t>
+      </w:r>
+      <w:proofErr w:type="gramEnd"/>
+      <w:r>
+        <w:t xml:space="preserve"> commit</w:t>
       </w:r>
     </w:p>
     <w:p>
@@ -3442,8 +3504,13 @@
               <w:spacing w:line="278" w:lineRule="auto"/>
               <w:jc w:val="center"/>
             </w:pPr>
-            <w:r>
-              <w:t>git cherry-pick &lt;commit-id&gt;</w:t>
+            <w:proofErr w:type="gramStart"/>
+            <w:r>
+              <w:t>git</w:t>
+            </w:r>
+            <w:proofErr w:type="gramEnd"/>
+            <w:r>
+              <w:t xml:space="preserve"> cherry-pick &lt;commit-id&gt;</w:t>
             </w:r>
           </w:p>
         </w:tc>
@@ -3479,8 +3546,21 @@
               <w:spacing w:line="278" w:lineRule="auto"/>
               <w:jc w:val="center"/>
             </w:pPr>
-            <w:r>
-              <w:t>git cherry-pick A^..B</w:t>
+            <w:proofErr w:type="gramStart"/>
+            <w:r>
+              <w:t>git</w:t>
+            </w:r>
+            <w:proofErr w:type="gramEnd"/>
+            <w:r>
+              <w:t xml:space="preserve"> cherry-pick A</w:t>
+            </w:r>
+            <w:proofErr w:type="gramStart"/>
+            <w:r>
+              <w:t>^..</w:t>
+            </w:r>
+            <w:proofErr w:type="gramEnd"/>
+            <w:r>
+              <w:t>B</w:t>
             </w:r>
           </w:p>
         </w:tc>
@@ -4365,6 +4445,7 @@
               <w:t xml:space="preserve">git config --global </w:t>
             </w:r>
             <w:proofErr w:type="spellStart"/>
+            <w:proofErr w:type="gramStart"/>
             <w:r>
               <w:rPr>
                 <w:b/>
@@ -4373,6 +4454,7 @@
               <w:t>alias.lg</w:t>
             </w:r>
             <w:proofErr w:type="spellEnd"/>
+            <w:proofErr w:type="gramEnd"/>
             <w:r>
               <w:rPr>
                 <w:b/>
@@ -4538,6 +4620,7 @@
           <w:szCs w:val="36"/>
         </w:rPr>
       </w:pPr>
+      <w:proofErr w:type="gramStart"/>
       <w:r>
         <w:rPr>
           <w:b/>
@@ -4558,6 +4641,7 @@
         <w:t>gitignore</w:t>
       </w:r>
       <w:proofErr w:type="spellEnd"/>
+      <w:proofErr w:type="gramEnd"/>
       <w:r>
         <w:rPr>
           <w:b/>
@@ -4645,6 +4729,7 @@
                 <w:bCs/>
               </w:rPr>
             </w:pPr>
+            <w:proofErr w:type="gramStart"/>
             <w:r>
               <w:rPr>
                 <w:b/>
@@ -4661,6 +4746,7 @@
               <w:t>gitignore</w:t>
             </w:r>
             <w:proofErr w:type="spellEnd"/>
+            <w:proofErr w:type="gramEnd"/>
           </w:p>
         </w:tc>
         <w:tc>
@@ -4945,6 +5031,7 @@
                 <w:bCs/>
               </w:rPr>
             </w:pPr>
+            <w:proofErr w:type="gramStart"/>
             <w:r>
               <w:rPr>
                 <w:b/>
@@ -4952,6 +5039,7 @@
               </w:rPr>
               <w:t>.env</w:t>
             </w:r>
+            <w:proofErr w:type="gramEnd"/>
           </w:p>
         </w:tc>
         <w:tc>
@@ -5639,8 +5727,13 @@
               <w:spacing w:line="278" w:lineRule="auto"/>
             </w:pPr>
             <w:r>
-              <w:t>git remote -v</w:t>
-            </w:r>
+              <w:t xml:space="preserve">git </w:t>
+            </w:r>
+            <w:proofErr w:type="gramStart"/>
+            <w:r>
+              <w:t>remote -v</w:t>
+            </w:r>
+            <w:proofErr w:type="gramEnd"/>
           </w:p>
         </w:tc>
         <w:tc>
@@ -6179,8 +6272,13 @@
               <w:cnfStyle w:val="000000100000" w:firstRow="0" w:lastRow="0" w:firstColumn="0" w:lastColumn="0" w:oddVBand="0" w:evenVBand="0" w:oddHBand="1" w:evenHBand="0" w:firstRowFirstColumn="0" w:firstRowLastColumn="0" w:lastRowFirstColumn="0" w:lastRowLastColumn="0"/>
             </w:pPr>
             <w:r>
-              <w:t>Mark complete</w:t>
-            </w:r>
+              <w:t xml:space="preserve">Mark </w:t>
+            </w:r>
+            <w:proofErr w:type="gramStart"/>
+            <w:r>
+              <w:t>complete</w:t>
+            </w:r>
+            <w:proofErr w:type="gramEnd"/>
           </w:p>
         </w:tc>
       </w:tr>
@@ -6550,7 +6648,23 @@
           <w:b/>
           <w:bCs/>
         </w:rPr>
-        <w:t>What is a README?</w:t>
+        <w:t xml:space="preserve">What is </w:t>
+      </w:r>
+      <w:proofErr w:type="gramStart"/>
+      <w:r>
+        <w:rPr>
+          <w:b/>
+          <w:bCs/>
+        </w:rPr>
+        <w:t>a README</w:t>
+      </w:r>
+      <w:proofErr w:type="gramEnd"/>
+      <w:r>
+        <w:rPr>
+          <w:b/>
+          <w:bCs/>
+        </w:rPr>
+        <w:t>?</w:t>
       </w:r>
     </w:p>
     <w:p>
@@ -6885,7 +6999,23 @@
           <w:b/>
           <w:bCs/>
         </w:rPr>
-        <w:t>What is GitHub Actions?</w:t>
+        <w:t xml:space="preserve">What </w:t>
+      </w:r>
+      <w:proofErr w:type="gramStart"/>
+      <w:r>
+        <w:rPr>
+          <w:b/>
+          <w:bCs/>
+        </w:rPr>
+        <w:t>is</w:t>
+      </w:r>
+      <w:proofErr w:type="gramEnd"/>
+      <w:r>
+        <w:rPr>
+          <w:b/>
+          <w:bCs/>
+        </w:rPr>
+        <w:t xml:space="preserve"> GitHub Actions?</w:t>
       </w:r>
     </w:p>
     <w:p>
@@ -7281,8 +7411,13 @@
             <w:pPr>
               <w:spacing w:line="278" w:lineRule="auto"/>
             </w:pPr>
-            <w:r>
-              <w:t>on: push</w:t>
+            <w:proofErr w:type="gramStart"/>
+            <w:r>
+              <w:t>on:</w:t>
+            </w:r>
+            <w:proofErr w:type="gramEnd"/>
+            <w:r>
+              <w:t xml:space="preserve"> push</w:t>
             </w:r>
           </w:p>
         </w:tc>
@@ -7413,12 +7548,21 @@
           <w:bCs/>
         </w:rPr>
       </w:pPr>
-      <w:r>
-        <w:rPr>
-          <w:b/>
-          <w:bCs/>
-        </w:rPr>
-        <w:t>How Git Thinks</w:t>
+      <w:proofErr w:type="gramStart"/>
+      <w:r>
+        <w:rPr>
+          <w:b/>
+          <w:bCs/>
+        </w:rPr>
+        <w:t>How</w:t>
+      </w:r>
+      <w:proofErr w:type="gramEnd"/>
+      <w:r>
+        <w:rPr>
+          <w:b/>
+          <w:bCs/>
+        </w:rPr>
+        <w:t xml:space="preserve"> Git Thinks</w:t>
       </w:r>
     </w:p>
     <w:p>
@@ -7561,10 +7705,12 @@
               <w:t xml:space="preserve">git add </w:t>
             </w:r>
             <w:proofErr w:type="spellStart"/>
+            <w:proofErr w:type="gramStart"/>
             <w:r>
               <w:t>data.json</w:t>
             </w:r>
             <w:proofErr w:type="spellEnd"/>
+            <w:proofErr w:type="gramEnd"/>
           </w:p>
         </w:tc>
         <w:tc>
@@ -7705,8 +7851,13 @@
             <w:pPr>
               <w:spacing w:line="278" w:lineRule="auto"/>
             </w:pPr>
-            <w:r>
-              <w:t>git restore file</w:t>
+            <w:proofErr w:type="gramStart"/>
+            <w:r>
+              <w:t>git</w:t>
+            </w:r>
+            <w:proofErr w:type="gramEnd"/>
+            <w:r>
+              <w:t xml:space="preserve"> restore file</w:t>
             </w:r>
           </w:p>
         </w:tc>
@@ -7898,8 +8049,13 @@
             <w:pPr>
               <w:spacing w:line="278" w:lineRule="auto"/>
             </w:pPr>
-            <w:r>
-              <w:t xml:space="preserve">ls .git </w:t>
+            <w:proofErr w:type="gramStart"/>
+            <w:r>
+              <w:t>ls .git</w:t>
+            </w:r>
+            <w:proofErr w:type="gramEnd"/>
+            <w:r>
+              <w:t xml:space="preserve"> </w:t>
             </w:r>
             <w:r>
               <w:rPr>
@@ -7909,6 +8065,7 @@
               <w:t xml:space="preserve">(or </w:t>
             </w:r>
             <w:proofErr w:type="spellStart"/>
+            <w:proofErr w:type="gramStart"/>
             <w:r>
               <w:rPr>
                 <w:i/>
@@ -7922,49 +8079,78 @@
                 <w:i/>
                 <w:iCs/>
               </w:rPr>
-              <w:t xml:space="preserve"> .git on Windows)</w:t>
-            </w:r>
-          </w:p>
-        </w:tc>
-        <w:tc>
-          <w:tcPr>
-            <w:tcW w:w="0" w:type="auto"/>
-            <w:hideMark/>
-          </w:tcPr>
-          <w:p>
-            <w:pPr>
-              <w:spacing w:line="278" w:lineRule="auto"/>
-              <w:cnfStyle w:val="000000100000" w:firstRow="0" w:lastRow="0" w:firstColumn="0" w:lastColumn="0" w:oddVBand="0" w:evenVBand="0" w:oddHBand="1" w:evenHBand="0" w:firstRowFirstColumn="0" w:firstRowLastColumn="0" w:lastRowFirstColumn="0" w:lastRowLastColumn="0"/>
-            </w:pPr>
-            <w:r>
-              <w:t>View internal Git folder</w:t>
-            </w:r>
-          </w:p>
-        </w:tc>
-      </w:tr>
-      <w:tr>
-        <w:trPr>
-          <w:jc w:val="center"/>
-        </w:trPr>
-        <w:tc>
-          <w:tcPr>
-            <w:cnfStyle w:val="001000000000" w:firstRow="0" w:lastRow="0" w:firstColumn="1" w:lastColumn="0" w:oddVBand="0" w:evenVBand="0" w:oddHBand="0" w:evenHBand="0" w:firstRowFirstColumn="0" w:firstRowLastColumn="0" w:lastRowFirstColumn="0" w:lastRowLastColumn="0"/>
-            <w:tcW w:w="0" w:type="auto"/>
-            <w:hideMark/>
-          </w:tcPr>
-          <w:p>
-            <w:pPr>
-              <w:spacing w:line="278" w:lineRule="auto"/>
-            </w:pPr>
-            <w:r>
-              <w:t xml:space="preserve">cat .git/HEAD </w:t>
-            </w:r>
+              <w:t xml:space="preserve"> .git</w:t>
+            </w:r>
+            <w:proofErr w:type="gramEnd"/>
             <w:r>
               <w:rPr>
                 <w:i/>
                 <w:iCs/>
               </w:rPr>
-              <w:t>(or type .git\HEAD on Windows)</w:t>
+              <w:t xml:space="preserve"> on Windows)</w:t>
+            </w:r>
+          </w:p>
+        </w:tc>
+        <w:tc>
+          <w:tcPr>
+            <w:tcW w:w="0" w:type="auto"/>
+            <w:hideMark/>
+          </w:tcPr>
+          <w:p>
+            <w:pPr>
+              <w:spacing w:line="278" w:lineRule="auto"/>
+              <w:cnfStyle w:val="000000100000" w:firstRow="0" w:lastRow="0" w:firstColumn="0" w:lastColumn="0" w:oddVBand="0" w:evenVBand="0" w:oddHBand="1" w:evenHBand="0" w:firstRowFirstColumn="0" w:firstRowLastColumn="0" w:lastRowFirstColumn="0" w:lastRowLastColumn="0"/>
+            </w:pPr>
+            <w:r>
+              <w:t>View internal Git folder</w:t>
+            </w:r>
+          </w:p>
+        </w:tc>
+      </w:tr>
+      <w:tr>
+        <w:trPr>
+          <w:jc w:val="center"/>
+        </w:trPr>
+        <w:tc>
+          <w:tcPr>
+            <w:cnfStyle w:val="001000000000" w:firstRow="0" w:lastRow="0" w:firstColumn="1" w:lastColumn="0" w:oddVBand="0" w:evenVBand="0" w:oddHBand="0" w:evenHBand="0" w:firstRowFirstColumn="0" w:firstRowLastColumn="0" w:lastRowFirstColumn="0" w:lastRowLastColumn="0"/>
+            <w:tcW w:w="0" w:type="auto"/>
+            <w:hideMark/>
+          </w:tcPr>
+          <w:p>
+            <w:pPr>
+              <w:spacing w:line="278" w:lineRule="auto"/>
+            </w:pPr>
+            <w:proofErr w:type="gramStart"/>
+            <w:r>
+              <w:t>cat .git</w:t>
+            </w:r>
+            <w:proofErr w:type="gramEnd"/>
+            <w:r>
+              <w:t xml:space="preserve">/HEAD </w:t>
+            </w:r>
+            <w:r>
+              <w:rPr>
+                <w:i/>
+                <w:iCs/>
+              </w:rPr>
+              <w:t xml:space="preserve">(or </w:t>
+            </w:r>
+            <w:proofErr w:type="gramStart"/>
+            <w:r>
+              <w:rPr>
+                <w:i/>
+                <w:iCs/>
+              </w:rPr>
+              <w:t>type .git</w:t>
+            </w:r>
+            <w:proofErr w:type="gramEnd"/>
+            <w:r>
+              <w:rPr>
+                <w:i/>
+                <w:iCs/>
+              </w:rPr>
+              <w:t>\HEAD on Windows)</w:t>
             </w:r>
           </w:p>
         </w:tc>
@@ -8107,7 +8293,15 @@
         <w:spacing w:after="0"/>
       </w:pPr>
       <w:r>
-        <w:t>Before commit → run something</w:t>
+        <w:t xml:space="preserve">Before </w:t>
+      </w:r>
+      <w:proofErr w:type="gramStart"/>
+      <w:r>
+        <w:t>commit → run</w:t>
+      </w:r>
+      <w:proofErr w:type="gramEnd"/>
+      <w:r>
+        <w:t xml:space="preserve"> something</w:t>
       </w:r>
     </w:p>
     <w:p>
@@ -8154,8 +8348,13 @@
         <w:spacing w:after="0"/>
       </w:pPr>
       <w:r>
-        <w:t>Check code before commit</w:t>
-      </w:r>
+        <w:t xml:space="preserve">Check code before </w:t>
+      </w:r>
+      <w:proofErr w:type="gramStart"/>
+      <w:r>
+        <w:t>commit</w:t>
+      </w:r>
+      <w:proofErr w:type="gramEnd"/>
     </w:p>
     <w:p>
       <w:pPr>
@@ -8180,8 +8379,13 @@
         <w:spacing w:after="0"/>
       </w:pPr>
       <w:r>
-        <w:t>Print message after commit</w:t>
-      </w:r>
+        <w:t xml:space="preserve">Print message after </w:t>
+      </w:r>
+      <w:proofErr w:type="gramStart"/>
+      <w:r>
+        <w:t>commit</w:t>
+      </w:r>
+      <w:proofErr w:type="gramEnd"/>
     </w:p>
     <w:p>
       <w:pPr>
@@ -8274,8 +8478,13 @@
             <w:pPr>
               <w:spacing w:line="278" w:lineRule="auto"/>
             </w:pPr>
-            <w:r>
-              <w:t>ls .git/hooks</w:t>
+            <w:proofErr w:type="gramStart"/>
+            <w:r>
+              <w:t>ls .git</w:t>
+            </w:r>
+            <w:proofErr w:type="gramEnd"/>
+            <w:r>
+              <w:t>/hooks</w:t>
             </w:r>
           </w:p>
         </w:tc>
@@ -8289,28 +8498,38 @@
               <w:spacing w:line="278" w:lineRule="auto"/>
               <w:cnfStyle w:val="000000100000" w:firstRow="0" w:lastRow="0" w:firstColumn="0" w:lastColumn="0" w:oddVBand="0" w:evenVBand="0" w:oddHBand="1" w:evenHBand="0" w:firstRowFirstColumn="0" w:firstRowLastColumn="0" w:lastRowFirstColumn="0" w:lastRowLastColumn="0"/>
             </w:pPr>
-            <w:r>
-              <w:t>List all available hooks</w:t>
-            </w:r>
-          </w:p>
-        </w:tc>
-      </w:tr>
-      <w:tr>
-        <w:trPr>
-          <w:jc w:val="center"/>
-        </w:trPr>
-        <w:tc>
-          <w:tcPr>
-            <w:cnfStyle w:val="001000000000" w:firstRow="0" w:lastRow="0" w:firstColumn="1" w:lastColumn="0" w:oddVBand="0" w:evenVBand="0" w:oddHBand="0" w:evenHBand="0" w:firstRowFirstColumn="0" w:firstRowLastColumn="0" w:lastRowFirstColumn="0" w:lastRowLastColumn="0"/>
-            <w:tcW w:w="0" w:type="auto"/>
-            <w:hideMark/>
-          </w:tcPr>
-          <w:p>
-            <w:pPr>
-              <w:spacing w:line="278" w:lineRule="auto"/>
-            </w:pPr>
-            <w:r>
-              <w:t>cd .git/hooks</w:t>
+            <w:proofErr w:type="gramStart"/>
+            <w:r>
+              <w:t>List</w:t>
+            </w:r>
+            <w:proofErr w:type="gramEnd"/>
+            <w:r>
+              <w:t xml:space="preserve"> all available hooks</w:t>
+            </w:r>
+          </w:p>
+        </w:tc>
+      </w:tr>
+      <w:tr>
+        <w:trPr>
+          <w:jc w:val="center"/>
+        </w:trPr>
+        <w:tc>
+          <w:tcPr>
+            <w:cnfStyle w:val="001000000000" w:firstRow="0" w:lastRow="0" w:firstColumn="1" w:lastColumn="0" w:oddVBand="0" w:evenVBand="0" w:oddHBand="0" w:evenHBand="0" w:firstRowFirstColumn="0" w:firstRowLastColumn="0" w:lastRowFirstColumn="0" w:lastRowLastColumn="0"/>
+            <w:tcW w:w="0" w:type="auto"/>
+            <w:hideMark/>
+          </w:tcPr>
+          <w:p>
+            <w:pPr>
+              <w:spacing w:line="278" w:lineRule="auto"/>
+            </w:pPr>
+            <w:proofErr w:type="gramStart"/>
+            <w:r>
+              <w:t>cd .git</w:t>
+            </w:r>
+            <w:proofErr w:type="gramEnd"/>
+            <w:r>
+              <w:t>/hooks</w:t>
             </w:r>
           </w:p>
         </w:tc>
@@ -8346,8 +8565,13 @@
               <w:spacing w:line="278" w:lineRule="auto"/>
             </w:pPr>
             <w:r>
-              <w:t>cd ../..</w:t>
-            </w:r>
+              <w:t>cd</w:t>
+            </w:r>
+            <w:proofErr w:type="gramStart"/>
+            <w:r>
+              <w:t xml:space="preserve"> ../..</w:t>
+            </w:r>
+            <w:proofErr w:type="gramEnd"/>
           </w:p>
         </w:tc>
         <w:tc>
@@ -8832,7 +9056,15 @@
               <w:spacing w:line="278" w:lineRule="auto"/>
             </w:pPr>
             <w:r>
-              <w:t>ls -la .git/hooks</w:t>
+              <w:t>ls -</w:t>
+            </w:r>
+            <w:proofErr w:type="gramStart"/>
+            <w:r>
+              <w:t>la .git</w:t>
+            </w:r>
+            <w:proofErr w:type="gramEnd"/>
+            <w:r>
+              <w:t>/hooks</w:t>
             </w:r>
           </w:p>
         </w:tc>
@@ -9115,8 +9347,13 @@
               <w:spacing w:line="278" w:lineRule="auto"/>
               <w:cnfStyle w:val="000000000000" w:firstRow="0" w:lastRow="0" w:firstColumn="0" w:lastColumn="0" w:oddVBand="0" w:evenVBand="0" w:oddHBand="0" w:evenHBand="0" w:firstRowFirstColumn="0" w:firstRowLastColumn="0" w:lastRowFirstColumn="0" w:lastRowLastColumn="0"/>
             </w:pPr>
-            <w:r>
-              <w:t>Commit is blocked</w:t>
+            <w:proofErr w:type="gramStart"/>
+            <w:r>
+              <w:t>Commit</w:t>
+            </w:r>
+            <w:proofErr w:type="gramEnd"/>
+            <w:r>
+              <w:t xml:space="preserve"> is blocked</w:t>
             </w:r>
           </w:p>
         </w:tc>
@@ -9176,7 +9413,27 @@
           <w:sz w:val="36"/>
           <w:szCs w:val="36"/>
         </w:rPr>
-        <w:t>Git Debugging &amp; Recovery (Fix Mistakes Like a Pro)</w:t>
+        <w:t xml:space="preserve">Git Debugging &amp; Recovery (Fix Mistakes Like </w:t>
+      </w:r>
+      <w:proofErr w:type="gramStart"/>
+      <w:r>
+        <w:rPr>
+          <w:b/>
+          <w:bCs/>
+          <w:sz w:val="36"/>
+          <w:szCs w:val="36"/>
+        </w:rPr>
+        <w:t>a</w:t>
+      </w:r>
+      <w:proofErr w:type="gramEnd"/>
+      <w:r>
+        <w:rPr>
+          <w:b/>
+          <w:bCs/>
+          <w:sz w:val="36"/>
+          <w:szCs w:val="36"/>
+        </w:rPr>
+        <w:t xml:space="preserve"> Pro)</w:t>
       </w:r>
     </w:p>
     <w:tbl>
@@ -9244,8 +9501,13 @@
               <w:spacing w:line="278" w:lineRule="auto"/>
               <w:jc w:val="center"/>
             </w:pPr>
-            <w:r>
-              <w:t>git restore file</w:t>
+            <w:proofErr w:type="gramStart"/>
+            <w:r>
+              <w:t>git</w:t>
+            </w:r>
+            <w:proofErr w:type="gramEnd"/>
+            <w:r>
+              <w:t xml:space="preserve"> restore file</w:t>
             </w:r>
           </w:p>
         </w:tc>
@@ -9883,6 +10145,7 @@
         </w:numPr>
         <w:spacing w:after="0"/>
       </w:pPr>
+      <w:proofErr w:type="gramStart"/>
       <w:r>
         <w:t xml:space="preserve">Use </w:t>
       </w:r>
@@ -9902,6 +10165,7 @@
         <w:t>gitignore</w:t>
       </w:r>
       <w:proofErr w:type="spellEnd"/>
+      <w:proofErr w:type="gramEnd"/>
       <w:r>
         <w:t xml:space="preserve"> for sensitive/unwanted files </w:t>
       </w:r>
@@ -9961,7 +10225,7 @@
           <w:sz w:val="36"/>
           <w:szCs w:val="36"/>
         </w:rPr>
-        <w:t>6</w:t>
+        <w:t>5</w:t>
       </w:r>
     </w:p>
     <w:p>
@@ -9974,6 +10238,7 @@
           <w:szCs w:val="36"/>
         </w:rPr>
       </w:pPr>
+      <w:proofErr w:type="gramStart"/>
       <w:r>
         <w:rPr>
           <w:b/>
@@ -9994,6 +10259,7 @@
         <w:t>gitignore</w:t>
       </w:r>
       <w:proofErr w:type="spellEnd"/>
+      <w:proofErr w:type="gramEnd"/>
       <w:r>
         <w:rPr>
           <w:b/>
@@ -10026,6 +10292,7 @@
       <w:pPr>
         <w:spacing w:after="0"/>
       </w:pPr>
+      <w:proofErr w:type="gramStart"/>
       <w:r>
         <w:t>A .</w:t>
       </w:r>
@@ -10034,6 +10301,7 @@
         <w:t>gitignore</w:t>
       </w:r>
       <w:proofErr w:type="spellEnd"/>
+      <w:proofErr w:type="gramEnd"/>
       <w:r>
         <w:t xml:space="preserve"> file tells Git:</w:t>
       </w:r>
@@ -10106,9 +10374,11 @@
             <w:pPr>
               <w:spacing w:line="278" w:lineRule="auto"/>
             </w:pPr>
+            <w:proofErr w:type="gramStart"/>
             <w:r>
               <w:t>.env</w:t>
             </w:r>
+            <w:proofErr w:type="gramEnd"/>
           </w:p>
         </w:tc>
         <w:tc>
@@ -10378,8 +10648,13 @@
               <w:spacing w:line="278" w:lineRule="auto"/>
             </w:pPr>
             <w:r>
-              <w:t>git clean -n</w:t>
-            </w:r>
+              <w:t xml:space="preserve">git </w:t>
+            </w:r>
+            <w:proofErr w:type="gramStart"/>
+            <w:r>
+              <w:t>clean -n</w:t>
+            </w:r>
+            <w:proofErr w:type="gramEnd"/>
           </w:p>
         </w:tc>
         <w:tc>
@@ -10413,8 +10688,13 @@
               <w:spacing w:line="278" w:lineRule="auto"/>
             </w:pPr>
             <w:r>
-              <w:t>git clean -f</w:t>
-            </w:r>
+              <w:t xml:space="preserve">git </w:t>
+            </w:r>
+            <w:proofErr w:type="gramStart"/>
+            <w:r>
+              <w:t>clean -f</w:t>
+            </w:r>
+            <w:proofErr w:type="gramEnd"/>
           </w:p>
         </w:tc>
         <w:tc>
@@ -10495,28 +10775,28 @@
           <w:sz w:val="36"/>
           <w:szCs w:val="36"/>
         </w:rPr>
-        <w:t>Day: 27</w:t>
-      </w:r>
-    </w:p>
-    <w:p>
-      <w:pPr>
-        <w:spacing w:after="0"/>
+        <w:t>Day: 2</w:t>
+      </w:r>
+      <w:r>
         <w:rPr>
           <w:b/>
           <w:bCs/>
           <w:sz w:val="36"/>
           <w:szCs w:val="36"/>
         </w:rPr>
-      </w:pPr>
-      <w:r>
+        <w:t>6</w:t>
+      </w:r>
+    </w:p>
+    <w:p>
+      <w:pPr>
+        <w:spacing w:after="0"/>
         <w:rPr>
           <w:b/>
           <w:bCs/>
           <w:sz w:val="36"/>
           <w:szCs w:val="36"/>
         </w:rPr>
-        <w:t xml:space="preserve">Rebase - </w:t>
-      </w:r>
+      </w:pPr>
       <w:r>
         <w:rPr>
           <w:b/>
@@ -10524,7 +10804,7 @@
           <w:sz w:val="36"/>
           <w:szCs w:val="36"/>
         </w:rPr>
-        <w:t>A</w:t>
+        <w:t xml:space="preserve">Rebase - </w:t>
       </w:r>
       <w:r>
         <w:rPr>
@@ -10533,7 +10813,7 @@
           <w:sz w:val="36"/>
           <w:szCs w:val="36"/>
         </w:rPr>
-        <w:t>dvanced</w:t>
+        <w:t>A</w:t>
       </w:r>
       <w:r>
         <w:rPr>
@@ -10542,7 +10822,7 @@
           <w:sz w:val="36"/>
           <w:szCs w:val="36"/>
         </w:rPr>
-        <w:t xml:space="preserve"> GIT T</w:t>
+        <w:t>dvanced</w:t>
       </w:r>
       <w:r>
         <w:rPr>
@@ -10551,6 +10831,15 @@
           <w:sz w:val="36"/>
           <w:szCs w:val="36"/>
         </w:rPr>
+        <w:t xml:space="preserve"> GIT T</w:t>
+      </w:r>
+      <w:r>
+        <w:rPr>
+          <w:b/>
+          <w:bCs/>
+          <w:sz w:val="36"/>
+          <w:szCs w:val="36"/>
+        </w:rPr>
         <w:t>rack</w:t>
       </w:r>
     </w:p>
@@ -10565,7 +10854,15 @@
       </w:pPr>
       <w:r>
         <w:lastRenderedPageBreak/>
-        <w:t>Rebase = Move your commits on top of another branch</w:t>
+        <w:t xml:space="preserve">Rebase = Move your commits </w:t>
+      </w:r>
+      <w:proofErr w:type="gramStart"/>
+      <w:r>
+        <w:t>on</w:t>
+      </w:r>
+      <w:proofErr w:type="gramEnd"/>
+      <w:r>
+        <w:t xml:space="preserve"> top of another branch</w:t>
       </w:r>
     </w:p>
     <w:p>
@@ -10684,8 +10981,13 @@
             <w:pPr>
               <w:spacing w:line="278" w:lineRule="auto"/>
             </w:pPr>
-            <w:r>
-              <w:t>git rebase main</w:t>
+            <w:proofErr w:type="gramStart"/>
+            <w:r>
+              <w:t>git</w:t>
+            </w:r>
+            <w:proofErr w:type="gramEnd"/>
+            <w:r>
+              <w:t xml:space="preserve"> rebase main</w:t>
             </w:r>
           </w:p>
         </w:tc>
@@ -10719,8 +11021,13 @@
             <w:pPr>
               <w:spacing w:line="278" w:lineRule="auto"/>
             </w:pPr>
-            <w:r>
-              <w:t>git rebase -</w:t>
+            <w:proofErr w:type="gramStart"/>
+            <w:r>
+              <w:t>git</w:t>
+            </w:r>
+            <w:proofErr w:type="gramEnd"/>
+            <w:r>
+              <w:t xml:space="preserve"> rebase -</w:t>
             </w:r>
             <w:proofErr w:type="spellStart"/>
             <w:r>
@@ -10760,8 +11067,13 @@
             <w:pPr>
               <w:spacing w:line="278" w:lineRule="auto"/>
             </w:pPr>
-            <w:r>
-              <w:t>git rebase --continue</w:t>
+            <w:proofErr w:type="gramStart"/>
+            <w:r>
+              <w:t>git</w:t>
+            </w:r>
+            <w:proofErr w:type="gramEnd"/>
+            <w:r>
+              <w:t xml:space="preserve"> rebase --continue</w:t>
             </w:r>
           </w:p>
         </w:tc>
@@ -10795,8 +11107,13 @@
             <w:pPr>
               <w:spacing w:line="278" w:lineRule="auto"/>
             </w:pPr>
-            <w:r>
-              <w:t>git rebase --abort</w:t>
+            <w:proofErr w:type="gramStart"/>
+            <w:r>
+              <w:t>git</w:t>
+            </w:r>
+            <w:proofErr w:type="gramEnd"/>
+            <w:r>
+              <w:t xml:space="preserve"> rebase --abort</w:t>
             </w:r>
           </w:p>
         </w:tc>
@@ -10842,7 +11159,16 @@
           <w:sz w:val="36"/>
           <w:szCs w:val="36"/>
         </w:rPr>
-        <w:t>Day: 28</w:t>
+        <w:t>Day: 2</w:t>
+      </w:r>
+      <w:r>
+        <w:rPr>
+          <w:b/>
+          <w:bCs/>
+          <w:sz w:val="36"/>
+          <w:szCs w:val="36"/>
+        </w:rPr>
+        <w:t>7</w:t>
       </w:r>
     </w:p>
     <w:p>
@@ -10997,8 +11323,13 @@
             <w:pPr>
               <w:spacing w:line="278" w:lineRule="auto"/>
             </w:pPr>
-            <w:r>
-              <w:t>git rebase -</w:t>
+            <w:proofErr w:type="gramStart"/>
+            <w:r>
+              <w:t>git</w:t>
+            </w:r>
+            <w:proofErr w:type="gramEnd"/>
+            <w:r>
+              <w:t xml:space="preserve"> rebase -</w:t>
             </w:r>
             <w:proofErr w:type="spellStart"/>
             <w:r>
@@ -11234,7 +11565,16 @@
           <w:sz w:val="36"/>
           <w:szCs w:val="36"/>
         </w:rPr>
-        <w:t>Day: 29</w:t>
+        <w:t>Day: 2</w:t>
+      </w:r>
+      <w:r>
+        <w:rPr>
+          <w:b/>
+          <w:bCs/>
+          <w:sz w:val="36"/>
+          <w:szCs w:val="36"/>
+        </w:rPr>
+        <w:t>8</w:t>
       </w:r>
     </w:p>
     <w:p>
@@ -11318,8 +11658,13 @@
               <w:cnfStyle w:val="100000000000" w:firstRow="1" w:lastRow="0" w:firstColumn="0" w:lastColumn="0" w:oddVBand="0" w:evenVBand="0" w:oddHBand="0" w:evenHBand="0" w:firstRowFirstColumn="0" w:firstRowLastColumn="0" w:lastRowFirstColumn="0" w:lastRowLastColumn="0"/>
             </w:pPr>
             <w:r>
-              <w:t>Use cherry-pick</w:t>
-            </w:r>
+              <w:t xml:space="preserve">Use </w:t>
+            </w:r>
+            <w:proofErr w:type="gramStart"/>
+            <w:r>
+              <w:t>cherry-pick</w:t>
+            </w:r>
+            <w:proofErr w:type="gramEnd"/>
           </w:p>
         </w:tc>
       </w:tr>
@@ -11466,7 +11811,15 @@
         <w:spacing w:after="0"/>
       </w:pPr>
       <w:r>
-        <w:t>Avoid cherry-pick if:</w:t>
+        <w:t>Avoid cherry-</w:t>
+      </w:r>
+      <w:proofErr w:type="gramStart"/>
+      <w:r>
+        <w:t>pick</w:t>
+      </w:r>
+      <w:proofErr w:type="gramEnd"/>
+      <w:r>
+        <w:t xml:space="preserve"> if:</w:t>
       </w:r>
     </w:p>
     <w:p>
@@ -11900,8 +12253,13 @@
             <w:pPr>
               <w:spacing w:line="278" w:lineRule="auto"/>
             </w:pPr>
-            <w:r>
-              <w:t>git cherry-pick &lt;id&gt;</w:t>
+            <w:proofErr w:type="gramStart"/>
+            <w:r>
+              <w:t>git</w:t>
+            </w:r>
+            <w:proofErr w:type="gramEnd"/>
+            <w:r>
+              <w:t xml:space="preserve"> cherry-pick &lt;id&gt;</w:t>
             </w:r>
           </w:p>
         </w:tc>
@@ -11936,8 +12294,13 @@
             <w:pPr>
               <w:spacing w:line="278" w:lineRule="auto"/>
             </w:pPr>
-            <w:r>
-              <w:t>git cherry-pick --continue</w:t>
+            <w:proofErr w:type="gramStart"/>
+            <w:r>
+              <w:t>git</w:t>
+            </w:r>
+            <w:proofErr w:type="gramEnd"/>
+            <w:r>
+              <w:t xml:space="preserve"> cherry-pick --continue</w:t>
             </w:r>
           </w:p>
         </w:tc>
@@ -11971,8 +12334,13 @@
             <w:pPr>
               <w:spacing w:line="278" w:lineRule="auto"/>
             </w:pPr>
-            <w:r>
-              <w:t>git cherry-pick --abort</w:t>
+            <w:proofErr w:type="gramStart"/>
+            <w:r>
+              <w:t>git</w:t>
+            </w:r>
+            <w:proofErr w:type="gramEnd"/>
+            <w:r>
+              <w:t xml:space="preserve"> cherry-pick --abort</w:t>
             </w:r>
           </w:p>
         </w:tc>
@@ -12027,7 +12395,7 @@
           <w:sz w:val="36"/>
           <w:szCs w:val="36"/>
         </w:rPr>
-        <w:t>30</w:t>
+        <w:t>29</w:t>
       </w:r>
     </w:p>
     <w:p>
@@ -12039,6 +12407,627 @@
           <w:sz w:val="36"/>
           <w:szCs w:val="36"/>
         </w:rPr>
+      </w:pPr>
+      <w:r>
+        <w:rPr>
+          <w:b/>
+          <w:bCs/>
+          <w:sz w:val="36"/>
+          <w:szCs w:val="36"/>
+        </w:rPr>
+        <w:t>Git Workflows</w:t>
+      </w:r>
+    </w:p>
+    <w:p>
+      <w:pPr>
+        <w:spacing w:after="0"/>
+      </w:pPr>
+    </w:p>
+    <w:p>
+      <w:pPr>
+        <w:spacing w:after="0"/>
+      </w:pPr>
+      <w:r>
+        <w:t>Understand how teams use:</w:t>
+      </w:r>
+    </w:p>
+    <w:p>
+      <w:pPr>
+        <w:numPr>
+          <w:ilvl w:val="0"/>
+          <w:numId w:val="17"/>
+        </w:numPr>
+        <w:spacing w:after="0"/>
+      </w:pPr>
+      <w:r>
+        <w:t xml:space="preserve">Branches </w:t>
+      </w:r>
+    </w:p>
+    <w:p>
+      <w:pPr>
+        <w:numPr>
+          <w:ilvl w:val="0"/>
+          <w:numId w:val="17"/>
+        </w:numPr>
+        <w:spacing w:after="0"/>
+      </w:pPr>
+      <w:r>
+        <w:t xml:space="preserve">Features </w:t>
+      </w:r>
+    </w:p>
+    <w:p>
+      <w:pPr>
+        <w:numPr>
+          <w:ilvl w:val="0"/>
+          <w:numId w:val="17"/>
+        </w:numPr>
+        <w:spacing w:after="0"/>
+      </w:pPr>
+      <w:r>
+        <w:t xml:space="preserve">Hotfixes </w:t>
+      </w:r>
+    </w:p>
+    <w:p>
+      <w:pPr>
+        <w:numPr>
+          <w:ilvl w:val="0"/>
+          <w:numId w:val="17"/>
+        </w:numPr>
+        <w:spacing w:after="0"/>
+      </w:pPr>
+      <w:r>
+        <w:t>Releases</w:t>
+      </w:r>
+    </w:p>
+    <w:p>
+      <w:pPr>
+        <w:spacing w:after="0"/>
+        <w:jc w:val="center"/>
+        <w:rPr>
+          <w:b/>
+          <w:bCs/>
+        </w:rPr>
+      </w:pPr>
+    </w:p>
+    <w:p>
+      <w:pPr>
+        <w:spacing w:after="0"/>
+        <w:jc w:val="center"/>
+        <w:rPr>
+          <w:b/>
+          <w:bCs/>
+        </w:rPr>
+      </w:pPr>
+      <w:r>
+        <w:rPr>
+          <w:b/>
+          <w:bCs/>
+        </w:rPr>
+        <w:t>G</w:t>
+      </w:r>
+      <w:r>
+        <w:rPr>
+          <w:b/>
+          <w:bCs/>
+        </w:rPr>
+        <w:t>it workflows = “</w:t>
+      </w:r>
+      <w:r>
+        <w:t>Organized way teams develop, fix, and release code</w:t>
+      </w:r>
+      <w:r>
+        <w:rPr>
+          <w:b/>
+          <w:bCs/>
+        </w:rPr>
+        <w:t>”</w:t>
+      </w:r>
+    </w:p>
+    <w:p>
+      <w:pPr>
+        <w:spacing w:after="0"/>
+        <w:jc w:val="center"/>
+        <w:rPr>
+          <w:b/>
+          <w:bCs/>
+        </w:rPr>
+      </w:pPr>
+      <w:r>
+        <w:rPr>
+          <w:b/>
+          <w:bCs/>
+        </w:rPr>
+        <w:t>branch → work → commit → PR → merge → release</w:t>
+      </w:r>
+    </w:p>
+    <w:p>
+      <w:pPr>
+        <w:spacing w:after="0"/>
+      </w:pPr>
+    </w:p>
+    <w:tbl>
+      <w:tblPr>
+        <w:tblStyle w:val="PlainTable1"/>
+        <w:tblW w:w="0" w:type="auto"/>
+        <w:jc w:val="center"/>
+        <w:tblLook w:val="04A0" w:firstRow="1" w:lastRow="0" w:firstColumn="1" w:lastColumn="0" w:noHBand="0" w:noVBand="1"/>
+      </w:tblPr>
+      <w:tblGrid>
+        <w:gridCol w:w="1865"/>
+        <w:gridCol w:w="2098"/>
+      </w:tblGrid>
+      <w:tr>
+        <w:trPr>
+          <w:cnfStyle w:val="100000000000" w:firstRow="1" w:lastRow="0" w:firstColumn="0" w:lastColumn="0" w:oddVBand="0" w:evenVBand="0" w:oddHBand="0" w:evenHBand="0" w:firstRowFirstColumn="0" w:firstRowLastColumn="0" w:lastRowFirstColumn="0" w:lastRowLastColumn="0"/>
+          <w:jc w:val="center"/>
+        </w:trPr>
+        <w:tc>
+          <w:tcPr>
+            <w:cnfStyle w:val="001000000000" w:firstRow="0" w:lastRow="0" w:firstColumn="1" w:lastColumn="0" w:oddVBand="0" w:evenVBand="0" w:oddHBand="0" w:evenHBand="0" w:firstRowFirstColumn="0" w:firstRowLastColumn="0" w:lastRowFirstColumn="0" w:lastRowLastColumn="0"/>
+            <w:tcW w:w="0" w:type="auto"/>
+            <w:hideMark/>
+          </w:tcPr>
+          <w:p>
+            <w:pPr>
+              <w:spacing w:line="278" w:lineRule="auto"/>
+            </w:pPr>
+            <w:r>
+              <w:t>Workflow Step</w:t>
+            </w:r>
+          </w:p>
+        </w:tc>
+        <w:tc>
+          <w:tcPr>
+            <w:tcW w:w="0" w:type="auto"/>
+            <w:hideMark/>
+          </w:tcPr>
+          <w:p>
+            <w:pPr>
+              <w:spacing w:line="278" w:lineRule="auto"/>
+              <w:cnfStyle w:val="100000000000" w:firstRow="1" w:lastRow="0" w:firstColumn="0" w:lastColumn="0" w:oddVBand="0" w:evenVBand="0" w:oddHBand="0" w:evenHBand="0" w:firstRowFirstColumn="0" w:firstRowLastColumn="0" w:lastRowFirstColumn="0" w:lastRowLastColumn="0"/>
+            </w:pPr>
+            <w:r>
+              <w:t>Meaning</w:t>
+            </w:r>
+          </w:p>
+        </w:tc>
+      </w:tr>
+      <w:tr>
+        <w:trPr>
+          <w:cnfStyle w:val="000000100000" w:firstRow="0" w:lastRow="0" w:firstColumn="0" w:lastColumn="0" w:oddVBand="0" w:evenVBand="0" w:oddHBand="1" w:evenHBand="0" w:firstRowFirstColumn="0" w:firstRowLastColumn="0" w:lastRowFirstColumn="0" w:lastRowLastColumn="0"/>
+          <w:jc w:val="center"/>
+        </w:trPr>
+        <w:tc>
+          <w:tcPr>
+            <w:cnfStyle w:val="001000000000" w:firstRow="0" w:lastRow="0" w:firstColumn="1" w:lastColumn="0" w:oddVBand="0" w:evenVBand="0" w:oddHBand="0" w:evenHBand="0" w:firstRowFirstColumn="0" w:firstRowLastColumn="0" w:lastRowFirstColumn="0" w:lastRowLastColumn="0"/>
+            <w:tcW w:w="0" w:type="auto"/>
+            <w:hideMark/>
+          </w:tcPr>
+          <w:p>
+            <w:pPr>
+              <w:spacing w:line="278" w:lineRule="auto"/>
+            </w:pPr>
+            <w:r>
+              <w:t>Feature branch</w:t>
+            </w:r>
+          </w:p>
+        </w:tc>
+        <w:tc>
+          <w:tcPr>
+            <w:tcW w:w="0" w:type="auto"/>
+            <w:hideMark/>
+          </w:tcPr>
+          <w:p>
+            <w:pPr>
+              <w:spacing w:line="278" w:lineRule="auto"/>
+              <w:cnfStyle w:val="000000100000" w:firstRow="0" w:lastRow="0" w:firstColumn="0" w:lastColumn="0" w:oddVBand="0" w:evenVBand="0" w:oddHBand="1" w:evenHBand="0" w:firstRowFirstColumn="0" w:firstRowLastColumn="0" w:lastRowFirstColumn="0" w:lastRowLastColumn="0"/>
+            </w:pPr>
+            <w:r>
+              <w:t>New development</w:t>
+            </w:r>
+          </w:p>
+        </w:tc>
+      </w:tr>
+      <w:tr>
+        <w:trPr>
+          <w:jc w:val="center"/>
+        </w:trPr>
+        <w:tc>
+          <w:tcPr>
+            <w:cnfStyle w:val="001000000000" w:firstRow="0" w:lastRow="0" w:firstColumn="1" w:lastColumn="0" w:oddVBand="0" w:evenVBand="0" w:oddHBand="0" w:evenHBand="0" w:firstRowFirstColumn="0" w:firstRowLastColumn="0" w:lastRowFirstColumn="0" w:lastRowLastColumn="0"/>
+            <w:tcW w:w="0" w:type="auto"/>
+            <w:hideMark/>
+          </w:tcPr>
+          <w:p>
+            <w:pPr>
+              <w:spacing w:line="278" w:lineRule="auto"/>
+            </w:pPr>
+            <w:r>
+              <w:t>Hotfix branch</w:t>
+            </w:r>
+          </w:p>
+        </w:tc>
+        <w:tc>
+          <w:tcPr>
+            <w:tcW w:w="0" w:type="auto"/>
+            <w:hideMark/>
+          </w:tcPr>
+          <w:p>
+            <w:pPr>
+              <w:spacing w:line="278" w:lineRule="auto"/>
+              <w:cnfStyle w:val="000000000000" w:firstRow="0" w:lastRow="0" w:firstColumn="0" w:lastColumn="0" w:oddVBand="0" w:evenVBand="0" w:oddHBand="0" w:evenHBand="0" w:firstRowFirstColumn="0" w:firstRowLastColumn="0" w:lastRowFirstColumn="0" w:lastRowLastColumn="0"/>
+            </w:pPr>
+            <w:r>
+              <w:t>Urgent fix</w:t>
+            </w:r>
+          </w:p>
+        </w:tc>
+      </w:tr>
+      <w:tr>
+        <w:trPr>
+          <w:cnfStyle w:val="000000100000" w:firstRow="0" w:lastRow="0" w:firstColumn="0" w:lastColumn="0" w:oddVBand="0" w:evenVBand="0" w:oddHBand="1" w:evenHBand="0" w:firstRowFirstColumn="0" w:firstRowLastColumn="0" w:lastRowFirstColumn="0" w:lastRowLastColumn="0"/>
+          <w:jc w:val="center"/>
+        </w:trPr>
+        <w:tc>
+          <w:tcPr>
+            <w:cnfStyle w:val="001000000000" w:firstRow="0" w:lastRow="0" w:firstColumn="1" w:lastColumn="0" w:oddVBand="0" w:evenVBand="0" w:oddHBand="0" w:evenHBand="0" w:firstRowFirstColumn="0" w:firstRowLastColumn="0" w:lastRowFirstColumn="0" w:lastRowLastColumn="0"/>
+            <w:tcW w:w="0" w:type="auto"/>
+            <w:hideMark/>
+          </w:tcPr>
+          <w:p>
+            <w:pPr>
+              <w:spacing w:line="278" w:lineRule="auto"/>
+            </w:pPr>
+            <w:r>
+              <w:lastRenderedPageBreak/>
+              <w:t>Main branch</w:t>
+            </w:r>
+          </w:p>
+        </w:tc>
+        <w:tc>
+          <w:tcPr>
+            <w:tcW w:w="0" w:type="auto"/>
+            <w:hideMark/>
+          </w:tcPr>
+          <w:p>
+            <w:pPr>
+              <w:spacing w:line="278" w:lineRule="auto"/>
+              <w:cnfStyle w:val="000000100000" w:firstRow="0" w:lastRow="0" w:firstColumn="0" w:lastColumn="0" w:oddVBand="0" w:evenVBand="0" w:oddHBand="1" w:evenHBand="0" w:firstRowFirstColumn="0" w:firstRowLastColumn="0" w:lastRowFirstColumn="0" w:lastRowLastColumn="0"/>
+            </w:pPr>
+            <w:r>
+              <w:t>Stable code</w:t>
+            </w:r>
+          </w:p>
+        </w:tc>
+      </w:tr>
+      <w:tr>
+        <w:trPr>
+          <w:jc w:val="center"/>
+        </w:trPr>
+        <w:tc>
+          <w:tcPr>
+            <w:cnfStyle w:val="001000000000" w:firstRow="0" w:lastRow="0" w:firstColumn="1" w:lastColumn="0" w:oddVBand="0" w:evenVBand="0" w:oddHBand="0" w:evenHBand="0" w:firstRowFirstColumn="0" w:firstRowLastColumn="0" w:lastRowFirstColumn="0" w:lastRowLastColumn="0"/>
+            <w:tcW w:w="0" w:type="auto"/>
+            <w:hideMark/>
+          </w:tcPr>
+          <w:p>
+            <w:pPr>
+              <w:spacing w:line="278" w:lineRule="auto"/>
+            </w:pPr>
+            <w:r>
+              <w:t>Tag</w:t>
+            </w:r>
+          </w:p>
+        </w:tc>
+        <w:tc>
+          <w:tcPr>
+            <w:tcW w:w="0" w:type="auto"/>
+            <w:hideMark/>
+          </w:tcPr>
+          <w:p>
+            <w:pPr>
+              <w:spacing w:line="278" w:lineRule="auto"/>
+              <w:cnfStyle w:val="000000000000" w:firstRow="0" w:lastRow="0" w:firstColumn="0" w:lastColumn="0" w:oddVBand="0" w:evenVBand="0" w:oddHBand="0" w:evenHBand="0" w:firstRowFirstColumn="0" w:firstRowLastColumn="0" w:lastRowFirstColumn="0" w:lastRowLastColumn="0"/>
+            </w:pPr>
+            <w:r>
+              <w:t>Version release</w:t>
+            </w:r>
+          </w:p>
+        </w:tc>
+      </w:tr>
+    </w:tbl>
+    <w:p>
+      <w:pPr>
+        <w:spacing w:after="0"/>
+      </w:pPr>
+    </w:p>
+    <w:tbl>
+      <w:tblPr>
+        <w:tblStyle w:val="PlainTable1"/>
+        <w:tblW w:w="0" w:type="auto"/>
+        <w:jc w:val="center"/>
+        <w:tblLook w:val="04A0" w:firstRow="1" w:lastRow="0" w:firstColumn="1" w:lastColumn="0" w:noHBand="0" w:noVBand="1"/>
+      </w:tblPr>
+      <w:tblGrid>
+        <w:gridCol w:w="2340"/>
+        <w:gridCol w:w="1773"/>
+      </w:tblGrid>
+      <w:tr>
+        <w:trPr>
+          <w:cnfStyle w:val="100000000000" w:firstRow="1" w:lastRow="0" w:firstColumn="0" w:lastColumn="0" w:oddVBand="0" w:evenVBand="0" w:oddHBand="0" w:evenHBand="0" w:firstRowFirstColumn="0" w:firstRowLastColumn="0" w:lastRowFirstColumn="0" w:lastRowLastColumn="0"/>
+          <w:jc w:val="center"/>
+        </w:trPr>
+        <w:tc>
+          <w:tcPr>
+            <w:cnfStyle w:val="001000000000" w:firstRow="0" w:lastRow="0" w:firstColumn="1" w:lastColumn="0" w:oddVBand="0" w:evenVBand="0" w:oddHBand="0" w:evenHBand="0" w:firstRowFirstColumn="0" w:firstRowLastColumn="0" w:lastRowFirstColumn="0" w:lastRowLastColumn="0"/>
+            <w:tcW w:w="0" w:type="auto"/>
+            <w:hideMark/>
+          </w:tcPr>
+          <w:p>
+            <w:pPr>
+              <w:spacing w:line="278" w:lineRule="auto"/>
+            </w:pPr>
+            <w:r>
+              <w:t>Command</w:t>
+            </w:r>
+          </w:p>
+        </w:tc>
+        <w:tc>
+          <w:tcPr>
+            <w:tcW w:w="0" w:type="auto"/>
+            <w:hideMark/>
+          </w:tcPr>
+          <w:p>
+            <w:pPr>
+              <w:spacing w:line="278" w:lineRule="auto"/>
+              <w:cnfStyle w:val="100000000000" w:firstRow="1" w:lastRow="0" w:firstColumn="0" w:lastColumn="0" w:oddVBand="0" w:evenVBand="0" w:oddHBand="0" w:evenHBand="0" w:firstRowFirstColumn="0" w:firstRowLastColumn="0" w:lastRowFirstColumn="0" w:lastRowLastColumn="0"/>
+            </w:pPr>
+            <w:r>
+              <w:t>Purpose</w:t>
+            </w:r>
+          </w:p>
+        </w:tc>
+      </w:tr>
+      <w:tr>
+        <w:trPr>
+          <w:cnfStyle w:val="000000100000" w:firstRow="0" w:lastRow="0" w:firstColumn="0" w:lastColumn="0" w:oddVBand="0" w:evenVBand="0" w:oddHBand="1" w:evenHBand="0" w:firstRowFirstColumn="0" w:firstRowLastColumn="0" w:lastRowFirstColumn="0" w:lastRowLastColumn="0"/>
+          <w:jc w:val="center"/>
+        </w:trPr>
+        <w:tc>
+          <w:tcPr>
+            <w:cnfStyle w:val="001000000000" w:firstRow="0" w:lastRow="0" w:firstColumn="1" w:lastColumn="0" w:oddVBand="0" w:evenVBand="0" w:oddHBand="0" w:evenHBand="0" w:firstRowFirstColumn="0" w:firstRowLastColumn="0" w:lastRowFirstColumn="0" w:lastRowLastColumn="0"/>
+            <w:tcW w:w="0" w:type="auto"/>
+            <w:hideMark/>
+          </w:tcPr>
+          <w:p>
+            <w:pPr>
+              <w:spacing w:line="278" w:lineRule="auto"/>
+            </w:pPr>
+            <w:r>
+              <w:t>git switch -c branch</w:t>
+            </w:r>
+          </w:p>
+        </w:tc>
+        <w:tc>
+          <w:tcPr>
+            <w:tcW w:w="0" w:type="auto"/>
+            <w:hideMark/>
+          </w:tcPr>
+          <w:p>
+            <w:pPr>
+              <w:spacing w:line="278" w:lineRule="auto"/>
+              <w:cnfStyle w:val="000000100000" w:firstRow="0" w:lastRow="0" w:firstColumn="0" w:lastColumn="0" w:oddVBand="0" w:evenVBand="0" w:oddHBand="1" w:evenHBand="0" w:firstRowFirstColumn="0" w:firstRowLastColumn="0" w:lastRowFirstColumn="0" w:lastRowLastColumn="0"/>
+            </w:pPr>
+            <w:r>
+              <w:t>Create branch</w:t>
+            </w:r>
+          </w:p>
+        </w:tc>
+      </w:tr>
+      <w:tr>
+        <w:trPr>
+          <w:jc w:val="center"/>
+        </w:trPr>
+        <w:tc>
+          <w:tcPr>
+            <w:cnfStyle w:val="001000000000" w:firstRow="0" w:lastRow="0" w:firstColumn="1" w:lastColumn="0" w:oddVBand="0" w:evenVBand="0" w:oddHBand="0" w:evenHBand="0" w:firstRowFirstColumn="0" w:firstRowLastColumn="0" w:lastRowFirstColumn="0" w:lastRowLastColumn="0"/>
+            <w:tcW w:w="0" w:type="auto"/>
+            <w:hideMark/>
+          </w:tcPr>
+          <w:p>
+            <w:pPr>
+              <w:spacing w:line="278" w:lineRule="auto"/>
+            </w:pPr>
+            <w:r>
+              <w:t>git commit -m</w:t>
+            </w:r>
+          </w:p>
+        </w:tc>
+        <w:tc>
+          <w:tcPr>
+            <w:tcW w:w="0" w:type="auto"/>
+            <w:hideMark/>
+          </w:tcPr>
+          <w:p>
+            <w:pPr>
+              <w:spacing w:line="278" w:lineRule="auto"/>
+              <w:cnfStyle w:val="000000000000" w:firstRow="0" w:lastRow="0" w:firstColumn="0" w:lastColumn="0" w:oddVBand="0" w:evenVBand="0" w:oddHBand="0" w:evenHBand="0" w:firstRowFirstColumn="0" w:firstRowLastColumn="0" w:lastRowFirstColumn="0" w:lastRowLastColumn="0"/>
+            </w:pPr>
+            <w:r>
+              <w:t>Save changes</w:t>
+            </w:r>
+          </w:p>
+        </w:tc>
+      </w:tr>
+      <w:tr>
+        <w:trPr>
+          <w:cnfStyle w:val="000000100000" w:firstRow="0" w:lastRow="0" w:firstColumn="0" w:lastColumn="0" w:oddVBand="0" w:evenVBand="0" w:oddHBand="1" w:evenHBand="0" w:firstRowFirstColumn="0" w:firstRowLastColumn="0" w:lastRowFirstColumn="0" w:lastRowLastColumn="0"/>
+          <w:jc w:val="center"/>
+        </w:trPr>
+        <w:tc>
+          <w:tcPr>
+            <w:cnfStyle w:val="001000000000" w:firstRow="0" w:lastRow="0" w:firstColumn="1" w:lastColumn="0" w:oddVBand="0" w:evenVBand="0" w:oddHBand="0" w:evenHBand="0" w:firstRowFirstColumn="0" w:firstRowLastColumn="0" w:lastRowFirstColumn="0" w:lastRowLastColumn="0"/>
+            <w:tcW w:w="0" w:type="auto"/>
+            <w:hideMark/>
+          </w:tcPr>
+          <w:p>
+            <w:pPr>
+              <w:spacing w:line="278" w:lineRule="auto"/>
+            </w:pPr>
+            <w:r>
+              <w:t>git merge branch</w:t>
+            </w:r>
+          </w:p>
+        </w:tc>
+        <w:tc>
+          <w:tcPr>
+            <w:tcW w:w="0" w:type="auto"/>
+            <w:hideMark/>
+          </w:tcPr>
+          <w:p>
+            <w:pPr>
+              <w:spacing w:line="278" w:lineRule="auto"/>
+              <w:cnfStyle w:val="000000100000" w:firstRow="0" w:lastRow="0" w:firstColumn="0" w:lastColumn="0" w:oddVBand="0" w:evenVBand="0" w:oddHBand="1" w:evenHBand="0" w:firstRowFirstColumn="0" w:firstRowLastColumn="0" w:lastRowFirstColumn="0" w:lastRowLastColumn="0"/>
+            </w:pPr>
+            <w:r>
+              <w:t>Merge changes</w:t>
+            </w:r>
+          </w:p>
+        </w:tc>
+      </w:tr>
+      <w:tr>
+        <w:trPr>
+          <w:jc w:val="center"/>
+        </w:trPr>
+        <w:tc>
+          <w:tcPr>
+            <w:cnfStyle w:val="001000000000" w:firstRow="0" w:lastRow="0" w:firstColumn="1" w:lastColumn="0" w:oddVBand="0" w:evenVBand="0" w:oddHBand="0" w:evenHBand="0" w:firstRowFirstColumn="0" w:firstRowLastColumn="0" w:lastRowFirstColumn="0" w:lastRowLastColumn="0"/>
+            <w:tcW w:w="0" w:type="auto"/>
+            <w:hideMark/>
+          </w:tcPr>
+          <w:p>
+            <w:pPr>
+              <w:spacing w:line="278" w:lineRule="auto"/>
+            </w:pPr>
+            <w:r>
+              <w:t xml:space="preserve">git tag </w:t>
+            </w:r>
+            <w:proofErr w:type="spellStart"/>
+            <w:r>
+              <w:t>vX.X</w:t>
+            </w:r>
+            <w:proofErr w:type="spellEnd"/>
+          </w:p>
+        </w:tc>
+        <w:tc>
+          <w:tcPr>
+            <w:tcW w:w="0" w:type="auto"/>
+            <w:hideMark/>
+          </w:tcPr>
+          <w:p>
+            <w:pPr>
+              <w:spacing w:line="278" w:lineRule="auto"/>
+              <w:cnfStyle w:val="000000000000" w:firstRow="0" w:lastRow="0" w:firstColumn="0" w:lastColumn="0" w:oddVBand="0" w:evenVBand="0" w:oddHBand="0" w:evenHBand="0" w:firstRowFirstColumn="0" w:firstRowLastColumn="0" w:lastRowFirstColumn="0" w:lastRowLastColumn="0"/>
+            </w:pPr>
+            <w:r>
+              <w:t>Create release</w:t>
+            </w:r>
+          </w:p>
+        </w:tc>
+      </w:tr>
+      <w:tr>
+        <w:trPr>
+          <w:cnfStyle w:val="000000100000" w:firstRow="0" w:lastRow="0" w:firstColumn="0" w:lastColumn="0" w:oddVBand="0" w:evenVBand="0" w:oddHBand="1" w:evenHBand="0" w:firstRowFirstColumn="0" w:firstRowLastColumn="0" w:lastRowFirstColumn="0" w:lastRowLastColumn="0"/>
+          <w:jc w:val="center"/>
+        </w:trPr>
+        <w:tc>
+          <w:tcPr>
+            <w:cnfStyle w:val="001000000000" w:firstRow="0" w:lastRow="0" w:firstColumn="1" w:lastColumn="0" w:oddVBand="0" w:evenVBand="0" w:oddHBand="0" w:evenHBand="0" w:firstRowFirstColumn="0" w:firstRowLastColumn="0" w:lastRowFirstColumn="0" w:lastRowLastColumn="0"/>
+            <w:tcW w:w="0" w:type="auto"/>
+            <w:hideMark/>
+          </w:tcPr>
+          <w:p>
+            <w:pPr>
+              <w:spacing w:line="278" w:lineRule="auto"/>
+            </w:pPr>
+            <w:r>
+              <w:t>git push origin tag</w:t>
+            </w:r>
+          </w:p>
+        </w:tc>
+        <w:tc>
+          <w:tcPr>
+            <w:tcW w:w="0" w:type="auto"/>
+            <w:hideMark/>
+          </w:tcPr>
+          <w:p>
+            <w:pPr>
+              <w:spacing w:line="278" w:lineRule="auto"/>
+              <w:cnfStyle w:val="000000100000" w:firstRow="0" w:lastRow="0" w:firstColumn="0" w:lastColumn="0" w:oddVBand="0" w:evenVBand="0" w:oddHBand="1" w:evenHBand="0" w:firstRowFirstColumn="0" w:firstRowLastColumn="0" w:lastRowFirstColumn="0" w:lastRowLastColumn="0"/>
+            </w:pPr>
+            <w:r>
+              <w:t>Push tag</w:t>
+            </w:r>
+          </w:p>
+        </w:tc>
+      </w:tr>
+    </w:tbl>
+    <w:p>
+      <w:pPr>
+        <w:pBdr>
+          <w:bottom w:val="single" w:sz="6" w:space="1" w:color="auto"/>
+        </w:pBdr>
+        <w:spacing w:after="0"/>
+      </w:pPr>
+    </w:p>
+    <w:p>
+      <w:pPr>
+        <w:spacing w:after="0"/>
+        <w:rPr>
+          <w:b/>
+          <w:bCs/>
+          <w:sz w:val="36"/>
+          <w:szCs w:val="36"/>
+        </w:rPr>
+      </w:pPr>
+      <w:r>
+        <w:rPr>
+          <w:b/>
+          <w:bCs/>
+          <w:sz w:val="36"/>
+          <w:szCs w:val="36"/>
+        </w:rPr>
+        <w:t>Day: 3</w:t>
+      </w:r>
+      <w:r>
+        <w:rPr>
+          <w:b/>
+          <w:bCs/>
+          <w:sz w:val="36"/>
+          <w:szCs w:val="36"/>
+        </w:rPr>
+        <w:t>0</w:t>
+      </w:r>
+    </w:p>
+    <w:p>
+      <w:pPr>
+        <w:spacing w:after="0"/>
+        <w:rPr>
+          <w:b/>
+          <w:bCs/>
+          <w:sz w:val="36"/>
+          <w:szCs w:val="36"/>
+        </w:rPr>
+      </w:pPr>
+    </w:p>
+    <w:p>
+      <w:pPr>
+        <w:spacing w:after="0"/>
+      </w:pPr>
+    </w:p>
+    <w:p>
+      <w:pPr>
+        <w:spacing w:after="0"/>
       </w:pPr>
     </w:p>
     <w:p>
@@ -12177,437 +13166,9 @@
     </w:lvl>
   </w:abstractNum>
   <w:abstractNum w:abstractNumId="1" w15:restartNumberingAfterBreak="0">
-    <w:nsid w:val="0D7E5618"/>
-    <w:multiLevelType w:val="hybridMultilevel"/>
-    <w:tmpl w:val="333257EE"/>
-    <w:lvl w:ilvl="0" w:tplc="04090001">
-      <w:start w:val="1"/>
-      <w:numFmt w:val="bullet"/>
-      <w:lvlText w:val=""/>
-      <w:lvlJc w:val="left"/>
-      <w:pPr>
-        <w:ind w:left="360" w:hanging="360"/>
-      </w:pPr>
-      <w:rPr>
-        <w:rFonts w:ascii="Symbol" w:hAnsi="Symbol" w:hint="default"/>
-      </w:rPr>
-    </w:lvl>
-    <w:lvl w:ilvl="1" w:tplc="04090003" w:tentative="1">
-      <w:start w:val="1"/>
-      <w:numFmt w:val="bullet"/>
-      <w:lvlText w:val="o"/>
-      <w:lvlJc w:val="left"/>
-      <w:pPr>
-        <w:ind w:left="1080" w:hanging="360"/>
-      </w:pPr>
-      <w:rPr>
-        <w:rFonts w:ascii="Courier New" w:hAnsi="Courier New" w:cs="Courier New" w:hint="default"/>
-      </w:rPr>
-    </w:lvl>
-    <w:lvl w:ilvl="2" w:tplc="04090005" w:tentative="1">
-      <w:start w:val="1"/>
-      <w:numFmt w:val="bullet"/>
-      <w:lvlText w:val=""/>
-      <w:lvlJc w:val="left"/>
-      <w:pPr>
-        <w:ind w:left="1800" w:hanging="360"/>
-      </w:pPr>
-      <w:rPr>
-        <w:rFonts w:ascii="Wingdings" w:hAnsi="Wingdings" w:hint="default"/>
-      </w:rPr>
-    </w:lvl>
-    <w:lvl w:ilvl="3" w:tplc="04090001" w:tentative="1">
-      <w:start w:val="1"/>
-      <w:numFmt w:val="bullet"/>
-      <w:lvlText w:val=""/>
-      <w:lvlJc w:val="left"/>
-      <w:pPr>
-        <w:ind w:left="2520" w:hanging="360"/>
-      </w:pPr>
-      <w:rPr>
-        <w:rFonts w:ascii="Symbol" w:hAnsi="Symbol" w:hint="default"/>
-      </w:rPr>
-    </w:lvl>
-    <w:lvl w:ilvl="4" w:tplc="04090003" w:tentative="1">
-      <w:start w:val="1"/>
-      <w:numFmt w:val="bullet"/>
-      <w:lvlText w:val="o"/>
-      <w:lvlJc w:val="left"/>
-      <w:pPr>
-        <w:ind w:left="3240" w:hanging="360"/>
-      </w:pPr>
-      <w:rPr>
-        <w:rFonts w:ascii="Courier New" w:hAnsi="Courier New" w:cs="Courier New" w:hint="default"/>
-      </w:rPr>
-    </w:lvl>
-    <w:lvl w:ilvl="5" w:tplc="04090005" w:tentative="1">
-      <w:start w:val="1"/>
-      <w:numFmt w:val="bullet"/>
-      <w:lvlText w:val=""/>
-      <w:lvlJc w:val="left"/>
-      <w:pPr>
-        <w:ind w:left="3960" w:hanging="360"/>
-      </w:pPr>
-      <w:rPr>
-        <w:rFonts w:ascii="Wingdings" w:hAnsi="Wingdings" w:hint="default"/>
-      </w:rPr>
-    </w:lvl>
-    <w:lvl w:ilvl="6" w:tplc="04090001" w:tentative="1">
-      <w:start w:val="1"/>
-      <w:numFmt w:val="bullet"/>
-      <w:lvlText w:val=""/>
-      <w:lvlJc w:val="left"/>
-      <w:pPr>
-        <w:ind w:left="4680" w:hanging="360"/>
-      </w:pPr>
-      <w:rPr>
-        <w:rFonts w:ascii="Symbol" w:hAnsi="Symbol" w:hint="default"/>
-      </w:rPr>
-    </w:lvl>
-    <w:lvl w:ilvl="7" w:tplc="04090003" w:tentative="1">
-      <w:start w:val="1"/>
-      <w:numFmt w:val="bullet"/>
-      <w:lvlText w:val="o"/>
-      <w:lvlJc w:val="left"/>
-      <w:pPr>
-        <w:ind w:left="5400" w:hanging="360"/>
-      </w:pPr>
-      <w:rPr>
-        <w:rFonts w:ascii="Courier New" w:hAnsi="Courier New" w:cs="Courier New" w:hint="default"/>
-      </w:rPr>
-    </w:lvl>
-    <w:lvl w:ilvl="8" w:tplc="04090005" w:tentative="1">
-      <w:start w:val="1"/>
-      <w:numFmt w:val="bullet"/>
-      <w:lvlText w:val=""/>
-      <w:lvlJc w:val="left"/>
-      <w:pPr>
-        <w:ind w:left="6120" w:hanging="360"/>
-      </w:pPr>
-      <w:rPr>
-        <w:rFonts w:ascii="Wingdings" w:hAnsi="Wingdings" w:hint="default"/>
-      </w:rPr>
-    </w:lvl>
-  </w:abstractNum>
-  <w:abstractNum w:abstractNumId="2" w15:restartNumberingAfterBreak="0">
-    <w:nsid w:val="1DB608F8"/>
-    <w:multiLevelType w:val="hybridMultilevel"/>
-    <w:tmpl w:val="7940F788"/>
-    <w:lvl w:ilvl="0" w:tplc="04090001">
-      <w:start w:val="1"/>
-      <w:numFmt w:val="bullet"/>
-      <w:lvlText w:val=""/>
-      <w:lvlJc w:val="left"/>
-      <w:pPr>
-        <w:ind w:left="360" w:hanging="360"/>
-      </w:pPr>
-      <w:rPr>
-        <w:rFonts w:ascii="Symbol" w:hAnsi="Symbol" w:hint="default"/>
-      </w:rPr>
-    </w:lvl>
-    <w:lvl w:ilvl="1" w:tplc="04090003" w:tentative="1">
-      <w:start w:val="1"/>
-      <w:numFmt w:val="bullet"/>
-      <w:lvlText w:val="o"/>
-      <w:lvlJc w:val="left"/>
-      <w:pPr>
-        <w:ind w:left="1080" w:hanging="360"/>
-      </w:pPr>
-      <w:rPr>
-        <w:rFonts w:ascii="Courier New" w:hAnsi="Courier New" w:cs="Courier New" w:hint="default"/>
-      </w:rPr>
-    </w:lvl>
-    <w:lvl w:ilvl="2" w:tplc="04090005" w:tentative="1">
-      <w:start w:val="1"/>
-      <w:numFmt w:val="bullet"/>
-      <w:lvlText w:val=""/>
-      <w:lvlJc w:val="left"/>
-      <w:pPr>
-        <w:ind w:left="1800" w:hanging="360"/>
-      </w:pPr>
-      <w:rPr>
-        <w:rFonts w:ascii="Wingdings" w:hAnsi="Wingdings" w:hint="default"/>
-      </w:rPr>
-    </w:lvl>
-    <w:lvl w:ilvl="3" w:tplc="04090001" w:tentative="1">
-      <w:start w:val="1"/>
-      <w:numFmt w:val="bullet"/>
-      <w:lvlText w:val=""/>
-      <w:lvlJc w:val="left"/>
-      <w:pPr>
-        <w:ind w:left="2520" w:hanging="360"/>
-      </w:pPr>
-      <w:rPr>
-        <w:rFonts w:ascii="Symbol" w:hAnsi="Symbol" w:hint="default"/>
-      </w:rPr>
-    </w:lvl>
-    <w:lvl w:ilvl="4" w:tplc="04090003" w:tentative="1">
-      <w:start w:val="1"/>
-      <w:numFmt w:val="bullet"/>
-      <w:lvlText w:val="o"/>
-      <w:lvlJc w:val="left"/>
-      <w:pPr>
-        <w:ind w:left="3240" w:hanging="360"/>
-      </w:pPr>
-      <w:rPr>
-        <w:rFonts w:ascii="Courier New" w:hAnsi="Courier New" w:cs="Courier New" w:hint="default"/>
-      </w:rPr>
-    </w:lvl>
-    <w:lvl w:ilvl="5" w:tplc="04090005" w:tentative="1">
-      <w:start w:val="1"/>
-      <w:numFmt w:val="bullet"/>
-      <w:lvlText w:val=""/>
-      <w:lvlJc w:val="left"/>
-      <w:pPr>
-        <w:ind w:left="3960" w:hanging="360"/>
-      </w:pPr>
-      <w:rPr>
-        <w:rFonts w:ascii="Wingdings" w:hAnsi="Wingdings" w:hint="default"/>
-      </w:rPr>
-    </w:lvl>
-    <w:lvl w:ilvl="6" w:tplc="04090001" w:tentative="1">
-      <w:start w:val="1"/>
-      <w:numFmt w:val="bullet"/>
-      <w:lvlText w:val=""/>
-      <w:lvlJc w:val="left"/>
-      <w:pPr>
-        <w:ind w:left="4680" w:hanging="360"/>
-      </w:pPr>
-      <w:rPr>
-        <w:rFonts w:ascii="Symbol" w:hAnsi="Symbol" w:hint="default"/>
-      </w:rPr>
-    </w:lvl>
-    <w:lvl w:ilvl="7" w:tplc="04090003" w:tentative="1">
-      <w:start w:val="1"/>
-      <w:numFmt w:val="bullet"/>
-      <w:lvlText w:val="o"/>
-      <w:lvlJc w:val="left"/>
-      <w:pPr>
-        <w:ind w:left="5400" w:hanging="360"/>
-      </w:pPr>
-      <w:rPr>
-        <w:rFonts w:ascii="Courier New" w:hAnsi="Courier New" w:cs="Courier New" w:hint="default"/>
-      </w:rPr>
-    </w:lvl>
-    <w:lvl w:ilvl="8" w:tplc="04090005" w:tentative="1">
-      <w:start w:val="1"/>
-      <w:numFmt w:val="bullet"/>
-      <w:lvlText w:val=""/>
-      <w:lvlJc w:val="left"/>
-      <w:pPr>
-        <w:ind w:left="6120" w:hanging="360"/>
-      </w:pPr>
-      <w:rPr>
-        <w:rFonts w:ascii="Wingdings" w:hAnsi="Wingdings" w:hint="default"/>
-      </w:rPr>
-    </w:lvl>
-  </w:abstractNum>
-  <w:abstractNum w:abstractNumId="3" w15:restartNumberingAfterBreak="0">
-    <w:nsid w:val="25612CB6"/>
-    <w:multiLevelType w:val="hybridMultilevel"/>
-    <w:tmpl w:val="1B1ED028"/>
-    <w:lvl w:ilvl="0" w:tplc="04090001">
-      <w:start w:val="1"/>
-      <w:numFmt w:val="bullet"/>
-      <w:lvlText w:val=""/>
-      <w:lvlJc w:val="left"/>
-      <w:pPr>
-        <w:ind w:left="360" w:hanging="360"/>
-      </w:pPr>
-      <w:rPr>
-        <w:rFonts w:ascii="Symbol" w:hAnsi="Symbol" w:hint="default"/>
-      </w:rPr>
-    </w:lvl>
-    <w:lvl w:ilvl="1" w:tplc="04090003" w:tentative="1">
-      <w:start w:val="1"/>
-      <w:numFmt w:val="bullet"/>
-      <w:lvlText w:val="o"/>
-      <w:lvlJc w:val="left"/>
-      <w:pPr>
-        <w:ind w:left="1080" w:hanging="360"/>
-      </w:pPr>
-      <w:rPr>
-        <w:rFonts w:ascii="Courier New" w:hAnsi="Courier New" w:cs="Courier New" w:hint="default"/>
-      </w:rPr>
-    </w:lvl>
-    <w:lvl w:ilvl="2" w:tplc="04090005" w:tentative="1">
-      <w:start w:val="1"/>
-      <w:numFmt w:val="bullet"/>
-      <w:lvlText w:val=""/>
-      <w:lvlJc w:val="left"/>
-      <w:pPr>
-        <w:ind w:left="1800" w:hanging="360"/>
-      </w:pPr>
-      <w:rPr>
-        <w:rFonts w:ascii="Wingdings" w:hAnsi="Wingdings" w:hint="default"/>
-      </w:rPr>
-    </w:lvl>
-    <w:lvl w:ilvl="3" w:tplc="04090001" w:tentative="1">
-      <w:start w:val="1"/>
-      <w:numFmt w:val="bullet"/>
-      <w:lvlText w:val=""/>
-      <w:lvlJc w:val="left"/>
-      <w:pPr>
-        <w:ind w:left="2520" w:hanging="360"/>
-      </w:pPr>
-      <w:rPr>
-        <w:rFonts w:ascii="Symbol" w:hAnsi="Symbol" w:hint="default"/>
-      </w:rPr>
-    </w:lvl>
-    <w:lvl w:ilvl="4" w:tplc="04090003" w:tentative="1">
-      <w:start w:val="1"/>
-      <w:numFmt w:val="bullet"/>
-      <w:lvlText w:val="o"/>
-      <w:lvlJc w:val="left"/>
-      <w:pPr>
-        <w:ind w:left="3240" w:hanging="360"/>
-      </w:pPr>
-      <w:rPr>
-        <w:rFonts w:ascii="Courier New" w:hAnsi="Courier New" w:cs="Courier New" w:hint="default"/>
-      </w:rPr>
-    </w:lvl>
-    <w:lvl w:ilvl="5" w:tplc="04090005" w:tentative="1">
-      <w:start w:val="1"/>
-      <w:numFmt w:val="bullet"/>
-      <w:lvlText w:val=""/>
-      <w:lvlJc w:val="left"/>
-      <w:pPr>
-        <w:ind w:left="3960" w:hanging="360"/>
-      </w:pPr>
-      <w:rPr>
-        <w:rFonts w:ascii="Wingdings" w:hAnsi="Wingdings" w:hint="default"/>
-      </w:rPr>
-    </w:lvl>
-    <w:lvl w:ilvl="6" w:tplc="04090001" w:tentative="1">
-      <w:start w:val="1"/>
-      <w:numFmt w:val="bullet"/>
-      <w:lvlText w:val=""/>
-      <w:lvlJc w:val="left"/>
-      <w:pPr>
-        <w:ind w:left="4680" w:hanging="360"/>
-      </w:pPr>
-      <w:rPr>
-        <w:rFonts w:ascii="Symbol" w:hAnsi="Symbol" w:hint="default"/>
-      </w:rPr>
-    </w:lvl>
-    <w:lvl w:ilvl="7" w:tplc="04090003" w:tentative="1">
-      <w:start w:val="1"/>
-      <w:numFmt w:val="bullet"/>
-      <w:lvlText w:val="o"/>
-      <w:lvlJc w:val="left"/>
-      <w:pPr>
-        <w:ind w:left="5400" w:hanging="360"/>
-      </w:pPr>
-      <w:rPr>
-        <w:rFonts w:ascii="Courier New" w:hAnsi="Courier New" w:cs="Courier New" w:hint="default"/>
-      </w:rPr>
-    </w:lvl>
-    <w:lvl w:ilvl="8" w:tplc="04090005" w:tentative="1">
-      <w:start w:val="1"/>
-      <w:numFmt w:val="bullet"/>
-      <w:lvlText w:val=""/>
-      <w:lvlJc w:val="left"/>
-      <w:pPr>
-        <w:ind w:left="6120" w:hanging="360"/>
-      </w:pPr>
-      <w:rPr>
-        <w:rFonts w:ascii="Wingdings" w:hAnsi="Wingdings" w:hint="default"/>
-      </w:rPr>
-    </w:lvl>
-  </w:abstractNum>
-  <w:abstractNum w:abstractNumId="4" w15:restartNumberingAfterBreak="0">
-    <w:nsid w:val="277C739F"/>
-    <w:multiLevelType w:val="hybridMultilevel"/>
-    <w:tmpl w:val="700AC8B6"/>
-    <w:lvl w:ilvl="0" w:tplc="0409000F">
-      <w:start w:val="1"/>
-      <w:numFmt w:val="decimal"/>
-      <w:lvlText w:val="%1."/>
-      <w:lvlJc w:val="left"/>
-      <w:pPr>
-        <w:ind w:left="360" w:hanging="360"/>
-      </w:pPr>
-      <w:rPr>
-        <w:rFonts w:hint="default"/>
-      </w:rPr>
-    </w:lvl>
-    <w:lvl w:ilvl="1" w:tplc="04090019" w:tentative="1">
-      <w:start w:val="1"/>
-      <w:numFmt w:val="lowerLetter"/>
-      <w:lvlText w:val="%2."/>
-      <w:lvlJc w:val="left"/>
-      <w:pPr>
-        <w:ind w:left="1080" w:hanging="360"/>
-      </w:pPr>
-    </w:lvl>
-    <w:lvl w:ilvl="2" w:tplc="0409001B" w:tentative="1">
-      <w:start w:val="1"/>
-      <w:numFmt w:val="lowerRoman"/>
-      <w:lvlText w:val="%3."/>
-      <w:lvlJc w:val="right"/>
-      <w:pPr>
-        <w:ind w:left="1800" w:hanging="180"/>
-      </w:pPr>
-    </w:lvl>
-    <w:lvl w:ilvl="3" w:tplc="0409000F" w:tentative="1">
-      <w:start w:val="1"/>
-      <w:numFmt w:val="decimal"/>
-      <w:lvlText w:val="%4."/>
-      <w:lvlJc w:val="left"/>
-      <w:pPr>
-        <w:ind w:left="2520" w:hanging="360"/>
-      </w:pPr>
-    </w:lvl>
-    <w:lvl w:ilvl="4" w:tplc="04090019" w:tentative="1">
-      <w:start w:val="1"/>
-      <w:numFmt w:val="lowerLetter"/>
-      <w:lvlText w:val="%5."/>
-      <w:lvlJc w:val="left"/>
-      <w:pPr>
-        <w:ind w:left="3240" w:hanging="360"/>
-      </w:pPr>
-    </w:lvl>
-    <w:lvl w:ilvl="5" w:tplc="0409001B" w:tentative="1">
-      <w:start w:val="1"/>
-      <w:numFmt w:val="lowerRoman"/>
-      <w:lvlText w:val="%6."/>
-      <w:lvlJc w:val="right"/>
-      <w:pPr>
-        <w:ind w:left="3960" w:hanging="180"/>
-      </w:pPr>
-    </w:lvl>
-    <w:lvl w:ilvl="6" w:tplc="0409000F" w:tentative="1">
-      <w:start w:val="1"/>
-      <w:numFmt w:val="decimal"/>
-      <w:lvlText w:val="%7."/>
-      <w:lvlJc w:val="left"/>
-      <w:pPr>
-        <w:ind w:left="4680" w:hanging="360"/>
-      </w:pPr>
-    </w:lvl>
-    <w:lvl w:ilvl="7" w:tplc="04090019" w:tentative="1">
-      <w:start w:val="1"/>
-      <w:numFmt w:val="lowerLetter"/>
-      <w:lvlText w:val="%8."/>
-      <w:lvlJc w:val="left"/>
-      <w:pPr>
-        <w:ind w:left="5400" w:hanging="360"/>
-      </w:pPr>
-    </w:lvl>
-    <w:lvl w:ilvl="8" w:tplc="0409001B" w:tentative="1">
-      <w:start w:val="1"/>
-      <w:numFmt w:val="lowerRoman"/>
-      <w:lvlText w:val="%9."/>
-      <w:lvlJc w:val="right"/>
-      <w:pPr>
-        <w:ind w:left="6120" w:hanging="180"/>
-      </w:pPr>
-    </w:lvl>
-  </w:abstractNum>
-  <w:abstractNum w:abstractNumId="5" w15:restartNumberingAfterBreak="0">
-    <w:nsid w:val="33DD739A"/>
+    <w:nsid w:val="0A726BA6"/>
     <w:multiLevelType w:val="multilevel"/>
-    <w:tmpl w:val="6E681F36"/>
+    <w:tmpl w:val="207C83D2"/>
     <w:lvl w:ilvl="0">
       <w:start w:val="1"/>
       <w:numFmt w:val="bullet"/>
@@ -12753,10 +13314,438 @@
       </w:rPr>
     </w:lvl>
   </w:abstractNum>
+  <w:abstractNum w:abstractNumId="2" w15:restartNumberingAfterBreak="0">
+    <w:nsid w:val="0D7E5618"/>
+    <w:multiLevelType w:val="hybridMultilevel"/>
+    <w:tmpl w:val="333257EE"/>
+    <w:lvl w:ilvl="0" w:tplc="04090001">
+      <w:start w:val="1"/>
+      <w:numFmt w:val="bullet"/>
+      <w:lvlText w:val=""/>
+      <w:lvlJc w:val="left"/>
+      <w:pPr>
+        <w:ind w:left="360" w:hanging="360"/>
+      </w:pPr>
+      <w:rPr>
+        <w:rFonts w:ascii="Symbol" w:hAnsi="Symbol" w:hint="default"/>
+      </w:rPr>
+    </w:lvl>
+    <w:lvl w:ilvl="1" w:tplc="04090003" w:tentative="1">
+      <w:start w:val="1"/>
+      <w:numFmt w:val="bullet"/>
+      <w:lvlText w:val="o"/>
+      <w:lvlJc w:val="left"/>
+      <w:pPr>
+        <w:ind w:left="1080" w:hanging="360"/>
+      </w:pPr>
+      <w:rPr>
+        <w:rFonts w:ascii="Courier New" w:hAnsi="Courier New" w:cs="Courier New" w:hint="default"/>
+      </w:rPr>
+    </w:lvl>
+    <w:lvl w:ilvl="2" w:tplc="04090005" w:tentative="1">
+      <w:start w:val="1"/>
+      <w:numFmt w:val="bullet"/>
+      <w:lvlText w:val=""/>
+      <w:lvlJc w:val="left"/>
+      <w:pPr>
+        <w:ind w:left="1800" w:hanging="360"/>
+      </w:pPr>
+      <w:rPr>
+        <w:rFonts w:ascii="Wingdings" w:hAnsi="Wingdings" w:hint="default"/>
+      </w:rPr>
+    </w:lvl>
+    <w:lvl w:ilvl="3" w:tplc="04090001" w:tentative="1">
+      <w:start w:val="1"/>
+      <w:numFmt w:val="bullet"/>
+      <w:lvlText w:val=""/>
+      <w:lvlJc w:val="left"/>
+      <w:pPr>
+        <w:ind w:left="2520" w:hanging="360"/>
+      </w:pPr>
+      <w:rPr>
+        <w:rFonts w:ascii="Symbol" w:hAnsi="Symbol" w:hint="default"/>
+      </w:rPr>
+    </w:lvl>
+    <w:lvl w:ilvl="4" w:tplc="04090003" w:tentative="1">
+      <w:start w:val="1"/>
+      <w:numFmt w:val="bullet"/>
+      <w:lvlText w:val="o"/>
+      <w:lvlJc w:val="left"/>
+      <w:pPr>
+        <w:ind w:left="3240" w:hanging="360"/>
+      </w:pPr>
+      <w:rPr>
+        <w:rFonts w:ascii="Courier New" w:hAnsi="Courier New" w:cs="Courier New" w:hint="default"/>
+      </w:rPr>
+    </w:lvl>
+    <w:lvl w:ilvl="5" w:tplc="04090005" w:tentative="1">
+      <w:start w:val="1"/>
+      <w:numFmt w:val="bullet"/>
+      <w:lvlText w:val=""/>
+      <w:lvlJc w:val="left"/>
+      <w:pPr>
+        <w:ind w:left="3960" w:hanging="360"/>
+      </w:pPr>
+      <w:rPr>
+        <w:rFonts w:ascii="Wingdings" w:hAnsi="Wingdings" w:hint="default"/>
+      </w:rPr>
+    </w:lvl>
+    <w:lvl w:ilvl="6" w:tplc="04090001" w:tentative="1">
+      <w:start w:val="1"/>
+      <w:numFmt w:val="bullet"/>
+      <w:lvlText w:val=""/>
+      <w:lvlJc w:val="left"/>
+      <w:pPr>
+        <w:ind w:left="4680" w:hanging="360"/>
+      </w:pPr>
+      <w:rPr>
+        <w:rFonts w:ascii="Symbol" w:hAnsi="Symbol" w:hint="default"/>
+      </w:rPr>
+    </w:lvl>
+    <w:lvl w:ilvl="7" w:tplc="04090003" w:tentative="1">
+      <w:start w:val="1"/>
+      <w:numFmt w:val="bullet"/>
+      <w:lvlText w:val="o"/>
+      <w:lvlJc w:val="left"/>
+      <w:pPr>
+        <w:ind w:left="5400" w:hanging="360"/>
+      </w:pPr>
+      <w:rPr>
+        <w:rFonts w:ascii="Courier New" w:hAnsi="Courier New" w:cs="Courier New" w:hint="default"/>
+      </w:rPr>
+    </w:lvl>
+    <w:lvl w:ilvl="8" w:tplc="04090005" w:tentative="1">
+      <w:start w:val="1"/>
+      <w:numFmt w:val="bullet"/>
+      <w:lvlText w:val=""/>
+      <w:lvlJc w:val="left"/>
+      <w:pPr>
+        <w:ind w:left="6120" w:hanging="360"/>
+      </w:pPr>
+      <w:rPr>
+        <w:rFonts w:ascii="Wingdings" w:hAnsi="Wingdings" w:hint="default"/>
+      </w:rPr>
+    </w:lvl>
+  </w:abstractNum>
+  <w:abstractNum w:abstractNumId="3" w15:restartNumberingAfterBreak="0">
+    <w:nsid w:val="1DB608F8"/>
+    <w:multiLevelType w:val="hybridMultilevel"/>
+    <w:tmpl w:val="7940F788"/>
+    <w:lvl w:ilvl="0" w:tplc="04090001">
+      <w:start w:val="1"/>
+      <w:numFmt w:val="bullet"/>
+      <w:lvlText w:val=""/>
+      <w:lvlJc w:val="left"/>
+      <w:pPr>
+        <w:ind w:left="360" w:hanging="360"/>
+      </w:pPr>
+      <w:rPr>
+        <w:rFonts w:ascii="Symbol" w:hAnsi="Symbol" w:hint="default"/>
+      </w:rPr>
+    </w:lvl>
+    <w:lvl w:ilvl="1" w:tplc="04090003" w:tentative="1">
+      <w:start w:val="1"/>
+      <w:numFmt w:val="bullet"/>
+      <w:lvlText w:val="o"/>
+      <w:lvlJc w:val="left"/>
+      <w:pPr>
+        <w:ind w:left="1080" w:hanging="360"/>
+      </w:pPr>
+      <w:rPr>
+        <w:rFonts w:ascii="Courier New" w:hAnsi="Courier New" w:cs="Courier New" w:hint="default"/>
+      </w:rPr>
+    </w:lvl>
+    <w:lvl w:ilvl="2" w:tplc="04090005" w:tentative="1">
+      <w:start w:val="1"/>
+      <w:numFmt w:val="bullet"/>
+      <w:lvlText w:val=""/>
+      <w:lvlJc w:val="left"/>
+      <w:pPr>
+        <w:ind w:left="1800" w:hanging="360"/>
+      </w:pPr>
+      <w:rPr>
+        <w:rFonts w:ascii="Wingdings" w:hAnsi="Wingdings" w:hint="default"/>
+      </w:rPr>
+    </w:lvl>
+    <w:lvl w:ilvl="3" w:tplc="04090001" w:tentative="1">
+      <w:start w:val="1"/>
+      <w:numFmt w:val="bullet"/>
+      <w:lvlText w:val=""/>
+      <w:lvlJc w:val="left"/>
+      <w:pPr>
+        <w:ind w:left="2520" w:hanging="360"/>
+      </w:pPr>
+      <w:rPr>
+        <w:rFonts w:ascii="Symbol" w:hAnsi="Symbol" w:hint="default"/>
+      </w:rPr>
+    </w:lvl>
+    <w:lvl w:ilvl="4" w:tplc="04090003" w:tentative="1">
+      <w:start w:val="1"/>
+      <w:numFmt w:val="bullet"/>
+      <w:lvlText w:val="o"/>
+      <w:lvlJc w:val="left"/>
+      <w:pPr>
+        <w:ind w:left="3240" w:hanging="360"/>
+      </w:pPr>
+      <w:rPr>
+        <w:rFonts w:ascii="Courier New" w:hAnsi="Courier New" w:cs="Courier New" w:hint="default"/>
+      </w:rPr>
+    </w:lvl>
+    <w:lvl w:ilvl="5" w:tplc="04090005" w:tentative="1">
+      <w:start w:val="1"/>
+      <w:numFmt w:val="bullet"/>
+      <w:lvlText w:val=""/>
+      <w:lvlJc w:val="left"/>
+      <w:pPr>
+        <w:ind w:left="3960" w:hanging="360"/>
+      </w:pPr>
+      <w:rPr>
+        <w:rFonts w:ascii="Wingdings" w:hAnsi="Wingdings" w:hint="default"/>
+      </w:rPr>
+    </w:lvl>
+    <w:lvl w:ilvl="6" w:tplc="04090001" w:tentative="1">
+      <w:start w:val="1"/>
+      <w:numFmt w:val="bullet"/>
+      <w:lvlText w:val=""/>
+      <w:lvlJc w:val="left"/>
+      <w:pPr>
+        <w:ind w:left="4680" w:hanging="360"/>
+      </w:pPr>
+      <w:rPr>
+        <w:rFonts w:ascii="Symbol" w:hAnsi="Symbol" w:hint="default"/>
+      </w:rPr>
+    </w:lvl>
+    <w:lvl w:ilvl="7" w:tplc="04090003" w:tentative="1">
+      <w:start w:val="1"/>
+      <w:numFmt w:val="bullet"/>
+      <w:lvlText w:val="o"/>
+      <w:lvlJc w:val="left"/>
+      <w:pPr>
+        <w:ind w:left="5400" w:hanging="360"/>
+      </w:pPr>
+      <w:rPr>
+        <w:rFonts w:ascii="Courier New" w:hAnsi="Courier New" w:cs="Courier New" w:hint="default"/>
+      </w:rPr>
+    </w:lvl>
+    <w:lvl w:ilvl="8" w:tplc="04090005" w:tentative="1">
+      <w:start w:val="1"/>
+      <w:numFmt w:val="bullet"/>
+      <w:lvlText w:val=""/>
+      <w:lvlJc w:val="left"/>
+      <w:pPr>
+        <w:ind w:left="6120" w:hanging="360"/>
+      </w:pPr>
+      <w:rPr>
+        <w:rFonts w:ascii="Wingdings" w:hAnsi="Wingdings" w:hint="default"/>
+      </w:rPr>
+    </w:lvl>
+  </w:abstractNum>
+  <w:abstractNum w:abstractNumId="4" w15:restartNumberingAfterBreak="0">
+    <w:nsid w:val="25612CB6"/>
+    <w:multiLevelType w:val="hybridMultilevel"/>
+    <w:tmpl w:val="1B1ED028"/>
+    <w:lvl w:ilvl="0" w:tplc="04090001">
+      <w:start w:val="1"/>
+      <w:numFmt w:val="bullet"/>
+      <w:lvlText w:val=""/>
+      <w:lvlJc w:val="left"/>
+      <w:pPr>
+        <w:ind w:left="360" w:hanging="360"/>
+      </w:pPr>
+      <w:rPr>
+        <w:rFonts w:ascii="Symbol" w:hAnsi="Symbol" w:hint="default"/>
+      </w:rPr>
+    </w:lvl>
+    <w:lvl w:ilvl="1" w:tplc="04090003" w:tentative="1">
+      <w:start w:val="1"/>
+      <w:numFmt w:val="bullet"/>
+      <w:lvlText w:val="o"/>
+      <w:lvlJc w:val="left"/>
+      <w:pPr>
+        <w:ind w:left="1080" w:hanging="360"/>
+      </w:pPr>
+      <w:rPr>
+        <w:rFonts w:ascii="Courier New" w:hAnsi="Courier New" w:cs="Courier New" w:hint="default"/>
+      </w:rPr>
+    </w:lvl>
+    <w:lvl w:ilvl="2" w:tplc="04090005" w:tentative="1">
+      <w:start w:val="1"/>
+      <w:numFmt w:val="bullet"/>
+      <w:lvlText w:val=""/>
+      <w:lvlJc w:val="left"/>
+      <w:pPr>
+        <w:ind w:left="1800" w:hanging="360"/>
+      </w:pPr>
+      <w:rPr>
+        <w:rFonts w:ascii="Wingdings" w:hAnsi="Wingdings" w:hint="default"/>
+      </w:rPr>
+    </w:lvl>
+    <w:lvl w:ilvl="3" w:tplc="04090001" w:tentative="1">
+      <w:start w:val="1"/>
+      <w:numFmt w:val="bullet"/>
+      <w:lvlText w:val=""/>
+      <w:lvlJc w:val="left"/>
+      <w:pPr>
+        <w:ind w:left="2520" w:hanging="360"/>
+      </w:pPr>
+      <w:rPr>
+        <w:rFonts w:ascii="Symbol" w:hAnsi="Symbol" w:hint="default"/>
+      </w:rPr>
+    </w:lvl>
+    <w:lvl w:ilvl="4" w:tplc="04090003" w:tentative="1">
+      <w:start w:val="1"/>
+      <w:numFmt w:val="bullet"/>
+      <w:lvlText w:val="o"/>
+      <w:lvlJc w:val="left"/>
+      <w:pPr>
+        <w:ind w:left="3240" w:hanging="360"/>
+      </w:pPr>
+      <w:rPr>
+        <w:rFonts w:ascii="Courier New" w:hAnsi="Courier New" w:cs="Courier New" w:hint="default"/>
+      </w:rPr>
+    </w:lvl>
+    <w:lvl w:ilvl="5" w:tplc="04090005" w:tentative="1">
+      <w:start w:val="1"/>
+      <w:numFmt w:val="bullet"/>
+      <w:lvlText w:val=""/>
+      <w:lvlJc w:val="left"/>
+      <w:pPr>
+        <w:ind w:left="3960" w:hanging="360"/>
+      </w:pPr>
+      <w:rPr>
+        <w:rFonts w:ascii="Wingdings" w:hAnsi="Wingdings" w:hint="default"/>
+      </w:rPr>
+    </w:lvl>
+    <w:lvl w:ilvl="6" w:tplc="04090001" w:tentative="1">
+      <w:start w:val="1"/>
+      <w:numFmt w:val="bullet"/>
+      <w:lvlText w:val=""/>
+      <w:lvlJc w:val="left"/>
+      <w:pPr>
+        <w:ind w:left="4680" w:hanging="360"/>
+      </w:pPr>
+      <w:rPr>
+        <w:rFonts w:ascii="Symbol" w:hAnsi="Symbol" w:hint="default"/>
+      </w:rPr>
+    </w:lvl>
+    <w:lvl w:ilvl="7" w:tplc="04090003" w:tentative="1">
+      <w:start w:val="1"/>
+      <w:numFmt w:val="bullet"/>
+      <w:lvlText w:val="o"/>
+      <w:lvlJc w:val="left"/>
+      <w:pPr>
+        <w:ind w:left="5400" w:hanging="360"/>
+      </w:pPr>
+      <w:rPr>
+        <w:rFonts w:ascii="Courier New" w:hAnsi="Courier New" w:cs="Courier New" w:hint="default"/>
+      </w:rPr>
+    </w:lvl>
+    <w:lvl w:ilvl="8" w:tplc="04090005" w:tentative="1">
+      <w:start w:val="1"/>
+      <w:numFmt w:val="bullet"/>
+      <w:lvlText w:val=""/>
+      <w:lvlJc w:val="left"/>
+      <w:pPr>
+        <w:ind w:left="6120" w:hanging="360"/>
+      </w:pPr>
+      <w:rPr>
+        <w:rFonts w:ascii="Wingdings" w:hAnsi="Wingdings" w:hint="default"/>
+      </w:rPr>
+    </w:lvl>
+  </w:abstractNum>
+  <w:abstractNum w:abstractNumId="5" w15:restartNumberingAfterBreak="0">
+    <w:nsid w:val="277C739F"/>
+    <w:multiLevelType w:val="hybridMultilevel"/>
+    <w:tmpl w:val="700AC8B6"/>
+    <w:lvl w:ilvl="0" w:tplc="0409000F">
+      <w:start w:val="1"/>
+      <w:numFmt w:val="decimal"/>
+      <w:lvlText w:val="%1."/>
+      <w:lvlJc w:val="left"/>
+      <w:pPr>
+        <w:ind w:left="360" w:hanging="360"/>
+      </w:pPr>
+      <w:rPr>
+        <w:rFonts w:hint="default"/>
+      </w:rPr>
+    </w:lvl>
+    <w:lvl w:ilvl="1" w:tplc="04090019" w:tentative="1">
+      <w:start w:val="1"/>
+      <w:numFmt w:val="lowerLetter"/>
+      <w:lvlText w:val="%2."/>
+      <w:lvlJc w:val="left"/>
+      <w:pPr>
+        <w:ind w:left="1080" w:hanging="360"/>
+      </w:pPr>
+    </w:lvl>
+    <w:lvl w:ilvl="2" w:tplc="0409001B" w:tentative="1">
+      <w:start w:val="1"/>
+      <w:numFmt w:val="lowerRoman"/>
+      <w:lvlText w:val="%3."/>
+      <w:lvlJc w:val="right"/>
+      <w:pPr>
+        <w:ind w:left="1800" w:hanging="180"/>
+      </w:pPr>
+    </w:lvl>
+    <w:lvl w:ilvl="3" w:tplc="0409000F" w:tentative="1">
+      <w:start w:val="1"/>
+      <w:numFmt w:val="decimal"/>
+      <w:lvlText w:val="%4."/>
+      <w:lvlJc w:val="left"/>
+      <w:pPr>
+        <w:ind w:left="2520" w:hanging="360"/>
+      </w:pPr>
+    </w:lvl>
+    <w:lvl w:ilvl="4" w:tplc="04090019" w:tentative="1">
+      <w:start w:val="1"/>
+      <w:numFmt w:val="lowerLetter"/>
+      <w:lvlText w:val="%5."/>
+      <w:lvlJc w:val="left"/>
+      <w:pPr>
+        <w:ind w:left="3240" w:hanging="360"/>
+      </w:pPr>
+    </w:lvl>
+    <w:lvl w:ilvl="5" w:tplc="0409001B" w:tentative="1">
+      <w:start w:val="1"/>
+      <w:numFmt w:val="lowerRoman"/>
+      <w:lvlText w:val="%6."/>
+      <w:lvlJc w:val="right"/>
+      <w:pPr>
+        <w:ind w:left="3960" w:hanging="180"/>
+      </w:pPr>
+    </w:lvl>
+    <w:lvl w:ilvl="6" w:tplc="0409000F" w:tentative="1">
+      <w:start w:val="1"/>
+      <w:numFmt w:val="decimal"/>
+      <w:lvlText w:val="%7."/>
+      <w:lvlJc w:val="left"/>
+      <w:pPr>
+        <w:ind w:left="4680" w:hanging="360"/>
+      </w:pPr>
+    </w:lvl>
+    <w:lvl w:ilvl="7" w:tplc="04090019" w:tentative="1">
+      <w:start w:val="1"/>
+      <w:numFmt w:val="lowerLetter"/>
+      <w:lvlText w:val="%8."/>
+      <w:lvlJc w:val="left"/>
+      <w:pPr>
+        <w:ind w:left="5400" w:hanging="360"/>
+      </w:pPr>
+    </w:lvl>
+    <w:lvl w:ilvl="8" w:tplc="0409001B" w:tentative="1">
+      <w:start w:val="1"/>
+      <w:numFmt w:val="lowerRoman"/>
+      <w:lvlText w:val="%9."/>
+      <w:lvlJc w:val="right"/>
+      <w:pPr>
+        <w:ind w:left="6120" w:hanging="180"/>
+      </w:pPr>
+    </w:lvl>
+  </w:abstractNum>
   <w:abstractNum w:abstractNumId="6" w15:restartNumberingAfterBreak="0">
-    <w:nsid w:val="37376A90"/>
+    <w:nsid w:val="2C404BF3"/>
     <w:multiLevelType w:val="multilevel"/>
-    <w:tmpl w:val="BF1ADDF6"/>
+    <w:tmpl w:val="C450E13E"/>
     <w:lvl w:ilvl="0">
       <w:start w:val="1"/>
       <w:numFmt w:val="bullet"/>
@@ -12764,9 +13753,9 @@
       <w:lvlJc w:val="left"/>
       <w:pPr>
         <w:tabs>
-          <w:tab w:val="num" w:pos="540"/>
+          <w:tab w:val="num" w:pos="720"/>
         </w:tabs>
-        <w:ind w:left="540" w:hanging="360"/>
+        <w:ind w:left="720" w:hanging="360"/>
       </w:pPr>
       <w:rPr>
         <w:rFonts w:ascii="Symbol" w:hAnsi="Symbol" w:hint="default"/>
@@ -12780,9 +13769,9 @@
       <w:lvlJc w:val="left"/>
       <w:pPr>
         <w:tabs>
-          <w:tab w:val="num" w:pos="1260"/>
+          <w:tab w:val="num" w:pos="1440"/>
         </w:tabs>
-        <w:ind w:left="1260" w:hanging="360"/>
+        <w:ind w:left="1440" w:hanging="360"/>
       </w:pPr>
       <w:rPr>
         <w:rFonts w:ascii="Courier New" w:hAnsi="Courier New" w:hint="default"/>
@@ -12796,9 +13785,9 @@
       <w:lvlJc w:val="left"/>
       <w:pPr>
         <w:tabs>
-          <w:tab w:val="num" w:pos="1980"/>
+          <w:tab w:val="num" w:pos="2160"/>
         </w:tabs>
-        <w:ind w:left="1980" w:hanging="360"/>
+        <w:ind w:left="2160" w:hanging="360"/>
       </w:pPr>
       <w:rPr>
         <w:rFonts w:ascii="Wingdings" w:hAnsi="Wingdings" w:hint="default"/>
@@ -12812,9 +13801,9 @@
       <w:lvlJc w:val="left"/>
       <w:pPr>
         <w:tabs>
-          <w:tab w:val="num" w:pos="2700"/>
+          <w:tab w:val="num" w:pos="2880"/>
         </w:tabs>
-        <w:ind w:left="2700" w:hanging="360"/>
+        <w:ind w:left="2880" w:hanging="360"/>
       </w:pPr>
       <w:rPr>
         <w:rFonts w:ascii="Wingdings" w:hAnsi="Wingdings" w:hint="default"/>
@@ -12828,9 +13817,9 @@
       <w:lvlJc w:val="left"/>
       <w:pPr>
         <w:tabs>
-          <w:tab w:val="num" w:pos="3420"/>
+          <w:tab w:val="num" w:pos="3600"/>
         </w:tabs>
-        <w:ind w:left="3420" w:hanging="360"/>
+        <w:ind w:left="3600" w:hanging="360"/>
       </w:pPr>
       <w:rPr>
         <w:rFonts w:ascii="Wingdings" w:hAnsi="Wingdings" w:hint="default"/>
@@ -12844,9 +13833,9 @@
       <w:lvlJc w:val="left"/>
       <w:pPr>
         <w:tabs>
-          <w:tab w:val="num" w:pos="4140"/>
+          <w:tab w:val="num" w:pos="4320"/>
         </w:tabs>
-        <w:ind w:left="4140" w:hanging="360"/>
+        <w:ind w:left="4320" w:hanging="360"/>
       </w:pPr>
       <w:rPr>
         <w:rFonts w:ascii="Wingdings" w:hAnsi="Wingdings" w:hint="default"/>
@@ -12860,9 +13849,9 @@
       <w:lvlJc w:val="left"/>
       <w:pPr>
         <w:tabs>
-          <w:tab w:val="num" w:pos="4860"/>
+          <w:tab w:val="num" w:pos="5040"/>
         </w:tabs>
-        <w:ind w:left="4860" w:hanging="360"/>
+        <w:ind w:left="5040" w:hanging="360"/>
       </w:pPr>
       <w:rPr>
         <w:rFonts w:ascii="Wingdings" w:hAnsi="Wingdings" w:hint="default"/>
@@ -12876,9 +13865,9 @@
       <w:lvlJc w:val="left"/>
       <w:pPr>
         <w:tabs>
-          <w:tab w:val="num" w:pos="5580"/>
+          <w:tab w:val="num" w:pos="5760"/>
         </w:tabs>
-        <w:ind w:left="5580" w:hanging="360"/>
+        <w:ind w:left="5760" w:hanging="360"/>
       </w:pPr>
       <w:rPr>
         <w:rFonts w:ascii="Wingdings" w:hAnsi="Wingdings" w:hint="default"/>
@@ -12892,9 +13881,9 @@
       <w:lvlJc w:val="left"/>
       <w:pPr>
         <w:tabs>
-          <w:tab w:val="num" w:pos="6300"/>
+          <w:tab w:val="num" w:pos="6480"/>
         </w:tabs>
-        <w:ind w:left="6300" w:hanging="360"/>
+        <w:ind w:left="6480" w:hanging="360"/>
       </w:pPr>
       <w:rPr>
         <w:rFonts w:ascii="Wingdings" w:hAnsi="Wingdings" w:hint="default"/>
@@ -12903,211 +13892,9 @@
     </w:lvl>
   </w:abstractNum>
   <w:abstractNum w:abstractNumId="7" w15:restartNumberingAfterBreak="0">
-    <w:nsid w:val="407345C2"/>
-    <w:multiLevelType w:val="hybridMultilevel"/>
-    <w:tmpl w:val="E0DABAC4"/>
-    <w:lvl w:ilvl="0" w:tplc="0409000F">
-      <w:start w:val="1"/>
-      <w:numFmt w:val="decimal"/>
-      <w:lvlText w:val="%1."/>
-      <w:lvlJc w:val="left"/>
-      <w:pPr>
-        <w:ind w:left="720" w:hanging="360"/>
-      </w:pPr>
-      <w:rPr>
-        <w:rFonts w:hint="default"/>
-      </w:rPr>
-    </w:lvl>
-    <w:lvl w:ilvl="1" w:tplc="04090019" w:tentative="1">
-      <w:start w:val="1"/>
-      <w:numFmt w:val="lowerLetter"/>
-      <w:lvlText w:val="%2."/>
-      <w:lvlJc w:val="left"/>
-      <w:pPr>
-        <w:ind w:left="1440" w:hanging="360"/>
-      </w:pPr>
-    </w:lvl>
-    <w:lvl w:ilvl="2" w:tplc="0409001B" w:tentative="1">
-      <w:start w:val="1"/>
-      <w:numFmt w:val="lowerRoman"/>
-      <w:lvlText w:val="%3."/>
-      <w:lvlJc w:val="right"/>
-      <w:pPr>
-        <w:ind w:left="2160" w:hanging="180"/>
-      </w:pPr>
-    </w:lvl>
-    <w:lvl w:ilvl="3" w:tplc="0409000F" w:tentative="1">
-      <w:start w:val="1"/>
-      <w:numFmt w:val="decimal"/>
-      <w:lvlText w:val="%4."/>
-      <w:lvlJc w:val="left"/>
-      <w:pPr>
-        <w:ind w:left="2880" w:hanging="360"/>
-      </w:pPr>
-    </w:lvl>
-    <w:lvl w:ilvl="4" w:tplc="04090019" w:tentative="1">
-      <w:start w:val="1"/>
-      <w:numFmt w:val="lowerLetter"/>
-      <w:lvlText w:val="%5."/>
-      <w:lvlJc w:val="left"/>
-      <w:pPr>
-        <w:ind w:left="3600" w:hanging="360"/>
-      </w:pPr>
-    </w:lvl>
-    <w:lvl w:ilvl="5" w:tplc="0409001B" w:tentative="1">
-      <w:start w:val="1"/>
-      <w:numFmt w:val="lowerRoman"/>
-      <w:lvlText w:val="%6."/>
-      <w:lvlJc w:val="right"/>
-      <w:pPr>
-        <w:ind w:left="4320" w:hanging="180"/>
-      </w:pPr>
-    </w:lvl>
-    <w:lvl w:ilvl="6" w:tplc="0409000F" w:tentative="1">
-      <w:start w:val="1"/>
-      <w:numFmt w:val="decimal"/>
-      <w:lvlText w:val="%7."/>
-      <w:lvlJc w:val="left"/>
-      <w:pPr>
-        <w:ind w:left="5040" w:hanging="360"/>
-      </w:pPr>
-    </w:lvl>
-    <w:lvl w:ilvl="7" w:tplc="04090019" w:tentative="1">
-      <w:start w:val="1"/>
-      <w:numFmt w:val="lowerLetter"/>
-      <w:lvlText w:val="%8."/>
-      <w:lvlJc w:val="left"/>
-      <w:pPr>
-        <w:ind w:left="5760" w:hanging="360"/>
-      </w:pPr>
-    </w:lvl>
-    <w:lvl w:ilvl="8" w:tplc="0409001B" w:tentative="1">
-      <w:start w:val="1"/>
-      <w:numFmt w:val="lowerRoman"/>
-      <w:lvlText w:val="%9."/>
-      <w:lvlJc w:val="right"/>
-      <w:pPr>
-        <w:ind w:left="6480" w:hanging="180"/>
-      </w:pPr>
-    </w:lvl>
-  </w:abstractNum>
-  <w:abstractNum w:abstractNumId="8" w15:restartNumberingAfterBreak="0">
-    <w:nsid w:val="47E60FFC"/>
-    <w:multiLevelType w:val="hybridMultilevel"/>
-    <w:tmpl w:val="F926D154"/>
-    <w:lvl w:ilvl="0" w:tplc="04090001">
-      <w:start w:val="1"/>
-      <w:numFmt w:val="bullet"/>
-      <w:lvlText w:val=""/>
-      <w:lvlJc w:val="left"/>
-      <w:pPr>
-        <w:ind w:left="720" w:hanging="360"/>
-      </w:pPr>
-      <w:rPr>
-        <w:rFonts w:ascii="Symbol" w:hAnsi="Symbol" w:hint="default"/>
-      </w:rPr>
-    </w:lvl>
-    <w:lvl w:ilvl="1" w:tplc="04090003" w:tentative="1">
-      <w:start w:val="1"/>
-      <w:numFmt w:val="bullet"/>
-      <w:lvlText w:val="o"/>
-      <w:lvlJc w:val="left"/>
-      <w:pPr>
-        <w:ind w:left="1440" w:hanging="360"/>
-      </w:pPr>
-      <w:rPr>
-        <w:rFonts w:ascii="Courier New" w:hAnsi="Courier New" w:cs="Courier New" w:hint="default"/>
-      </w:rPr>
-    </w:lvl>
-    <w:lvl w:ilvl="2" w:tplc="04090005" w:tentative="1">
-      <w:start w:val="1"/>
-      <w:numFmt w:val="bullet"/>
-      <w:lvlText w:val=""/>
-      <w:lvlJc w:val="left"/>
-      <w:pPr>
-        <w:ind w:left="2160" w:hanging="360"/>
-      </w:pPr>
-      <w:rPr>
-        <w:rFonts w:ascii="Wingdings" w:hAnsi="Wingdings" w:hint="default"/>
-      </w:rPr>
-    </w:lvl>
-    <w:lvl w:ilvl="3" w:tplc="04090001" w:tentative="1">
-      <w:start w:val="1"/>
-      <w:numFmt w:val="bullet"/>
-      <w:lvlText w:val=""/>
-      <w:lvlJc w:val="left"/>
-      <w:pPr>
-        <w:ind w:left="2880" w:hanging="360"/>
-      </w:pPr>
-      <w:rPr>
-        <w:rFonts w:ascii="Symbol" w:hAnsi="Symbol" w:hint="default"/>
-      </w:rPr>
-    </w:lvl>
-    <w:lvl w:ilvl="4" w:tplc="04090003" w:tentative="1">
-      <w:start w:val="1"/>
-      <w:numFmt w:val="bullet"/>
-      <w:lvlText w:val="o"/>
-      <w:lvlJc w:val="left"/>
-      <w:pPr>
-        <w:ind w:left="3600" w:hanging="360"/>
-      </w:pPr>
-      <w:rPr>
-        <w:rFonts w:ascii="Courier New" w:hAnsi="Courier New" w:cs="Courier New" w:hint="default"/>
-      </w:rPr>
-    </w:lvl>
-    <w:lvl w:ilvl="5" w:tplc="04090005" w:tentative="1">
-      <w:start w:val="1"/>
-      <w:numFmt w:val="bullet"/>
-      <w:lvlText w:val=""/>
-      <w:lvlJc w:val="left"/>
-      <w:pPr>
-        <w:ind w:left="4320" w:hanging="360"/>
-      </w:pPr>
-      <w:rPr>
-        <w:rFonts w:ascii="Wingdings" w:hAnsi="Wingdings" w:hint="default"/>
-      </w:rPr>
-    </w:lvl>
-    <w:lvl w:ilvl="6" w:tplc="04090001" w:tentative="1">
-      <w:start w:val="1"/>
-      <w:numFmt w:val="bullet"/>
-      <w:lvlText w:val=""/>
-      <w:lvlJc w:val="left"/>
-      <w:pPr>
-        <w:ind w:left="5040" w:hanging="360"/>
-      </w:pPr>
-      <w:rPr>
-        <w:rFonts w:ascii="Symbol" w:hAnsi="Symbol" w:hint="default"/>
-      </w:rPr>
-    </w:lvl>
-    <w:lvl w:ilvl="7" w:tplc="04090003" w:tentative="1">
-      <w:start w:val="1"/>
-      <w:numFmt w:val="bullet"/>
-      <w:lvlText w:val="o"/>
-      <w:lvlJc w:val="left"/>
-      <w:pPr>
-        <w:ind w:left="5760" w:hanging="360"/>
-      </w:pPr>
-      <w:rPr>
-        <w:rFonts w:ascii="Courier New" w:hAnsi="Courier New" w:cs="Courier New" w:hint="default"/>
-      </w:rPr>
-    </w:lvl>
-    <w:lvl w:ilvl="8" w:tplc="04090005" w:tentative="1">
-      <w:start w:val="1"/>
-      <w:numFmt w:val="bullet"/>
-      <w:lvlText w:val=""/>
-      <w:lvlJc w:val="left"/>
-      <w:pPr>
-        <w:ind w:left="6480" w:hanging="360"/>
-      </w:pPr>
-      <w:rPr>
-        <w:rFonts w:ascii="Wingdings" w:hAnsi="Wingdings" w:hint="default"/>
-      </w:rPr>
-    </w:lvl>
-  </w:abstractNum>
-  <w:abstractNum w:abstractNumId="9" w15:restartNumberingAfterBreak="0">
-    <w:nsid w:val="56A54392"/>
+    <w:nsid w:val="33DD739A"/>
     <w:multiLevelType w:val="multilevel"/>
-    <w:tmpl w:val="D5E2ED06"/>
+    <w:tmpl w:val="6E681F36"/>
     <w:lvl w:ilvl="0">
       <w:start w:val="1"/>
       <w:numFmt w:val="bullet"/>
@@ -13253,10 +14040,10 @@
       </w:rPr>
     </w:lvl>
   </w:abstractNum>
-  <w:abstractNum w:abstractNumId="10" w15:restartNumberingAfterBreak="0">
-    <w:nsid w:val="57F76F05"/>
+  <w:abstractNum w:abstractNumId="8" w15:restartNumberingAfterBreak="0">
+    <w:nsid w:val="37376A90"/>
     <w:multiLevelType w:val="multilevel"/>
-    <w:tmpl w:val="B8C6314C"/>
+    <w:tmpl w:val="BF1ADDF6"/>
     <w:lvl w:ilvl="0">
       <w:start w:val="1"/>
       <w:numFmt w:val="bullet"/>
@@ -13264,9 +14051,9 @@
       <w:lvlJc w:val="left"/>
       <w:pPr>
         <w:tabs>
-          <w:tab w:val="num" w:pos="720"/>
+          <w:tab w:val="num" w:pos="540"/>
         </w:tabs>
-        <w:ind w:left="720" w:hanging="360"/>
+        <w:ind w:left="540" w:hanging="360"/>
       </w:pPr>
       <w:rPr>
         <w:rFonts w:ascii="Symbol" w:hAnsi="Symbol" w:hint="default"/>
@@ -13280,9 +14067,9 @@
       <w:lvlJc w:val="left"/>
       <w:pPr>
         <w:tabs>
-          <w:tab w:val="num" w:pos="1440"/>
+          <w:tab w:val="num" w:pos="1260"/>
         </w:tabs>
-        <w:ind w:left="1440" w:hanging="360"/>
+        <w:ind w:left="1260" w:hanging="360"/>
       </w:pPr>
       <w:rPr>
         <w:rFonts w:ascii="Courier New" w:hAnsi="Courier New" w:hint="default"/>
@@ -13296,9 +14083,9 @@
       <w:lvlJc w:val="left"/>
       <w:pPr>
         <w:tabs>
-          <w:tab w:val="num" w:pos="2160"/>
+          <w:tab w:val="num" w:pos="1980"/>
         </w:tabs>
-        <w:ind w:left="2160" w:hanging="360"/>
+        <w:ind w:left="1980" w:hanging="360"/>
       </w:pPr>
       <w:rPr>
         <w:rFonts w:ascii="Wingdings" w:hAnsi="Wingdings" w:hint="default"/>
@@ -13312,9 +14099,9 @@
       <w:lvlJc w:val="left"/>
       <w:pPr>
         <w:tabs>
-          <w:tab w:val="num" w:pos="2880"/>
+          <w:tab w:val="num" w:pos="2700"/>
         </w:tabs>
-        <w:ind w:left="2880" w:hanging="360"/>
+        <w:ind w:left="2700" w:hanging="360"/>
       </w:pPr>
       <w:rPr>
         <w:rFonts w:ascii="Wingdings" w:hAnsi="Wingdings" w:hint="default"/>
@@ -13328,9 +14115,9 @@
       <w:lvlJc w:val="left"/>
       <w:pPr>
         <w:tabs>
-          <w:tab w:val="num" w:pos="3600"/>
+          <w:tab w:val="num" w:pos="3420"/>
         </w:tabs>
-        <w:ind w:left="3600" w:hanging="360"/>
+        <w:ind w:left="3420" w:hanging="360"/>
       </w:pPr>
       <w:rPr>
         <w:rFonts w:ascii="Wingdings" w:hAnsi="Wingdings" w:hint="default"/>
@@ -13344,9 +14131,9 @@
       <w:lvlJc w:val="left"/>
       <w:pPr>
         <w:tabs>
-          <w:tab w:val="num" w:pos="4320"/>
+          <w:tab w:val="num" w:pos="4140"/>
         </w:tabs>
-        <w:ind w:left="4320" w:hanging="360"/>
+        <w:ind w:left="4140" w:hanging="360"/>
       </w:pPr>
       <w:rPr>
         <w:rFonts w:ascii="Wingdings" w:hAnsi="Wingdings" w:hint="default"/>
@@ -13360,9 +14147,9 @@
       <w:lvlJc w:val="left"/>
       <w:pPr>
         <w:tabs>
-          <w:tab w:val="num" w:pos="5040"/>
+          <w:tab w:val="num" w:pos="4860"/>
         </w:tabs>
-        <w:ind w:left="5040" w:hanging="360"/>
+        <w:ind w:left="4860" w:hanging="360"/>
       </w:pPr>
       <w:rPr>
         <w:rFonts w:ascii="Wingdings" w:hAnsi="Wingdings" w:hint="default"/>
@@ -13376,9 +14163,9 @@
       <w:lvlJc w:val="left"/>
       <w:pPr>
         <w:tabs>
-          <w:tab w:val="num" w:pos="5760"/>
+          <w:tab w:val="num" w:pos="5580"/>
         </w:tabs>
-        <w:ind w:left="5760" w:hanging="360"/>
+        <w:ind w:left="5580" w:hanging="360"/>
       </w:pPr>
       <w:rPr>
         <w:rFonts w:ascii="Wingdings" w:hAnsi="Wingdings" w:hint="default"/>
@@ -13392,9 +14179,9 @@
       <w:lvlJc w:val="left"/>
       <w:pPr>
         <w:tabs>
-          <w:tab w:val="num" w:pos="6480"/>
+          <w:tab w:val="num" w:pos="6300"/>
         </w:tabs>
-        <w:ind w:left="6480" w:hanging="360"/>
+        <w:ind w:left="6300" w:hanging="360"/>
       </w:pPr>
       <w:rPr>
         <w:rFonts w:ascii="Wingdings" w:hAnsi="Wingdings" w:hint="default"/>
@@ -13402,10 +14189,212 @@
       </w:rPr>
     </w:lvl>
   </w:abstractNum>
+  <w:abstractNum w:abstractNumId="9" w15:restartNumberingAfterBreak="0">
+    <w:nsid w:val="407345C2"/>
+    <w:multiLevelType w:val="hybridMultilevel"/>
+    <w:tmpl w:val="E0DABAC4"/>
+    <w:lvl w:ilvl="0" w:tplc="0409000F">
+      <w:start w:val="1"/>
+      <w:numFmt w:val="decimal"/>
+      <w:lvlText w:val="%1."/>
+      <w:lvlJc w:val="left"/>
+      <w:pPr>
+        <w:ind w:left="720" w:hanging="360"/>
+      </w:pPr>
+      <w:rPr>
+        <w:rFonts w:hint="default"/>
+      </w:rPr>
+    </w:lvl>
+    <w:lvl w:ilvl="1" w:tplc="04090019" w:tentative="1">
+      <w:start w:val="1"/>
+      <w:numFmt w:val="lowerLetter"/>
+      <w:lvlText w:val="%2."/>
+      <w:lvlJc w:val="left"/>
+      <w:pPr>
+        <w:ind w:left="1440" w:hanging="360"/>
+      </w:pPr>
+    </w:lvl>
+    <w:lvl w:ilvl="2" w:tplc="0409001B" w:tentative="1">
+      <w:start w:val="1"/>
+      <w:numFmt w:val="lowerRoman"/>
+      <w:lvlText w:val="%3."/>
+      <w:lvlJc w:val="right"/>
+      <w:pPr>
+        <w:ind w:left="2160" w:hanging="180"/>
+      </w:pPr>
+    </w:lvl>
+    <w:lvl w:ilvl="3" w:tplc="0409000F" w:tentative="1">
+      <w:start w:val="1"/>
+      <w:numFmt w:val="decimal"/>
+      <w:lvlText w:val="%4."/>
+      <w:lvlJc w:val="left"/>
+      <w:pPr>
+        <w:ind w:left="2880" w:hanging="360"/>
+      </w:pPr>
+    </w:lvl>
+    <w:lvl w:ilvl="4" w:tplc="04090019" w:tentative="1">
+      <w:start w:val="1"/>
+      <w:numFmt w:val="lowerLetter"/>
+      <w:lvlText w:val="%5."/>
+      <w:lvlJc w:val="left"/>
+      <w:pPr>
+        <w:ind w:left="3600" w:hanging="360"/>
+      </w:pPr>
+    </w:lvl>
+    <w:lvl w:ilvl="5" w:tplc="0409001B" w:tentative="1">
+      <w:start w:val="1"/>
+      <w:numFmt w:val="lowerRoman"/>
+      <w:lvlText w:val="%6."/>
+      <w:lvlJc w:val="right"/>
+      <w:pPr>
+        <w:ind w:left="4320" w:hanging="180"/>
+      </w:pPr>
+    </w:lvl>
+    <w:lvl w:ilvl="6" w:tplc="0409000F" w:tentative="1">
+      <w:start w:val="1"/>
+      <w:numFmt w:val="decimal"/>
+      <w:lvlText w:val="%7."/>
+      <w:lvlJc w:val="left"/>
+      <w:pPr>
+        <w:ind w:left="5040" w:hanging="360"/>
+      </w:pPr>
+    </w:lvl>
+    <w:lvl w:ilvl="7" w:tplc="04090019" w:tentative="1">
+      <w:start w:val="1"/>
+      <w:numFmt w:val="lowerLetter"/>
+      <w:lvlText w:val="%8."/>
+      <w:lvlJc w:val="left"/>
+      <w:pPr>
+        <w:ind w:left="5760" w:hanging="360"/>
+      </w:pPr>
+    </w:lvl>
+    <w:lvl w:ilvl="8" w:tplc="0409001B" w:tentative="1">
+      <w:start w:val="1"/>
+      <w:numFmt w:val="lowerRoman"/>
+      <w:lvlText w:val="%9."/>
+      <w:lvlJc w:val="right"/>
+      <w:pPr>
+        <w:ind w:left="6480" w:hanging="180"/>
+      </w:pPr>
+    </w:lvl>
+  </w:abstractNum>
+  <w:abstractNum w:abstractNumId="10" w15:restartNumberingAfterBreak="0">
+    <w:nsid w:val="47E60FFC"/>
+    <w:multiLevelType w:val="hybridMultilevel"/>
+    <w:tmpl w:val="F926D154"/>
+    <w:lvl w:ilvl="0" w:tplc="04090001">
+      <w:start w:val="1"/>
+      <w:numFmt w:val="bullet"/>
+      <w:lvlText w:val=""/>
+      <w:lvlJc w:val="left"/>
+      <w:pPr>
+        <w:ind w:left="720" w:hanging="360"/>
+      </w:pPr>
+      <w:rPr>
+        <w:rFonts w:ascii="Symbol" w:hAnsi="Symbol" w:hint="default"/>
+      </w:rPr>
+    </w:lvl>
+    <w:lvl w:ilvl="1" w:tplc="04090003" w:tentative="1">
+      <w:start w:val="1"/>
+      <w:numFmt w:val="bullet"/>
+      <w:lvlText w:val="o"/>
+      <w:lvlJc w:val="left"/>
+      <w:pPr>
+        <w:ind w:left="1440" w:hanging="360"/>
+      </w:pPr>
+      <w:rPr>
+        <w:rFonts w:ascii="Courier New" w:hAnsi="Courier New" w:cs="Courier New" w:hint="default"/>
+      </w:rPr>
+    </w:lvl>
+    <w:lvl w:ilvl="2" w:tplc="04090005" w:tentative="1">
+      <w:start w:val="1"/>
+      <w:numFmt w:val="bullet"/>
+      <w:lvlText w:val=""/>
+      <w:lvlJc w:val="left"/>
+      <w:pPr>
+        <w:ind w:left="2160" w:hanging="360"/>
+      </w:pPr>
+      <w:rPr>
+        <w:rFonts w:ascii="Wingdings" w:hAnsi="Wingdings" w:hint="default"/>
+      </w:rPr>
+    </w:lvl>
+    <w:lvl w:ilvl="3" w:tplc="04090001" w:tentative="1">
+      <w:start w:val="1"/>
+      <w:numFmt w:val="bullet"/>
+      <w:lvlText w:val=""/>
+      <w:lvlJc w:val="left"/>
+      <w:pPr>
+        <w:ind w:left="2880" w:hanging="360"/>
+      </w:pPr>
+      <w:rPr>
+        <w:rFonts w:ascii="Symbol" w:hAnsi="Symbol" w:hint="default"/>
+      </w:rPr>
+    </w:lvl>
+    <w:lvl w:ilvl="4" w:tplc="04090003" w:tentative="1">
+      <w:start w:val="1"/>
+      <w:numFmt w:val="bullet"/>
+      <w:lvlText w:val="o"/>
+      <w:lvlJc w:val="left"/>
+      <w:pPr>
+        <w:ind w:left="3600" w:hanging="360"/>
+      </w:pPr>
+      <w:rPr>
+        <w:rFonts w:ascii="Courier New" w:hAnsi="Courier New" w:cs="Courier New" w:hint="default"/>
+      </w:rPr>
+    </w:lvl>
+    <w:lvl w:ilvl="5" w:tplc="04090005" w:tentative="1">
+      <w:start w:val="1"/>
+      <w:numFmt w:val="bullet"/>
+      <w:lvlText w:val=""/>
+      <w:lvlJc w:val="left"/>
+      <w:pPr>
+        <w:ind w:left="4320" w:hanging="360"/>
+      </w:pPr>
+      <w:rPr>
+        <w:rFonts w:ascii="Wingdings" w:hAnsi="Wingdings" w:hint="default"/>
+      </w:rPr>
+    </w:lvl>
+    <w:lvl w:ilvl="6" w:tplc="04090001" w:tentative="1">
+      <w:start w:val="1"/>
+      <w:numFmt w:val="bullet"/>
+      <w:lvlText w:val=""/>
+      <w:lvlJc w:val="left"/>
+      <w:pPr>
+        <w:ind w:left="5040" w:hanging="360"/>
+      </w:pPr>
+      <w:rPr>
+        <w:rFonts w:ascii="Symbol" w:hAnsi="Symbol" w:hint="default"/>
+      </w:rPr>
+    </w:lvl>
+    <w:lvl w:ilvl="7" w:tplc="04090003" w:tentative="1">
+      <w:start w:val="1"/>
+      <w:numFmt w:val="bullet"/>
+      <w:lvlText w:val="o"/>
+      <w:lvlJc w:val="left"/>
+      <w:pPr>
+        <w:ind w:left="5760" w:hanging="360"/>
+      </w:pPr>
+      <w:rPr>
+        <w:rFonts w:ascii="Courier New" w:hAnsi="Courier New" w:cs="Courier New" w:hint="default"/>
+      </w:rPr>
+    </w:lvl>
+    <w:lvl w:ilvl="8" w:tplc="04090005" w:tentative="1">
+      <w:start w:val="1"/>
+      <w:numFmt w:val="bullet"/>
+      <w:lvlText w:val=""/>
+      <w:lvlJc w:val="left"/>
+      <w:pPr>
+        <w:ind w:left="6480" w:hanging="360"/>
+      </w:pPr>
+      <w:rPr>
+        <w:rFonts w:ascii="Wingdings" w:hAnsi="Wingdings" w:hint="default"/>
+      </w:rPr>
+    </w:lvl>
+  </w:abstractNum>
   <w:abstractNum w:abstractNumId="11" w15:restartNumberingAfterBreak="0">
-    <w:nsid w:val="5F6613B1"/>
+    <w:nsid w:val="56A54392"/>
     <w:multiLevelType w:val="multilevel"/>
-    <w:tmpl w:val="336C2B56"/>
+    <w:tmpl w:val="D5E2ED06"/>
     <w:lvl w:ilvl="0">
       <w:start w:val="1"/>
       <w:numFmt w:val="bullet"/>
@@ -13552,122 +14541,9 @@
     </w:lvl>
   </w:abstractNum>
   <w:abstractNum w:abstractNumId="12" w15:restartNumberingAfterBreak="0">
-    <w:nsid w:val="78BE58F9"/>
-    <w:multiLevelType w:val="hybridMultilevel"/>
-    <w:tmpl w:val="1302BB68"/>
-    <w:lvl w:ilvl="0" w:tplc="04090001">
-      <w:start w:val="1"/>
-      <w:numFmt w:val="bullet"/>
-      <w:lvlText w:val=""/>
-      <w:lvlJc w:val="left"/>
-      <w:pPr>
-        <w:ind w:left="720" w:hanging="360"/>
-      </w:pPr>
-      <w:rPr>
-        <w:rFonts w:ascii="Symbol" w:hAnsi="Symbol" w:hint="default"/>
-      </w:rPr>
-    </w:lvl>
-    <w:lvl w:ilvl="1" w:tplc="04090003" w:tentative="1">
-      <w:start w:val="1"/>
-      <w:numFmt w:val="bullet"/>
-      <w:lvlText w:val="o"/>
-      <w:lvlJc w:val="left"/>
-      <w:pPr>
-        <w:ind w:left="1440" w:hanging="360"/>
-      </w:pPr>
-      <w:rPr>
-        <w:rFonts w:ascii="Courier New" w:hAnsi="Courier New" w:cs="Courier New" w:hint="default"/>
-      </w:rPr>
-    </w:lvl>
-    <w:lvl w:ilvl="2" w:tplc="04090005" w:tentative="1">
-      <w:start w:val="1"/>
-      <w:numFmt w:val="bullet"/>
-      <w:lvlText w:val=""/>
-      <w:lvlJc w:val="left"/>
-      <w:pPr>
-        <w:ind w:left="2160" w:hanging="360"/>
-      </w:pPr>
-      <w:rPr>
-        <w:rFonts w:ascii="Wingdings" w:hAnsi="Wingdings" w:hint="default"/>
-      </w:rPr>
-    </w:lvl>
-    <w:lvl w:ilvl="3" w:tplc="04090001" w:tentative="1">
-      <w:start w:val="1"/>
-      <w:numFmt w:val="bullet"/>
-      <w:lvlText w:val=""/>
-      <w:lvlJc w:val="left"/>
-      <w:pPr>
-        <w:ind w:left="2880" w:hanging="360"/>
-      </w:pPr>
-      <w:rPr>
-        <w:rFonts w:ascii="Symbol" w:hAnsi="Symbol" w:hint="default"/>
-      </w:rPr>
-    </w:lvl>
-    <w:lvl w:ilvl="4" w:tplc="04090003" w:tentative="1">
-      <w:start w:val="1"/>
-      <w:numFmt w:val="bullet"/>
-      <w:lvlText w:val="o"/>
-      <w:lvlJc w:val="left"/>
-      <w:pPr>
-        <w:ind w:left="3600" w:hanging="360"/>
-      </w:pPr>
-      <w:rPr>
-        <w:rFonts w:ascii="Courier New" w:hAnsi="Courier New" w:cs="Courier New" w:hint="default"/>
-      </w:rPr>
-    </w:lvl>
-    <w:lvl w:ilvl="5" w:tplc="04090005" w:tentative="1">
-      <w:start w:val="1"/>
-      <w:numFmt w:val="bullet"/>
-      <w:lvlText w:val=""/>
-      <w:lvlJc w:val="left"/>
-      <w:pPr>
-        <w:ind w:left="4320" w:hanging="360"/>
-      </w:pPr>
-      <w:rPr>
-        <w:rFonts w:ascii="Wingdings" w:hAnsi="Wingdings" w:hint="default"/>
-      </w:rPr>
-    </w:lvl>
-    <w:lvl w:ilvl="6" w:tplc="04090001" w:tentative="1">
-      <w:start w:val="1"/>
-      <w:numFmt w:val="bullet"/>
-      <w:lvlText w:val=""/>
-      <w:lvlJc w:val="left"/>
-      <w:pPr>
-        <w:ind w:left="5040" w:hanging="360"/>
-      </w:pPr>
-      <w:rPr>
-        <w:rFonts w:ascii="Symbol" w:hAnsi="Symbol" w:hint="default"/>
-      </w:rPr>
-    </w:lvl>
-    <w:lvl w:ilvl="7" w:tplc="04090003" w:tentative="1">
-      <w:start w:val="1"/>
-      <w:numFmt w:val="bullet"/>
-      <w:lvlText w:val="o"/>
-      <w:lvlJc w:val="left"/>
-      <w:pPr>
-        <w:ind w:left="5760" w:hanging="360"/>
-      </w:pPr>
-      <w:rPr>
-        <w:rFonts w:ascii="Courier New" w:hAnsi="Courier New" w:cs="Courier New" w:hint="default"/>
-      </w:rPr>
-    </w:lvl>
-    <w:lvl w:ilvl="8" w:tplc="04090005" w:tentative="1">
-      <w:start w:val="1"/>
-      <w:numFmt w:val="bullet"/>
-      <w:lvlText w:val=""/>
-      <w:lvlJc w:val="left"/>
-      <w:pPr>
-        <w:ind w:left="6480" w:hanging="360"/>
-      </w:pPr>
-      <w:rPr>
-        <w:rFonts w:ascii="Wingdings" w:hAnsi="Wingdings" w:hint="default"/>
-      </w:rPr>
-    </w:lvl>
-  </w:abstractNum>
-  <w:abstractNum w:abstractNumId="13" w15:restartNumberingAfterBreak="0">
-    <w:nsid w:val="7B402230"/>
+    <w:nsid w:val="57F76F05"/>
     <w:multiLevelType w:val="multilevel"/>
-    <w:tmpl w:val="86EA45C8"/>
+    <w:tmpl w:val="B8C6314C"/>
     <w:lvl w:ilvl="0">
       <w:start w:val="1"/>
       <w:numFmt w:val="bullet"/>
@@ -13813,10 +14689,10 @@
       </w:rPr>
     </w:lvl>
   </w:abstractNum>
-  <w:abstractNum w:abstractNumId="14" w15:restartNumberingAfterBreak="0">
-    <w:nsid w:val="7E04366A"/>
+  <w:abstractNum w:abstractNumId="13" w15:restartNumberingAfterBreak="0">
+    <w:nsid w:val="5F6613B1"/>
     <w:multiLevelType w:val="multilevel"/>
-    <w:tmpl w:val="73D65DFE"/>
+    <w:tmpl w:val="336C2B56"/>
     <w:lvl w:ilvl="0">
       <w:start w:val="1"/>
       <w:numFmt w:val="bullet"/>
@@ -13962,50 +14838,467 @@
       </w:rPr>
     </w:lvl>
   </w:abstractNum>
+  <w:abstractNum w:abstractNumId="14" w15:restartNumberingAfterBreak="0">
+    <w:nsid w:val="78BE58F9"/>
+    <w:multiLevelType w:val="hybridMultilevel"/>
+    <w:tmpl w:val="1302BB68"/>
+    <w:lvl w:ilvl="0" w:tplc="04090001">
+      <w:start w:val="1"/>
+      <w:numFmt w:val="bullet"/>
+      <w:lvlText w:val=""/>
+      <w:lvlJc w:val="left"/>
+      <w:pPr>
+        <w:ind w:left="720" w:hanging="360"/>
+      </w:pPr>
+      <w:rPr>
+        <w:rFonts w:ascii="Symbol" w:hAnsi="Symbol" w:hint="default"/>
+      </w:rPr>
+    </w:lvl>
+    <w:lvl w:ilvl="1" w:tplc="04090003" w:tentative="1">
+      <w:start w:val="1"/>
+      <w:numFmt w:val="bullet"/>
+      <w:lvlText w:val="o"/>
+      <w:lvlJc w:val="left"/>
+      <w:pPr>
+        <w:ind w:left="1440" w:hanging="360"/>
+      </w:pPr>
+      <w:rPr>
+        <w:rFonts w:ascii="Courier New" w:hAnsi="Courier New" w:cs="Courier New" w:hint="default"/>
+      </w:rPr>
+    </w:lvl>
+    <w:lvl w:ilvl="2" w:tplc="04090005" w:tentative="1">
+      <w:start w:val="1"/>
+      <w:numFmt w:val="bullet"/>
+      <w:lvlText w:val=""/>
+      <w:lvlJc w:val="left"/>
+      <w:pPr>
+        <w:ind w:left="2160" w:hanging="360"/>
+      </w:pPr>
+      <w:rPr>
+        <w:rFonts w:ascii="Wingdings" w:hAnsi="Wingdings" w:hint="default"/>
+      </w:rPr>
+    </w:lvl>
+    <w:lvl w:ilvl="3" w:tplc="04090001" w:tentative="1">
+      <w:start w:val="1"/>
+      <w:numFmt w:val="bullet"/>
+      <w:lvlText w:val=""/>
+      <w:lvlJc w:val="left"/>
+      <w:pPr>
+        <w:ind w:left="2880" w:hanging="360"/>
+      </w:pPr>
+      <w:rPr>
+        <w:rFonts w:ascii="Symbol" w:hAnsi="Symbol" w:hint="default"/>
+      </w:rPr>
+    </w:lvl>
+    <w:lvl w:ilvl="4" w:tplc="04090003" w:tentative="1">
+      <w:start w:val="1"/>
+      <w:numFmt w:val="bullet"/>
+      <w:lvlText w:val="o"/>
+      <w:lvlJc w:val="left"/>
+      <w:pPr>
+        <w:ind w:left="3600" w:hanging="360"/>
+      </w:pPr>
+      <w:rPr>
+        <w:rFonts w:ascii="Courier New" w:hAnsi="Courier New" w:cs="Courier New" w:hint="default"/>
+      </w:rPr>
+    </w:lvl>
+    <w:lvl w:ilvl="5" w:tplc="04090005" w:tentative="1">
+      <w:start w:val="1"/>
+      <w:numFmt w:val="bullet"/>
+      <w:lvlText w:val=""/>
+      <w:lvlJc w:val="left"/>
+      <w:pPr>
+        <w:ind w:left="4320" w:hanging="360"/>
+      </w:pPr>
+      <w:rPr>
+        <w:rFonts w:ascii="Wingdings" w:hAnsi="Wingdings" w:hint="default"/>
+      </w:rPr>
+    </w:lvl>
+    <w:lvl w:ilvl="6" w:tplc="04090001" w:tentative="1">
+      <w:start w:val="1"/>
+      <w:numFmt w:val="bullet"/>
+      <w:lvlText w:val=""/>
+      <w:lvlJc w:val="left"/>
+      <w:pPr>
+        <w:ind w:left="5040" w:hanging="360"/>
+      </w:pPr>
+      <w:rPr>
+        <w:rFonts w:ascii="Symbol" w:hAnsi="Symbol" w:hint="default"/>
+      </w:rPr>
+    </w:lvl>
+    <w:lvl w:ilvl="7" w:tplc="04090003" w:tentative="1">
+      <w:start w:val="1"/>
+      <w:numFmt w:val="bullet"/>
+      <w:lvlText w:val="o"/>
+      <w:lvlJc w:val="left"/>
+      <w:pPr>
+        <w:ind w:left="5760" w:hanging="360"/>
+      </w:pPr>
+      <w:rPr>
+        <w:rFonts w:ascii="Courier New" w:hAnsi="Courier New" w:cs="Courier New" w:hint="default"/>
+      </w:rPr>
+    </w:lvl>
+    <w:lvl w:ilvl="8" w:tplc="04090005" w:tentative="1">
+      <w:start w:val="1"/>
+      <w:numFmt w:val="bullet"/>
+      <w:lvlText w:val=""/>
+      <w:lvlJc w:val="left"/>
+      <w:pPr>
+        <w:ind w:left="6480" w:hanging="360"/>
+      </w:pPr>
+      <w:rPr>
+        <w:rFonts w:ascii="Wingdings" w:hAnsi="Wingdings" w:hint="default"/>
+      </w:rPr>
+    </w:lvl>
+  </w:abstractNum>
+  <w:abstractNum w:abstractNumId="15" w15:restartNumberingAfterBreak="0">
+    <w:nsid w:val="7B402230"/>
+    <w:multiLevelType w:val="multilevel"/>
+    <w:tmpl w:val="86EA45C8"/>
+    <w:lvl w:ilvl="0">
+      <w:start w:val="1"/>
+      <w:numFmt w:val="bullet"/>
+      <w:lvlText w:val=""/>
+      <w:lvlJc w:val="left"/>
+      <w:pPr>
+        <w:tabs>
+          <w:tab w:val="num" w:pos="720"/>
+        </w:tabs>
+        <w:ind w:left="720" w:hanging="360"/>
+      </w:pPr>
+      <w:rPr>
+        <w:rFonts w:ascii="Symbol" w:hAnsi="Symbol" w:hint="default"/>
+        <w:sz w:val="20"/>
+      </w:rPr>
+    </w:lvl>
+    <w:lvl w:ilvl="1" w:tentative="1">
+      <w:start w:val="1"/>
+      <w:numFmt w:val="bullet"/>
+      <w:lvlText w:val="o"/>
+      <w:lvlJc w:val="left"/>
+      <w:pPr>
+        <w:tabs>
+          <w:tab w:val="num" w:pos="1440"/>
+        </w:tabs>
+        <w:ind w:left="1440" w:hanging="360"/>
+      </w:pPr>
+      <w:rPr>
+        <w:rFonts w:ascii="Courier New" w:hAnsi="Courier New" w:hint="default"/>
+        <w:sz w:val="20"/>
+      </w:rPr>
+    </w:lvl>
+    <w:lvl w:ilvl="2" w:tentative="1">
+      <w:start w:val="1"/>
+      <w:numFmt w:val="bullet"/>
+      <w:lvlText w:val=""/>
+      <w:lvlJc w:val="left"/>
+      <w:pPr>
+        <w:tabs>
+          <w:tab w:val="num" w:pos="2160"/>
+        </w:tabs>
+        <w:ind w:left="2160" w:hanging="360"/>
+      </w:pPr>
+      <w:rPr>
+        <w:rFonts w:ascii="Wingdings" w:hAnsi="Wingdings" w:hint="default"/>
+        <w:sz w:val="20"/>
+      </w:rPr>
+    </w:lvl>
+    <w:lvl w:ilvl="3" w:tentative="1">
+      <w:start w:val="1"/>
+      <w:numFmt w:val="bullet"/>
+      <w:lvlText w:val=""/>
+      <w:lvlJc w:val="left"/>
+      <w:pPr>
+        <w:tabs>
+          <w:tab w:val="num" w:pos="2880"/>
+        </w:tabs>
+        <w:ind w:left="2880" w:hanging="360"/>
+      </w:pPr>
+      <w:rPr>
+        <w:rFonts w:ascii="Wingdings" w:hAnsi="Wingdings" w:hint="default"/>
+        <w:sz w:val="20"/>
+      </w:rPr>
+    </w:lvl>
+    <w:lvl w:ilvl="4" w:tentative="1">
+      <w:start w:val="1"/>
+      <w:numFmt w:val="bullet"/>
+      <w:lvlText w:val=""/>
+      <w:lvlJc w:val="left"/>
+      <w:pPr>
+        <w:tabs>
+          <w:tab w:val="num" w:pos="3600"/>
+        </w:tabs>
+        <w:ind w:left="3600" w:hanging="360"/>
+      </w:pPr>
+      <w:rPr>
+        <w:rFonts w:ascii="Wingdings" w:hAnsi="Wingdings" w:hint="default"/>
+        <w:sz w:val="20"/>
+      </w:rPr>
+    </w:lvl>
+    <w:lvl w:ilvl="5" w:tentative="1">
+      <w:start w:val="1"/>
+      <w:numFmt w:val="bullet"/>
+      <w:lvlText w:val=""/>
+      <w:lvlJc w:val="left"/>
+      <w:pPr>
+        <w:tabs>
+          <w:tab w:val="num" w:pos="4320"/>
+        </w:tabs>
+        <w:ind w:left="4320" w:hanging="360"/>
+      </w:pPr>
+      <w:rPr>
+        <w:rFonts w:ascii="Wingdings" w:hAnsi="Wingdings" w:hint="default"/>
+        <w:sz w:val="20"/>
+      </w:rPr>
+    </w:lvl>
+    <w:lvl w:ilvl="6" w:tentative="1">
+      <w:start w:val="1"/>
+      <w:numFmt w:val="bullet"/>
+      <w:lvlText w:val=""/>
+      <w:lvlJc w:val="left"/>
+      <w:pPr>
+        <w:tabs>
+          <w:tab w:val="num" w:pos="5040"/>
+        </w:tabs>
+        <w:ind w:left="5040" w:hanging="360"/>
+      </w:pPr>
+      <w:rPr>
+        <w:rFonts w:ascii="Wingdings" w:hAnsi="Wingdings" w:hint="default"/>
+        <w:sz w:val="20"/>
+      </w:rPr>
+    </w:lvl>
+    <w:lvl w:ilvl="7" w:tentative="1">
+      <w:start w:val="1"/>
+      <w:numFmt w:val="bullet"/>
+      <w:lvlText w:val=""/>
+      <w:lvlJc w:val="left"/>
+      <w:pPr>
+        <w:tabs>
+          <w:tab w:val="num" w:pos="5760"/>
+        </w:tabs>
+        <w:ind w:left="5760" w:hanging="360"/>
+      </w:pPr>
+      <w:rPr>
+        <w:rFonts w:ascii="Wingdings" w:hAnsi="Wingdings" w:hint="default"/>
+        <w:sz w:val="20"/>
+      </w:rPr>
+    </w:lvl>
+    <w:lvl w:ilvl="8" w:tentative="1">
+      <w:start w:val="1"/>
+      <w:numFmt w:val="bullet"/>
+      <w:lvlText w:val=""/>
+      <w:lvlJc w:val="left"/>
+      <w:pPr>
+        <w:tabs>
+          <w:tab w:val="num" w:pos="6480"/>
+        </w:tabs>
+        <w:ind w:left="6480" w:hanging="360"/>
+      </w:pPr>
+      <w:rPr>
+        <w:rFonts w:ascii="Wingdings" w:hAnsi="Wingdings" w:hint="default"/>
+        <w:sz w:val="20"/>
+      </w:rPr>
+    </w:lvl>
+  </w:abstractNum>
+  <w:abstractNum w:abstractNumId="16" w15:restartNumberingAfterBreak="0">
+    <w:nsid w:val="7E04366A"/>
+    <w:multiLevelType w:val="multilevel"/>
+    <w:tmpl w:val="73D65DFE"/>
+    <w:lvl w:ilvl="0">
+      <w:start w:val="1"/>
+      <w:numFmt w:val="bullet"/>
+      <w:lvlText w:val=""/>
+      <w:lvlJc w:val="left"/>
+      <w:pPr>
+        <w:tabs>
+          <w:tab w:val="num" w:pos="720"/>
+        </w:tabs>
+        <w:ind w:left="720" w:hanging="360"/>
+      </w:pPr>
+      <w:rPr>
+        <w:rFonts w:ascii="Symbol" w:hAnsi="Symbol" w:hint="default"/>
+        <w:sz w:val="20"/>
+      </w:rPr>
+    </w:lvl>
+    <w:lvl w:ilvl="1" w:tentative="1">
+      <w:start w:val="1"/>
+      <w:numFmt w:val="bullet"/>
+      <w:lvlText w:val="o"/>
+      <w:lvlJc w:val="left"/>
+      <w:pPr>
+        <w:tabs>
+          <w:tab w:val="num" w:pos="1440"/>
+        </w:tabs>
+        <w:ind w:left="1440" w:hanging="360"/>
+      </w:pPr>
+      <w:rPr>
+        <w:rFonts w:ascii="Courier New" w:hAnsi="Courier New" w:hint="default"/>
+        <w:sz w:val="20"/>
+      </w:rPr>
+    </w:lvl>
+    <w:lvl w:ilvl="2" w:tentative="1">
+      <w:start w:val="1"/>
+      <w:numFmt w:val="bullet"/>
+      <w:lvlText w:val=""/>
+      <w:lvlJc w:val="left"/>
+      <w:pPr>
+        <w:tabs>
+          <w:tab w:val="num" w:pos="2160"/>
+        </w:tabs>
+        <w:ind w:left="2160" w:hanging="360"/>
+      </w:pPr>
+      <w:rPr>
+        <w:rFonts w:ascii="Wingdings" w:hAnsi="Wingdings" w:hint="default"/>
+        <w:sz w:val="20"/>
+      </w:rPr>
+    </w:lvl>
+    <w:lvl w:ilvl="3" w:tentative="1">
+      <w:start w:val="1"/>
+      <w:numFmt w:val="bullet"/>
+      <w:lvlText w:val=""/>
+      <w:lvlJc w:val="left"/>
+      <w:pPr>
+        <w:tabs>
+          <w:tab w:val="num" w:pos="2880"/>
+        </w:tabs>
+        <w:ind w:left="2880" w:hanging="360"/>
+      </w:pPr>
+      <w:rPr>
+        <w:rFonts w:ascii="Wingdings" w:hAnsi="Wingdings" w:hint="default"/>
+        <w:sz w:val="20"/>
+      </w:rPr>
+    </w:lvl>
+    <w:lvl w:ilvl="4" w:tentative="1">
+      <w:start w:val="1"/>
+      <w:numFmt w:val="bullet"/>
+      <w:lvlText w:val=""/>
+      <w:lvlJc w:val="left"/>
+      <w:pPr>
+        <w:tabs>
+          <w:tab w:val="num" w:pos="3600"/>
+        </w:tabs>
+        <w:ind w:left="3600" w:hanging="360"/>
+      </w:pPr>
+      <w:rPr>
+        <w:rFonts w:ascii="Wingdings" w:hAnsi="Wingdings" w:hint="default"/>
+        <w:sz w:val="20"/>
+      </w:rPr>
+    </w:lvl>
+    <w:lvl w:ilvl="5" w:tentative="1">
+      <w:start w:val="1"/>
+      <w:numFmt w:val="bullet"/>
+      <w:lvlText w:val=""/>
+      <w:lvlJc w:val="left"/>
+      <w:pPr>
+        <w:tabs>
+          <w:tab w:val="num" w:pos="4320"/>
+        </w:tabs>
+        <w:ind w:left="4320" w:hanging="360"/>
+      </w:pPr>
+      <w:rPr>
+        <w:rFonts w:ascii="Wingdings" w:hAnsi="Wingdings" w:hint="default"/>
+        <w:sz w:val="20"/>
+      </w:rPr>
+    </w:lvl>
+    <w:lvl w:ilvl="6" w:tentative="1">
+      <w:start w:val="1"/>
+      <w:numFmt w:val="bullet"/>
+      <w:lvlText w:val=""/>
+      <w:lvlJc w:val="left"/>
+      <w:pPr>
+        <w:tabs>
+          <w:tab w:val="num" w:pos="5040"/>
+        </w:tabs>
+        <w:ind w:left="5040" w:hanging="360"/>
+      </w:pPr>
+      <w:rPr>
+        <w:rFonts w:ascii="Wingdings" w:hAnsi="Wingdings" w:hint="default"/>
+        <w:sz w:val="20"/>
+      </w:rPr>
+    </w:lvl>
+    <w:lvl w:ilvl="7" w:tentative="1">
+      <w:start w:val="1"/>
+      <w:numFmt w:val="bullet"/>
+      <w:lvlText w:val=""/>
+      <w:lvlJc w:val="left"/>
+      <w:pPr>
+        <w:tabs>
+          <w:tab w:val="num" w:pos="5760"/>
+        </w:tabs>
+        <w:ind w:left="5760" w:hanging="360"/>
+      </w:pPr>
+      <w:rPr>
+        <w:rFonts w:ascii="Wingdings" w:hAnsi="Wingdings" w:hint="default"/>
+        <w:sz w:val="20"/>
+      </w:rPr>
+    </w:lvl>
+    <w:lvl w:ilvl="8" w:tentative="1">
+      <w:start w:val="1"/>
+      <w:numFmt w:val="bullet"/>
+      <w:lvlText w:val=""/>
+      <w:lvlJc w:val="left"/>
+      <w:pPr>
+        <w:tabs>
+          <w:tab w:val="num" w:pos="6480"/>
+        </w:tabs>
+        <w:ind w:left="6480" w:hanging="360"/>
+      </w:pPr>
+      <w:rPr>
+        <w:rFonts w:ascii="Wingdings" w:hAnsi="Wingdings" w:hint="default"/>
+        <w:sz w:val="20"/>
+      </w:rPr>
+    </w:lvl>
+  </w:abstractNum>
   <w:num w:numId="1" w16cid:durableId="1377662107">
+    <w:abstractNumId w:val="12"/>
+  </w:num>
+  <w:num w:numId="2" w16cid:durableId="1599555541">
+    <w:abstractNumId w:val="7"/>
+  </w:num>
+  <w:num w:numId="3" w16cid:durableId="743184385">
+    <w:abstractNumId w:val="3"/>
+  </w:num>
+  <w:num w:numId="4" w16cid:durableId="1954245962">
+    <w:abstractNumId w:val="9"/>
+  </w:num>
+  <w:num w:numId="5" w16cid:durableId="779108062">
+    <w:abstractNumId w:val="14"/>
+  </w:num>
+  <w:num w:numId="6" w16cid:durableId="73673942">
     <w:abstractNumId w:val="10"/>
   </w:num>
-  <w:num w:numId="2" w16cid:durableId="1599555541">
+  <w:num w:numId="7" w16cid:durableId="1292323515">
     <w:abstractNumId w:val="5"/>
   </w:num>
-  <w:num w:numId="3" w16cid:durableId="743184385">
-    <w:abstractNumId w:val="2"/>
-  </w:num>
-  <w:num w:numId="4" w16cid:durableId="1954245962">
-    <w:abstractNumId w:val="7"/>
-  </w:num>
-  <w:num w:numId="5" w16cid:durableId="779108062">
-    <w:abstractNumId w:val="12"/>
-  </w:num>
-  <w:num w:numId="6" w16cid:durableId="73673942">
+  <w:num w:numId="8" w16cid:durableId="1530410256">
     <w:abstractNumId w:val="8"/>
   </w:num>
-  <w:num w:numId="7" w16cid:durableId="1292323515">
-    <w:abstractNumId w:val="4"/>
-  </w:num>
-  <w:num w:numId="8" w16cid:durableId="1530410256">
-    <w:abstractNumId w:val="6"/>
-  </w:num>
   <w:num w:numId="9" w16cid:durableId="1164473745">
-    <w:abstractNumId w:val="9"/>
+    <w:abstractNumId w:val="11"/>
   </w:num>
   <w:num w:numId="10" w16cid:durableId="1351639871">
     <w:abstractNumId w:val="0"/>
   </w:num>
   <w:num w:numId="11" w16cid:durableId="218320344">
+    <w:abstractNumId w:val="2"/>
+  </w:num>
+  <w:num w:numId="12" w16cid:durableId="910113819">
+    <w:abstractNumId w:val="4"/>
+  </w:num>
+  <w:num w:numId="13" w16cid:durableId="40791155">
+    <w:abstractNumId w:val="13"/>
+  </w:num>
+  <w:num w:numId="14" w16cid:durableId="899563127">
+    <w:abstractNumId w:val="15"/>
+  </w:num>
+  <w:num w:numId="15" w16cid:durableId="706031128">
+    <w:abstractNumId w:val="16"/>
+  </w:num>
+  <w:num w:numId="16" w16cid:durableId="1034307855">
     <w:abstractNumId w:val="1"/>
   </w:num>
-  <w:num w:numId="12" w16cid:durableId="910113819">
-    <w:abstractNumId w:val="3"/>
-  </w:num>
-  <w:num w:numId="13" w16cid:durableId="40791155">
-    <w:abstractNumId w:val="11"/>
-  </w:num>
-  <w:num w:numId="14" w16cid:durableId="899563127">
-    <w:abstractNumId w:val="13"/>
-  </w:num>
-  <w:num w:numId="15" w16cid:durableId="706031128">
-    <w:abstractNumId w:val="14"/>
+  <w:num w:numId="17" w16cid:durableId="1106656234">
+    <w:abstractNumId w:val="6"/>
   </w:num>
 </w:numbering>
 </file>

</xml_diff>